<commit_message>
Plan Section 13c-e readouts (R3 critic2, R4 ladder/p2p/retrain, R5 COD) + R2 ablation readout; todo Step C1-C5 done; draft v2 docx build
</commit_message>
<xml_diff>
--- a/paper/dd/manuscript.docx
+++ b/paper/dd/manuscript.docx
@@ -58,91 +58,97 @@
         <w:pStyle w:val="FirstParagraph"/>
       </w:pPr>
       <w:r>
-        <w:t xml:space="preserve">Contrastive models that embed powder X-ray diffraction (PXRD) patterns and crystal structures in a shared</w:t>
-      </w:r>
-      <w:r>
-        <w:t xml:space="preserve"> </w:t>
-      </w:r>
-      <w:r>
-        <w:t xml:space="preserve">space have been proposed for structure retrieval, but they are mostly tested on simulated queries and</w:t>
-      </w:r>
-      <w:r>
-        <w:t xml:space="preserve"> </w:t>
-      </w:r>
-      <w:r>
-        <w:t xml:space="preserve">against baselines that cannot absorb a peak shift. We test one such model, trained on 247,089 molecular</w:t>
-      </w:r>
-      <w:r>
-        <w:t xml:space="preserve"> </w:t>
-      </w:r>
-      <w:r>
-        <w:t xml:space="preserve">crystals from the Cambridge Structural Database (CSD), against classical profile matching on 188 measured</w:t>
-      </w:r>
-      <w:r>
-        <w:t xml:space="preserve"> </w:t>
-      </w:r>
-      <w:r>
-        <w:t xml:space="preserve">patterns of 123 organic compounds from the open opXRD database. The correct answers are fixed by CCDC</w:t>
-      </w:r>
-      <w:r>
-        <w:t xml:space="preserve"> </w:t>
-      </w:r>
-      <w:r>
-        <w:t xml:space="preserve">packing similarity, and every pattern is ranked against 309,080 simulated CSD entries. When the answer must</w:t>
-      </w:r>
-      <w:r>
-        <w:t xml:space="preserve"> </w:t>
-      </w:r>
-      <w:r>
-        <w:t xml:space="preserve">be an independent single-crystal determination, which is the realistic case, the classical scores reach a</w:t>
-      </w:r>
-      <w:r>
-        <w:t xml:space="preserve"> </w:t>
-      </w:r>
-      <w:r>
-        <w:t xml:space="preserve">compound-weighted top-1 of 0.30–0.50 (30 compounds) and the model 0.00; there, the scores that tolerate</w:t>
-      </w:r>
-      <w:r>
-        <w:t xml:space="preserve"> </w:t>
-      </w:r>
-      <w:r>
-        <w:t xml:space="preserve">peak shifts and strain beat fixed-grid Pearson correlation by 0.18–0.20. When the pattern’s own powder-study</w:t>
-      </w:r>
-      <w:r>
-        <w:t xml:space="preserve"> </w:t>
-      </w:r>
-      <w:r>
-        <w:t xml:space="preserve">entry also counts, the classical scores reach 0.71–0.87 and the model 0.02. The model is not blind: on</w:t>
-      </w:r>
-      <w:r>
-        <w:t xml:space="preserve"> </w:t>
-      </w:r>
-      <w:r>
-        <w:t xml:space="preserve">clean simulated patterns of the same targets its top-1 is 0.21 and its median rank 5, so it is the step</w:t>
-      </w:r>
-      <w:r>
-        <w:t xml:space="preserve"> </w:t>
-      </w:r>
-      <w:r>
-        <w:t xml:space="preserve">from simulated to measured patterns that defeats it. In 34 simulated degradation conditions, each of the</w:t>
-      </w:r>
-      <w:r>
-        <w:t xml:space="preserve"> </w:t>
-      </w:r>
-      <w:r>
-        <w:t xml:space="preserve">shift-tolerant classical scores beats it in at least 33. A hubness correction (CSLS) changes</w:t>
-      </w:r>
-      <w:r>
-        <w:t xml:space="preserve"> </w:t>
-      </w:r>
-      <w:r>
-        <w:t xml:space="preserve">compound-weighted top-1 by +0.01 to +0.04, which the data cannot distinguish from zero. We release the</w:t>
-      </w:r>
-      <w:r>
-        <w:t xml:space="preserve"> </w:t>
-      </w:r>
-      <w:r>
-        <w:t xml:space="preserve">benchmark as code and refcode lists.</w:t>
+        <w:t xml:space="preserve">Contrastive models embedding powder X-ray diffraction (PXRD) patterns and crystal structures in a shared</w:t>
+      </w:r>
+      <w:r>
+        <w:t xml:space="preserve"> </w:t>
+      </w:r>
+      <w:r>
+        <w:t xml:space="preserve">space have been proposed for structure retrieval, but are mostly tested on simulated queries against</w:t>
+      </w:r>
+      <w:r>
+        <w:t xml:space="preserve"> </w:t>
+      </w:r>
+      <w:r>
+        <w:t xml:space="preserve">baselines that cannot absorb a peak shift. We test one such model, trained on 247,089 molecular crystals</w:t>
+      </w:r>
+      <w:r>
+        <w:t xml:space="preserve"> </w:t>
+      </w:r>
+      <w:r>
+        <w:t xml:space="preserve">from the Cambridge Structural Database (CSD), against classical profile matching on 188 measured patterns of</w:t>
+      </w:r>
+      <w:r>
+        <w:t xml:space="preserve"> </w:t>
+      </w:r>
+      <w:r>
+        <w:t xml:space="preserve">123 organic compounds from the open opXRD database. Correct answers are fixed by packing similarity, and</w:t>
+      </w:r>
+      <w:r>
+        <w:t xml:space="preserve"> </w:t>
+      </w:r>
+      <w:r>
+        <w:t xml:space="preserve">every pattern is ranked against 309,080 simulated CSD entries. When the answer must be an independent</w:t>
+      </w:r>
+      <w:r>
+        <w:t xml:space="preserve"> </w:t>
+      </w:r>
+      <w:r>
+        <w:t xml:space="preserve">single-crystal determination, the realistic case, the classical scores reach a compound-weighted top-1 of</w:t>
+      </w:r>
+      <w:r>
+        <w:t xml:space="preserve"> </w:t>
+      </w:r>
+      <w:r>
+        <w:t xml:space="preserve">0.30–0.50 (30 compounds) and the model 0.00; a variable-cell re-rank (VC-GPWDF) reaches 0.50, not resolved</w:t>
+      </w:r>
+      <w:r>
+        <w:t xml:space="preserve"> </w:t>
+      </w:r>
+      <w:r>
+        <w:t xml:space="preserve">from the ln q scan it re-ranks (0.45). When the pattern’s own powder-study entry also counts, the classical</w:t>
+      </w:r>
+      <w:r>
+        <w:t xml:space="preserve"> </w:t>
+      </w:r>
+      <w:r>
+        <w:t xml:space="preserve">scores reach 0.71–0.87 and the model 0.02. Yet on clean simulated patterns of the same</w:t>
+      </w:r>
+      <w:r>
+        <w:t xml:space="preserve"> </w:t>
+      </w:r>
+      <w:r>
+        <w:t xml:space="preserve">targets its top-1 is 0.21 and its median rank 5. Retrained with the measurement effects we could simulate,</w:t>
+      </w:r>
+      <w:r>
+        <w:t xml:space="preserve"> </w:t>
+      </w:r>
+      <w:r>
+        <w:t xml:space="preserve">it handles them in simulation but stays at 0.02 on measured patterns, so the gap lies in effects we did not</w:t>
+      </w:r>
+      <w:r>
+        <w:t xml:space="preserve"> </w:t>
+      </w:r>
+      <w:r>
+        <w:t xml:space="preserve">model. In 34 simulated degradation conditions, each of the shift-tolerant classical scores beats it in at</w:t>
+      </w:r>
+      <w:r>
+        <w:t xml:space="preserve"> </w:t>
+      </w:r>
+      <w:r>
+        <w:t xml:space="preserve">least 32. A more realistic library, a hubness correction (CSLS, +0.01 to +0.04, indistinguishable from</w:t>
+      </w:r>
+      <w:r>
+        <w:t xml:space="preserve"> </w:t>
+      </w:r>
+      <w:r>
+        <w:t xml:space="preserve">zero) and an open replica on the Crystallography Open Database change none of this. We release the</w:t>
+      </w:r>
+      <w:r>
+        <w:t xml:space="preserve"> </w:t>
+      </w:r>
+      <w:r>
+        <w:t xml:space="preserve">benchmark as code, refcode lists and the open replica.</w:t>
       </w:r>
     </w:p>
     <w:bookmarkEnd w:id="9"/>
@@ -622,7 +628,7 @@
         <w:t xml:space="preserve"> </w:t>
       </w:r>
       <w:r>
-        <w:t xml:space="preserve">It does not, on either. We make four contributions.</w:t>
+        <w:t xml:space="preserve">It does not, on either. We make five contributions.</w:t>
       </w:r>
     </w:p>
     <w:p>
@@ -712,7 +718,13 @@
         <w:t xml:space="preserve"> </w:t>
       </w:r>
       <w:r>
-        <w:t xml:space="preserve">code and refcode lists, since CSD structures cannot be redistributed.</w:t>
+        <w:t xml:space="preserve">code and refcode lists, since CSD structures cannot be redistributed, and as an open replica built from</w:t>
+      </w:r>
+      <w:r>
+        <w:t xml:space="preserve"> </w:t>
+      </w:r>
+      <w:r>
+        <w:t xml:space="preserve">the Crystallography Open Database (Sections 2.6 and 4.7).</w:t>
       </w:r>
     </w:p>
     <w:p>
@@ -724,13 +736,7 @@
         </w:numPr>
       </w:pPr>
       <w:r>
-        <w:t xml:space="preserve">A diagnosis of the model’s failure: it retrieves simulated versions of the same targets but not the</w:t>
-      </w:r>
-      <w:r>
-        <w:t xml:space="preserve"> </w:t>
-      </w:r>
-      <w:r>
-        <w:t xml:space="preserve">measured patterns (Section 4.5).</w:t>
+        <w:t xml:space="preserve">A test of the published variable-cell method on the hard single-crystal case (Section 4.2).</w:t>
       </w:r>
     </w:p>
     <w:p>
@@ -742,7 +748,31 @@
         </w:numPr>
       </w:pPr>
       <w:r>
-        <w:t xml:space="preserve">A check of whether hubness, the tendency of a few library entries to be the nearest neighbour of many</w:t>
+        <w:t xml:space="preserve">A diagnosis of the model’s failure: it retrieves simulated versions of the same targets but not the</w:t>
+      </w:r>
+      <w:r>
+        <w:t xml:space="preserve"> </w:t>
+      </w:r>
+      <w:r>
+        <w:t xml:space="preserve">measured patterns, and neither the measurement effects we could simulate nor a retrain that includes</w:t>
+      </w:r>
+      <w:r>
+        <w:t xml:space="preserve"> </w:t>
+      </w:r>
+      <w:r>
+        <w:t xml:space="preserve">them closes that gap (Section 4.5).</w:t>
+      </w:r>
+    </w:p>
+    <w:p>
+      <w:pPr>
+        <w:pStyle w:val="Compact"/>
+        <w:numPr>
+          <w:ilvl w:val="0"/>
+          <w:numId w:val="1001"/>
+        </w:numPr>
+      </w:pPr>
+      <w:r>
+        <w:t xml:space="preserve">Checks of whether hubness, the tendency of a few library entries to be the nearest neighbour of many</w:t>
       </w:r>
       <w:r>
         <w:t xml:space="preserve"> </w:t>
@@ -760,11 +790,17 @@
         </w:r>
       </w:hyperlink>
       <w:r>
-        <w:t xml:space="preserve">, limits classical retrieval at this library size (Section 4.4).</w:t>
+        <w:t xml:space="preserve">, or the fidelity of the simulated library limits classical retrieval</w:t>
+      </w:r>
+      <w:r>
+        <w:t xml:space="preserve"> </w:t>
+      </w:r>
+      <w:r>
+        <w:t xml:space="preserve">(Sections 4.4 and 4.6).</w:t>
       </w:r>
     </w:p>
     <w:bookmarkEnd w:id="10"/>
-    <w:bookmarkStart w:id="19" w:name="benchmark"/>
+    <w:bookmarkStart w:id="20" w:name="benchmark"/>
     <w:p>
       <w:pPr>
         <w:pStyle w:val="Heading2"/>
@@ -1453,19 +1489,19 @@
         <w:t xml:space="preserve"> </w:t>
       </w:r>
       <w:r>
-        <w:t xml:space="preserve">Debye–Waller factors, texture, background or noise. For disordered entries whose CIF fails a strict parse,</w:t>
-      </w:r>
-      <w:r>
-        <w:t xml:space="preserve"> </w:t>
-      </w:r>
-      <w:r>
-        <w:t xml:space="preserve">coincident sites are merged by rescaling occupancies; the own entry of 28 patterns (9 compounds) is</w:t>
-      </w:r>
-      <w:r>
-        <w:t xml:space="preserve"> </w:t>
-      </w:r>
-      <w:r>
-        <w:t xml:space="preserve">disordered.</w:t>
+        <w:t xml:space="preserve">Debye–Waller factors, texture, background or noise; a library closer to the measurements is tested in</w:t>
+      </w:r>
+      <w:r>
+        <w:t xml:space="preserve"> </w:t>
+      </w:r>
+      <w:r>
+        <w:t xml:space="preserve">Sections 3.7 and 4.6. For disordered entries whose CIF fails a strict parse, coincident sites are merged by</w:t>
+      </w:r>
+      <w:r>
+        <w:t xml:space="preserve"> </w:t>
+      </w:r>
+      <w:r>
+        <w:t xml:space="preserve">rescaling occupancies; the own entry of 28 patterns (9 compounds) is disordered.</w:t>
       </w:r>
     </w:p>
     <w:bookmarkEnd w:id="17"/>
@@ -1557,8 +1593,195 @@
       </w:r>
     </w:p>
     <w:bookmarkEnd w:id="18"/>
+    <w:bookmarkStart w:id="19" w:name="an-open-replica"/>
+    <w:p>
+      <w:pPr>
+        <w:pStyle w:val="Heading3"/>
+      </w:pPr>
+      <w:r>
+        <w:t xml:space="preserve">2.6 An open replica</w:t>
+      </w:r>
+    </w:p>
+    <w:p>
+      <w:pPr>
+        <w:pStyle w:val="FirstParagraph"/>
+      </w:pPr>
+      <w:r>
+        <w:t xml:space="preserve">The CSD licence does not allow the library or the answer sets to be redistributed. So that the results can</w:t>
+      </w:r>
+      <w:r>
+        <w:t xml:space="preserve"> </w:t>
+      </w:r>
+      <w:r>
+        <w:t xml:space="preserve">be checked without a licence, we rebuilt the benchmark from the Crystallography Open Database (COD; CC0)</w:t>
+      </w:r>
+      <w:hyperlink w:anchor="ref-grazulis2009cod">
+        <w:r>
+          <w:rPr>
+            <w:rStyle w:val="Hyperlink"/>
+            <w:vertAlign w:val="superscript"/>
+          </w:rPr>
+          <w:t xml:space="preserve">32</w:t>
+        </w:r>
+      </w:hyperlink>
+      <w:r>
+        <w:rPr>
+          <w:vertAlign w:val="superscript"/>
+        </w:rPr>
+        <w:t xml:space="preserve">,</w:t>
+      </w:r>
+      <w:hyperlink w:anchor="ref-vaitkus2021cod">
+        <w:r>
+          <w:rPr>
+            <w:rStyle w:val="Hyperlink"/>
+            <w:vertAlign w:val="superscript"/>
+          </w:rPr>
+          <w:t xml:space="preserve">33</w:t>
+        </w:r>
+      </w:hyperlink>
+      <w:r>
+        <w:t xml:space="preserve">, the source of the opXRD patterns themselves. The queries are</w:t>
+      </w:r>
+      <w:r>
+        <w:t xml:space="preserve"> </w:t>
+      </w:r>
+      <w:r>
+        <w:t xml:space="preserve">unchanged. The library applies the corpus filter of Section 2.4 to the COD metadata (C-containing entries</w:t>
+      </w:r>
+      <w:r>
+        <w:t xml:space="preserve"> </w:t>
+      </w:r>
+      <w:r>
+        <w:t xml:space="preserve">with coordinates, no disorder flag, R ≤ 7.5 %, Z′ of 1–2, no element outside H, C, N, O, F, S, Cl, Br, I</w:t>
+      </w:r>
+      <w:r>
+        <w:t xml:space="preserve"> </w:t>
+      </w:r>
+      <w:r>
+        <w:t xml:space="preserve">and P), which keeps 108,716 entries, and adds 854 candidate entries of the queries (below) that the filter</w:t>
+      </w:r>
+      <w:r>
+        <w:t xml:space="preserve"> </w:t>
+      </w:r>
+      <w:r>
+        <w:t xml:space="preserve">removes. Of these 109,570 entries, 108,902 gave stick patterns, computed and rendered exactly as for the</w:t>
+      </w:r>
+      <w:r>
+        <w:t xml:space="preserve"> </w:t>
+      </w:r>
+      <w:r>
+        <w:t xml:space="preserve">CSD library.</w:t>
+      </w:r>
+    </w:p>
+    <w:p>
+      <w:pPr>
+        <w:pStyle w:val="BodyText"/>
+      </w:pPr>
+      <w:r>
+        <w:t xml:space="preserve">The answer sets follow Section 2.2 with two changes. First, the COD has no refcode families. Candidates</w:t>
+      </w:r>
+      <w:r>
+        <w:t xml:space="preserve"> </w:t>
+      </w:r>
+      <w:r>
+        <w:t xml:space="preserve">are COD entries with the same non-H element set whose primitive reduced cell lies within 5 % of the deposited</w:t>
+      </w:r>
+      <w:r>
+        <w:t xml:space="preserve"> </w:t>
+      </w:r>
+      <w:r>
+        <w:t xml:space="preserve">structure’s in each length and within 6 % in volume, a wider window than in the CSD search so that</w:t>
+      </w:r>
+      <w:r>
+        <w:t xml:space="preserve"> </w:t>
+      </w:r>
+      <w:r>
+        <w:t xml:space="preserve">temperature series are not lost. The two closest anchors are then compared with every other candidate, COD</w:t>
+      </w:r>
+      <w:r>
+        <w:t xml:space="preserve"> </w:t>
+      </w:r>
+      <w:r>
+        <w:t xml:space="preserve">entry against COD entry with the strict settings, to give the same-form set. Second, the COD candidates</w:t>
+      </w:r>
+      <w:r>
+        <w:t xml:space="preserve"> </w:t>
+      </w:r>
+      <w:r>
+        <w:t xml:space="preserve">include other compounds, which the CSD family search never returned. A candidate whose reduced non-H formula</w:t>
+      </w:r>
+      <w:r>
+        <w:t xml:space="preserve"> </w:t>
+      </w:r>
+      <w:r>
+        <w:t xml:space="preserve">differs from that of every same-form entry stays an ordinary library entry, and so counts as an error when it</w:t>
+      </w:r>
+      <w:r>
+        <w:t xml:space="preserve"> </w:t>
+      </w:r>
+      <w:r>
+        <w:t xml:space="preserve">ranks above the answer; setting the 2,670 such candidates aside, as the rule of Section 2.2 would, would</w:t>
+      </w:r>
+      <w:r>
+        <w:t xml:space="preserve"> </w:t>
+      </w:r>
+      <w:r>
+        <w:t xml:space="preserve">remove the hardest decoys and flatter every score. Same-formula candidates that cannot be compared (23) are</w:t>
+      </w:r>
+      <w:r>
+        <w:t xml:space="preserve"> </w:t>
+      </w:r>
+      <w:r>
+        <w:t xml:space="preserve">set aside as before. Powder or single-crystal is read from the COD method field, else from the powder tags of</w:t>
+      </w:r>
+      <w:r>
+        <w:t xml:space="preserve"> </w:t>
+      </w:r>
+      <w:r>
+        <w:t xml:space="preserve">the CIF. This rule was fixed before any replica result was computed.</w:t>
+      </w:r>
+    </w:p>
+    <w:p>
+      <w:pPr>
+        <w:pStyle w:val="BodyText"/>
+      </w:pPr>
+      <w:r>
+        <w:t xml:space="preserve">191 of the 196 patterns are identified in the COD: all 189 identified in the CSD and two more. Without the</w:t>
+      </w:r>
+      <w:r>
+        <w:t xml:space="preserve"> </w:t>
+      </w:r>
+      <w:r>
+        <w:t xml:space="preserve">pattern with a radian axis (Section 2.2), 190 patterns of 125 compounds are scored. 35 patterns of 9</w:t>
+      </w:r>
+      <w:r>
+        <w:t xml:space="preserve"> </w:t>
+      </w:r>
+      <w:r>
+        <w:t xml:space="preserve">compounds have a single-crystal same-form entry, against 59 patterns of 30 compounds in the CSD, so the</w:t>
+      </w:r>
+      <w:r>
+        <w:t xml:space="preserve"> </w:t>
+      </w:r>
+      <w:r>
+        <w:t xml:space="preserve">replica’s single-crystal set is small and its intervals are wide. Compounds are labelled as in the main</w:t>
+      </w:r>
+      <w:r>
+        <w:t xml:space="preserve"> </w:t>
+      </w:r>
+      <w:r>
+        <w:t xml:space="preserve">benchmark. The replica is scored with the scores of Section 3.2 and the model, without the corrections of</w:t>
+      </w:r>
+      <w:r>
+        <w:t xml:space="preserve"> </w:t>
+      </w:r>
+      <w:r>
+        <w:t xml:space="preserve">Sections 3.5 and 3.7.</w:t>
+      </w:r>
+    </w:p>
     <w:bookmarkEnd w:id="19"/>
-    <w:bookmarkStart w:id="26" w:name="methods"/>
+    <w:bookmarkEnd w:id="20"/>
+    <w:bookmarkStart w:id="29" w:name="methods"/>
     <w:p>
       <w:pPr>
         <w:pStyle w:val="Heading2"/>
@@ -1567,7 +1790,7 @@
         <w:t xml:space="preserve">3. Methods</w:t>
       </w:r>
     </w:p>
-    <w:bookmarkStart w:id="20" w:name="preprocessing"/>
+    <w:bookmarkStart w:id="21" w:name="preprocessing"/>
     <w:p>
       <w:pPr>
         <w:pStyle w:val="Heading3"/>
@@ -1622,8 +1845,8 @@
         <w:t xml:space="preserve">removed before scaling. Library patterns are scored as simulated.</w:t>
       </w:r>
     </w:p>
-    <w:bookmarkEnd w:id="20"/>
-    <w:bookmarkStart w:id="21" w:name="classical-scores"/>
+    <w:bookmarkEnd w:id="21"/>
+    <w:bookmarkStart w:id="22" w:name="classical-scores"/>
     <w:p>
       <w:pPr>
         <w:pStyle w:val="Heading3"/>
@@ -1808,31 +2031,49 @@
         <w:t xml:space="preserve"> </w:t>
       </w:r>
       <w:r>
-        <w:t xml:space="preserve">lattice strain is a translation. The score is a WCC with l = 0.01 in ln q, maximised over lags up to ±3 %</w:t>
-      </w:r>
-      <w:r>
-        <w:t xml:space="preserve"> </w:t>
-      </w:r>
-      <w:r>
-        <w:t xml:space="preserve">strain and over 16 zero offsets from −0.3° to +0.3° in 0.04° steps, applied before resampling. This</w:t>
-      </w:r>
-      <w:r>
-        <w:t xml:space="preserve"> </w:t>
-      </w:r>
-      <w:r>
-        <w:t xml:space="preserve">offset grid does not contain zero (the nearest offsets are ±0.02°), and the ln q axis is coarser than the</w:t>
-      </w:r>
-      <w:r>
-        <w:t xml:space="preserve"> </w:t>
-      </w:r>
-      <w:r>
-        <w:t xml:space="preserve">2θ grid at high angle. Both choices handicap the ln q score rather than favour it; they are the reason it</w:t>
-      </w:r>
-      <w:r>
-        <w:t xml:space="preserve"> </w:t>
-      </w:r>
-      <w:r>
-        <w:t xml:space="preserve">reaches only 0.88 on clean simulated queries (Section 4.1).</w:t>
+        <w:t xml:space="preserve">lattice strain is a translation; each ln q bin takes the mean of the pattern over its width, so peak areas</w:t>
+      </w:r>
+      <w:r>
+        <w:t xml:space="preserve"> </w:t>
+      </w:r>
+      <w:r>
+        <w:t xml:space="preserve">are kept where the bins are wider than the 2θ step. The score is a WCC with l = 0.01 in ln q, maximised over</w:t>
+      </w:r>
+      <w:r>
+        <w:t xml:space="preserve"> </w:t>
+      </w:r>
+      <w:r>
+        <w:t xml:space="preserve">lags up to ±3 % strain and over 17 zero offsets from −0.32° to +0.32° in 0.04° steps, applied before</w:t>
+      </w:r>
+      <w:r>
+        <w:t xml:space="preserve"> </w:t>
+      </w:r>
+      <w:r>
+        <w:t xml:space="preserve">resampling. A first version of this score sampled the ln q axis at points and used 16 offsets that skipped</w:t>
+      </w:r>
+      <w:r>
+        <w:t xml:space="preserve"> </w:t>
+      </w:r>
+      <w:r>
+        <w:t xml:space="preserve">zero (nearest ±0.02°), which cost it accuracy on clean simulated queries (within-family top-1 0.88 rather</w:t>
+      </w:r>
+      <w:r>
+        <w:t xml:space="preserve"> </w:t>
+      </w:r>
+      <w:r>
+        <w:t xml:space="preserve">than 1.00); we found both problems in an</w:t>
+      </w:r>
+      <w:r>
+        <w:t xml:space="preserve"> </w:t>
+      </w:r>
+      <w:r>
+        <w:t xml:space="preserve">internal review, corrected them, and report the first version in the ESI.† The offset grid is still 0.04°, so on simulated</w:t>
+      </w:r>
+      <w:r>
+        <w:t xml:space="preserve"> </w:t>
+      </w:r>
+      <w:r>
+        <w:t xml:space="preserve">queries the score depends on whether an applied offset falls on the grid (Section 4.1).</w:t>
       </w:r>
     </w:p>
     <w:p>
@@ -1867,11 +2108,17 @@
         <w:t xml:space="preserve"> </w:t>
       </w:r>
       <w:r>
-        <w:t xml:space="preserve">has not been validated against the reference code.</w:t>
-      </w:r>
-    </w:p>
-    <w:bookmarkEnd w:id="21"/>
-    <w:bookmarkStart w:id="22" w:name="exact-scores-on-a-gpu"/>
+        <w:t xml:space="preserve">has not been validated against the reference code; on the measured patterns we run the reference code</w:t>
+      </w:r>
+      <w:r>
+        <w:t xml:space="preserve"> </w:t>
+      </w:r>
+      <w:r>
+        <w:t xml:space="preserve">itself (Section 3.8).</w:t>
+      </w:r>
+    </w:p>
+    <w:bookmarkEnd w:id="22"/>
+    <w:bookmarkStart w:id="23" w:name="exact-scores-on-a-gpu"/>
     <w:p>
       <w:pPr>
         <w:pStyle w:val="Heading3"/>
@@ -1899,7 +2146,7 @@
             <w:rStyle w:val="Hyperlink"/>
             <w:vertAlign w:val="superscript"/>
           </w:rPr>
-          <w:t xml:space="preserve">32</w:t>
+          <w:t xml:space="preserve">34</w:t>
         </w:r>
       </w:hyperlink>
       <w:r>
@@ -1927,11 +2174,23 @@
         <w:t xml:space="preserve"> </w:t>
       </w:r>
       <w:r>
-        <w:t xml:space="preserve">scores agree with the CPU scores to 4 × 10⁻⁶ and reproduce the CPU ranks with no top-1 change (ESI†).</w:t>
-      </w:r>
-    </w:p>
-    <w:bookmarkEnd w:id="22"/>
-    <w:bookmarkStart w:id="23" w:name="learned-model"/>
+        <w:t xml:space="preserve">scores agree with the CPU scores to 4 × 10⁻⁶ and reproduce the CPU ranks with no top-1 change (ESI†). The</w:t>
+      </w:r>
+      <w:r>
+        <w:t xml:space="preserve"> </w:t>
+      </w:r>
+      <w:r>
+        <w:t xml:space="preserve">corrected ln q scan of Section 3.2 was rescored alone (405 s) and reproduces its CPU ranks with no top-1</w:t>
+      </w:r>
+      <w:r>
+        <w:t xml:space="preserve"> </w:t>
+      </w:r>
+      <w:r>
+        <w:t xml:space="preserve">change.</w:t>
+      </w:r>
+    </w:p>
+    <w:bookmarkEnd w:id="23"/>
+    <w:bookmarkStart w:id="24" w:name="learned-model"/>
     <w:p>
       <w:pPr>
         <w:pStyle w:val="Heading3"/>
@@ -1986,7 +2245,7 @@
             <w:rStyle w:val="Hyperlink"/>
             <w:vertAlign w:val="superscript"/>
           </w:rPr>
-          <w:t xml:space="preserve">33</w:t>
+          <w:t xml:space="preserve">35</w:t>
         </w:r>
       </w:hyperlink>
       <w:r>
@@ -2001,7 +2260,7 @@
             <w:rStyle w:val="Hyperlink"/>
             <w:vertAlign w:val="superscript"/>
           </w:rPr>
-          <w:t xml:space="preserve">34</w:t>
+          <w:t xml:space="preserve">36</w:t>
         </w:r>
       </w:hyperlink>
       <w:r>
@@ -2031,7 +2290,7 @@
             <w:rStyle w:val="Hyperlink"/>
             <w:vertAlign w:val="superscript"/>
           </w:rPr>
-          <w:t xml:space="preserve">35</w:t>
+          <w:t xml:space="preserve">37</w:t>
         </w:r>
       </w:hyperlink>
       <w:r>
@@ -2056,8 +2315,160 @@
         <w:t xml:space="preserve">100 or 1,000 entries with a classical score. Further details are in the ESI.†</w:t>
       </w:r>
     </w:p>
-    <w:bookmarkEnd w:id="23"/>
-    <w:bookmarkStart w:id="24" w:name="hubness-diagnosis-and-correction"/>
+    <w:p>
+      <w:pPr>
+        <w:pStyle w:val="BodyText"/>
+      </w:pPr>
+      <w:r>
+        <w:t xml:space="preserve">Three diagnostics probe the failure reported in Section 4.5. (i)</w:t>
+      </w:r>
+      <w:r>
+        <w:t xml:space="preserve"> </w:t>
+      </w:r>
+      <w:r>
+        <w:rPr>
+          <w:b/>
+          <w:bCs/>
+        </w:rPr>
+        <w:t xml:space="preserve">Effect ladder.</w:t>
+      </w:r>
+      <w:r>
+        <w:t xml:space="preserve"> </w:t>
+      </w:r>
+      <w:r>
+        <w:t xml:space="preserve">Each pattern’s own</w:t>
+      </w:r>
+      <w:r>
+        <w:t xml:space="preserve"> </w:t>
+      </w:r>
+      <w:r>
+        <w:t xml:space="preserve">library entry is rendered cleanly and then with one effect of the measurement at a time, each estimated from</w:t>
+      </w:r>
+      <w:r>
+        <w:t xml:space="preserve"> </w:t>
+      </w:r>
+      <w:r>
+        <w:t xml:space="preserve">the measured pattern: its 2θ coverage, its peak width, Kα2 (lab Cu patterns), its own background followed by</w:t>
+      </w:r>
+      <w:r>
+        <w:t xml:space="preserve"> </w:t>
+      </w:r>
+      <w:r>
+        <w:t xml:space="preserve">the background subtraction of Section 3.1, noise at its noise level, and the zero offset that best aligns it</w:t>
+      </w:r>
+      <w:r>
+        <w:t xml:space="preserve"> </w:t>
+      </w:r>
+      <w:r>
+        <w:t xml:space="preserve">with its entry; then with all six, and with all six plus an overall Debye–Waller factor (B = 4.45 Å², from</w:t>
+      </w:r>
+      <w:r>
+        <w:t xml:space="preserve"> </w:t>
+      </w:r>
+      <w:r>
+        <w:t xml:space="preserve">the library, Section 3.7), log-normal intensity jitter per reflection (σ = 0.3 or 0.5), or both (σ = 0.3).</w:t>
+      </w:r>
+      <w:r>
+        <w:t xml:space="preserve"> </w:t>
+      </w:r>
+      <w:r>
+        <w:t xml:space="preserve">Every variant is scored with the</w:t>
+      </w:r>
+      <w:r>
+        <w:t xml:space="preserve"> </w:t>
+      </w:r>
+      <w:r>
+        <w:t xml:space="preserve">answer sets of the measured pattern. Two of the effects use the own entry, so the ladder diagnoses the model</w:t>
+      </w:r>
+      <w:r>
+        <w:t xml:space="preserve"> </w:t>
+      </w:r>
+      <w:r>
+        <w:t xml:space="preserve">and is not a method. (ii)</w:t>
+      </w:r>
+      <w:r>
+        <w:t xml:space="preserve"> </w:t>
+      </w:r>
+      <w:r>
+        <w:rPr>
+          <w:b/>
+          <w:bCs/>
+        </w:rPr>
+        <w:t xml:space="preserve">Pattern to pattern.</w:t>
+      </w:r>
+      <w:r>
+        <w:t xml:space="preserve"> </w:t>
+      </w:r>
+      <w:r>
+        <w:t xml:space="preserve">The clean library patterns are passed through the model’s</w:t>
+      </w:r>
+      <w:r>
+        <w:t xml:space="preserve"> </w:t>
+      </w:r>
+      <w:r>
+        <w:t xml:space="preserve">pattern encoder, so measured patterns are matched against simulated patterns in the learned space without</w:t>
+      </w:r>
+      <w:r>
+        <w:t xml:space="preserve"> </w:t>
+      </w:r>
+      <w:r>
+        <w:t xml:space="preserve">the structure encoder. (iii)</w:t>
+      </w:r>
+      <w:r>
+        <w:t xml:space="preserve"> </w:t>
+      </w:r>
+      <w:r>
+        <w:rPr>
+          <w:b/>
+          <w:bCs/>
+        </w:rPr>
+        <w:t xml:space="preserve">Realism retrain.</w:t>
+      </w:r>
+      <w:r>
+        <w:t xml:space="preserve"> </w:t>
+      </w:r>
+      <w:r>
+        <w:t xml:space="preserve">The model was retrained once with the design and a</w:t>
+      </w:r>
+      <w:r>
+        <w:t xml:space="preserve"> </w:t>
+      </w:r>
+      <w:r>
+        <w:t xml:space="preserve">prediction fixed before training (repository commit 3b77818): the same split, architecture,</w:t>
+      </w:r>
+      <w:r>
+        <w:t xml:space="preserve"> </w:t>
+      </w:r>
+      <w:r>
+        <w:t xml:space="preserve">hyperparameters, epochs, hard-negative batches and checkpoint rule, with the training simulation extended by</w:t>
+      </w:r>
+      <w:r>
+        <w:t xml:space="preserve"> </w:t>
+      </w:r>
+      <w:r>
+        <w:t xml:space="preserve">a Kα2 copy (probability 0.6, I₂/I₁ = 0.5), an overall Debye–Waller factor with B drawn uniformly from 0–8 Å²,</w:t>
+      </w:r>
+      <w:r>
+        <w:t xml:space="preserve"> </w:t>
+      </w:r>
+      <w:r>
+        <w:t xml:space="preserve">log-normal intensity jitter per reflection with σ drawn uniformly from 0–0.5, a cut of the 2θ range (probability 0.25;</w:t>
+      </w:r>
+      <w:r>
+        <w:t xml:space="preserve"> </w:t>
+      </w:r>
+      <w:r>
+        <w:t xml:space="preserve">start 5–12°, end 30–50°), and the background subtraction applied to the measured patterns. The retrained</w:t>
+      </w:r>
+      <w:r>
+        <w:t xml:space="preserve"> </w:t>
+      </w:r>
+      <w:r>
+        <w:t xml:space="preserve">model is scored like the original, including the ladder.</w:t>
+      </w:r>
+    </w:p>
+    <w:bookmarkEnd w:id="24"/>
+    <w:bookmarkStart w:id="25" w:name="hubness-diagnosis-and-correction"/>
     <w:p>
       <w:pPr>
         <w:pStyle w:val="Heading3"/>
@@ -2157,7 +2568,7 @@
             <w:rStyle w:val="Hyperlink"/>
             <w:vertAlign w:val="superscript"/>
           </w:rPr>
-          <w:t xml:space="preserve">36</w:t>
+          <w:t xml:space="preserve">38</w:t>
         </w:r>
       </w:hyperlink>
       <w:r>
@@ -2190,7 +2601,7 @@
             <w:rStyle w:val="Hyperlink"/>
             <w:vertAlign w:val="superscript"/>
           </w:rPr>
-          <w:t xml:space="preserve">37</w:t>
+          <w:t xml:space="preserve">39</w:t>
         </w:r>
       </w:hyperlink>
       <w:r>
@@ -2200,8 +2611,8 @@
         <w:t xml:space="preserve">(ESI†); none was selected after seeing the results.</w:t>
       </w:r>
     </w:p>
-    <w:bookmarkEnd w:id="24"/>
-    <w:bookmarkStart w:id="25" w:name="simulated-sweep"/>
+    <w:bookmarkEnd w:id="25"/>
+    <w:bookmarkStart w:id="26" w:name="simulated-sweep"/>
     <w:p>
       <w:pPr>
         <w:pStyle w:val="Heading3"/>
@@ -2283,7 +2694,7 @@
             <w:rStyle w:val="Hyperlink"/>
             <w:vertAlign w:val="superscript"/>
           </w:rPr>
-          <w:t xml:space="preserve">38</w:t>
+          <w:t xml:space="preserve">40</w:t>
         </w:r>
       </w:hyperlink>
       <w:r>
@@ -2299,12 +2710,225 @@
         <w:t xml:space="preserve"> </w:t>
       </w:r>
       <w:r>
-        <w:t xml:space="preserve">conditions (a zero offset of 0° is the clean condition).</w:t>
-      </w:r>
-    </w:p>
-    <w:bookmarkEnd w:id="25"/>
+        <w:t xml:space="preserve">conditions (a zero offset of 0° is the clean condition). Each condition’s random draws are seeded from a</w:t>
+      </w:r>
+      <w:r>
+        <w:t xml:space="preserve"> </w:t>
+      </w:r>
+      <w:r>
+        <w:t xml:space="preserve">checksum of its name, so the sweep can be regenerated exactly. (A first run seeded them from Python’s salted</w:t>
+      </w:r>
+      <w:r>
+        <w:t xml:space="preserve"> </w:t>
+      </w:r>
+      <w:r>
+        <w:t xml:space="preserve">string hash, which cannot be regenerated; every sweep number here is from the rerun.)</w:t>
+      </w:r>
+    </w:p>
     <w:bookmarkEnd w:id="26"/>
-    <w:bookmarkStart w:id="44" w:name="results"/>
+    <w:bookmarkStart w:id="27" w:name="a-library-closer-to-the-measurements"/>
+    <w:p>
+      <w:pPr>
+        <w:pStyle w:val="Heading3"/>
+      </w:pPr>
+      <w:r>
+        <w:t xml:space="preserve">3.7 A library closer to the measurements</w:t>
+      </w:r>
+    </w:p>
+    <w:p>
+      <w:pPr>
+        <w:pStyle w:val="FirstParagraph"/>
+      </w:pPr>
+      <w:r>
+        <w:t xml:space="preserve">The library of Section 2.4 leaves out several features of the measured patterns. As a robustness check, all</w:t>
+      </w:r>
+      <w:r>
+        <w:t xml:space="preserve"> </w:t>
+      </w:r>
+      <w:r>
+        <w:t xml:space="preserve">classical scores were recomputed with one package of changes, fixed before scoring (repository commit</w:t>
+      </w:r>
+      <w:r>
+        <w:t xml:space="preserve"> </w:t>
+      </w:r>
+      <w:r>
+        <w:t xml:space="preserve">4d4dae3). (a) An overall Debye–Waller factor on the library intensities, I exp(−2Bs²) with s = sin θ/λ and</w:t>
+      </w:r>
+      <w:r>
+        <w:t xml:space="preserve"> </w:t>
+      </w:r>
+      <w:r>
+        <w:t xml:space="preserve">B = 4.45 Å², which is 8π² times the median mean non-H U_eq of 5,000 random library entries measured at</w:t>
+      </w:r>
+      <w:r>
+        <w:t xml:space="preserve"> </w:t>
+      </w:r>
+      <w:r>
+        <w:t xml:space="preserve">283–303 K. (b) For the 68 patterns not measured with Cu Kα, the Lorentz–polarisation factor converted from</w:t>
+      </w:r>
+      <w:r>
+        <w:t xml:space="preserve"> </w:t>
+      </w:r>
+      <w:r>
+        <w:t xml:space="preserve">the measurement to Cu Kα1, with polarisation (1 + cos² 2θ)/2 for laboratory tubes and none for synchrotrons</w:t>
+      </w:r>
+      <w:r>
+        <w:t xml:space="preserve"> </w:t>
+      </w:r>
+      <w:r>
+        <w:t xml:space="preserve">(an assumption). (c) For the 125 laboratory-tube patterns, Kα2 as a nuisance: the score is the higher of</w:t>
+      </w:r>
+      <w:r>
+        <w:t xml:space="preserve"> </w:t>
+      </w:r>
+      <w:r>
+        <w:t xml:space="preserve">those against a Kα1 library and a Kα1 + Kα2 library (I₂/I₁ = 0.5), because opXRD does not record whether</w:t>
+      </w:r>
+      <w:r>
+        <w:t xml:space="preserve"> </w:t>
+      </w:r>
+      <w:r>
+        <w:t xml:space="preserve">the beam was monochromated. (d) For the 46 patterns that do not cover 5–50°, comparison over the measured</w:t>
+      </w:r>
+      <w:r>
+        <w:t xml:space="preserve"> </w:t>
+      </w:r>
+      <w:r>
+        <w:t xml:space="preserve">range only (reference norms over the query’s coverage, not shifted with the zero scan). Each change was also</w:t>
+      </w:r>
+      <w:r>
+        <w:t xml:space="preserve"> </w:t>
+      </w:r>
+      <w:r>
+        <w:t xml:space="preserve">removed on its own to give one-off ablations. None of the four was selected after seeing results.</w:t>
+      </w:r>
+    </w:p>
+    <w:bookmarkEnd w:id="27"/>
+    <w:bookmarkStart w:id="28" w:name="variable-cell-re-rank"/>
+    <w:p>
+      <w:pPr>
+        <w:pStyle w:val="Heading3"/>
+      </w:pPr>
+      <w:r>
+        <w:t xml:space="preserve">3.8 Variable-cell re-rank</w:t>
+      </w:r>
+    </w:p>
+    <w:p>
+      <w:pPr>
+        <w:pStyle w:val="FirstParagraph"/>
+      </w:pPr>
+      <w:r>
+        <w:t xml:space="preserve">Single-crystal references fail mainly when their cell differs from the measured one (Section 4.2), which</w:t>
+      </w:r>
+      <w:r>
+        <w:t xml:space="preserve"> </w:t>
+      </w:r>
+      <w:r>
+        <w:t xml:space="preserve">variable-cell comparison is designed to absorb. We re-ranked shortlists with VC-GPWDF</w:t>
+      </w:r>
+      <w:hyperlink w:anchor="ref-oterodelaroza2024vcgpwdf">
+        <w:r>
+          <w:rPr>
+            <w:rStyle w:val="Hyperlink"/>
+            <w:vertAlign w:val="superscript"/>
+          </w:rPr>
+          <w:t xml:space="preserve">22</w:t>
+        </w:r>
+      </w:hyperlink>
+      <w:r>
+        <w:t xml:space="preserve"> </w:t>
+      </w:r>
+      <w:r>
+        <w:t xml:space="preserve">as implemented in critic2 1.4</w:t>
+      </w:r>
+      <w:hyperlink w:anchor="ref-oterodelaroza2014critic2">
+        <w:r>
+          <w:rPr>
+            <w:rStyle w:val="Hyperlink"/>
+            <w:vertAlign w:val="superscript"/>
+          </w:rPr>
+          <w:t xml:space="preserve">41</w:t>
+        </w:r>
+      </w:hyperlink>
+      <w:r>
+        <w:t xml:space="preserve">, which compares a</w:t>
+      </w:r>
+      <w:r>
+        <w:t xml:space="preserve"> </w:t>
+      </w:r>
+      <w:r>
+        <w:t xml:space="preserve">candidate structure with a measured pattern while varying the candidate’s cell (±10 % in lengths and ±5° in</w:t>
+      </w:r>
+      <w:r>
+        <w:t xml:space="preserve"> </w:t>
+      </w:r>
+      <w:r>
+        <w:t xml:space="preserve">angles in its quick mode). We ran the published pipeline: background fit with 20 knots, peak fit with the</w:t>
+      </w:r>
+      <w:r>
+        <w:t xml:space="preserve"> </w:t>
+      </w:r>
+      <w:r>
+        <w:t xml:space="preserve">default settings, and the global quick comparison with α = 1 as in the paper (the code’s default is 0.5) and</w:t>
+      </w:r>
+      <w:r>
+        <w:t xml:space="preserve"> </w:t>
+      </w:r>
+      <w:r>
+        <w:t xml:space="preserve">the measurement wavelength; it applies no zero-offset correction. One step was added: each pattern was cut</w:t>
+      </w:r>
+      <w:r>
+        <w:t xml:space="preserve"> </w:t>
+      </w:r>
+      <w:r>
+        <w:t xml:space="preserve">to the d-spacing window that the other scores see (Cu Kα1 2θ of 5–50°). The shortlist of each single-crystal</w:t>
+      </w:r>
+      <w:r>
+        <w:t xml:space="preserve"> </w:t>
+      </w:r>
+      <w:r>
+        <w:t xml:space="preserve">pattern is the 50 best entries of ln q, with set-aside entries excluded; a pattern whose answer is not in</w:t>
+      </w:r>
+      <w:r>
+        <w:t xml:space="preserve"> </w:t>
+      </w:r>
+      <w:r>
+        <w:t xml:space="preserve">its shortlist counts as a miss, and a comparison that fails or runs past a 4-hour limit counts as maximally</w:t>
+      </w:r>
+      <w:r>
+        <w:t xml:space="preserve"> </w:t>
+      </w:r>
+      <w:r>
+        <w:t xml:space="preserve">dissimilar. We had planned a shortlist of 100, but the shortlist holds the answer for the same 36 of the 59</w:t>
+      </w:r>
+      <w:r>
+        <w:t xml:space="preserve"> </w:t>
+      </w:r>
+      <w:r>
+        <w:t xml:space="preserve">patterns at 50 as at 100, so the further entries could only have added competitors; the shorter list is, if</w:t>
+      </w:r>
+      <w:r>
+        <w:t xml:space="preserve"> </w:t>
+      </w:r>
+      <w:r>
+        <w:t xml:space="preserve">anything, favourable to the re-rank. A comparison took a median of 2.2 CPU-minutes and up to 3.0 CPU-hours</w:t>
+      </w:r>
+      <w:r>
+        <w:t xml:space="preserve"> </w:t>
+      </w:r>
+      <w:r>
+        <w:t xml:space="preserve">for the largest cells; one of the 2,950 comparisons reached the limit, in a shortlist that does not hold the</w:t>
+      </w:r>
+      <w:r>
+        <w:t xml:space="preserve"> </w:t>
+      </w:r>
+      <w:r>
+        <w:t xml:space="preserve">answer, so it changes no result.</w:t>
+      </w:r>
+    </w:p>
+    <w:bookmarkEnd w:id="28"/>
+    <w:bookmarkEnd w:id="29"/>
+    <w:bookmarkStart w:id="52" w:name="results"/>
     <w:p>
       <w:pPr>
         <w:pStyle w:val="Heading2"/>
@@ -2313,7 +2937,7 @@
         <w:t xml:space="preserve">4. Results</w:t>
       </w:r>
     </w:p>
-    <w:bookmarkStart w:id="30" w:name="X12dfde5b49dde2a1566b90dde48c2d05f642d47"/>
+    <w:bookmarkStart w:id="33" w:name="X12dfde5b49dde2a1566b90dde48c2d05f642d47"/>
     <w:p>
       <w:pPr>
         <w:pStyle w:val="Heading3"/>
@@ -2327,7 +2951,7 @@
         <w:pStyle w:val="FirstParagraph"/>
       </w:pPr>
       <w:r>
-        <w:t xml:space="preserve">Across the 34 conditions the model scores 0.47–0.56 within-family top-1 and the best classical score</w:t>
+        <w:t xml:space="preserve">Across the 34 conditions the model scores 0.47–0.57 within-family top-1 and the best classical score</w:t>
       </w:r>
       <w:r>
         <w:t xml:space="preserve"> </w:t>
@@ -2345,7 +2969,7 @@
         <w:t xml:space="preserve"> </w:t>
       </w:r>
       <w:r>
-        <w:t xml:space="preserve">ln q scan beat the model with non-overlapping CIs in all 34 conditions, and Pearson + zero scan in 33.</w:t>
+        <w:t xml:space="preserve">ln q scan beat the model with non-overlapping CIs in all 34 conditions, and Pearson + zero scan in 32.</w:t>
       </w:r>
     </w:p>
     <w:p>
@@ -2371,25 +2995,31 @@
         <w:t xml:space="preserve"> </w:t>
       </w:r>
       <w:r>
-        <w:t xml:space="preserve">0.05° and 0.15° are offsets that fall between grid points. The ln q scan holds 0.86 at 1.2 % isotropic</w:t>
-      </w:r>
-      <w:r>
-        <w:t xml:space="preserve"> </w:t>
-      </w:r>
-      <w:r>
-        <w:t xml:space="preserve">strain. The model’s curves are flat, but they are flat at about 0.55; its clean within-family top-1 is 0.56.</w:t>
-      </w:r>
-      <w:r>
-        <w:t xml:space="preserve"> </w:t>
-      </w:r>
-      <w:r>
-        <w:t xml:space="preserve">The smallest gap, −0.12, comes from large anisotropic thermal strain combined with a degraded profile. Even</w:t>
-      </w:r>
-      <w:r>
-        <w:t xml:space="preserve"> </w:t>
-      </w:r>
-      <w:r>
-        <w:t xml:space="preserve">there, WCC (l = 1°) leads, 0.64 against 0.52.</w:t>
+        <w:t xml:space="preserve">0.05° and 0.15° are offsets that fall between grid points. The ln q scan, whose offsets are 0.04° apart,</w:t>
+      </w:r>
+      <w:r>
+        <w:t xml:space="preserve"> </w:t>
+      </w:r>
+      <w:r>
+        <w:t xml:space="preserve">also dips at 0.1° and 0.3° (0.88 at both). It holds 0.89 at 1.2 % isotropic strain. The model’s curves are</w:t>
+      </w:r>
+      <w:r>
+        <w:t xml:space="preserve"> </w:t>
+      </w:r>
+      <w:r>
+        <w:t xml:space="preserve">flat, but they are flat at about 0.55; its clean within-family top-1 is 0.56. The smallest gap, −0.12, comes</w:t>
+      </w:r>
+      <w:r>
+        <w:t xml:space="preserve"> </w:t>
+      </w:r>
+      <w:r>
+        <w:t xml:space="preserve">from large anisotropic thermal strain combined with a degraded profile. Even there, WCC (l = 0.5°) leads,</w:t>
+      </w:r>
+      <w:r>
+        <w:t xml:space="preserve"> </w:t>
+      </w:r>
+      <w:r>
+        <w:t xml:space="preserve">0.64 against 0.52, with WCC (l = 1°) and the ln q scan within 0.01 of it.</w:t>
       </w:r>
     </w:p>
     <w:p>
@@ -2401,18 +3031,18 @@
           <wp:inline>
             <wp:extent cx="5334000" cy="2857668"/>
             <wp:effectExtent b="0" l="0" r="0" t="0"/>
-            <wp:docPr descr="" title="" id="28" name="Picture"/>
+            <wp:docPr descr="" title="" id="31" name="Picture"/>
             <a:graphic>
               <a:graphicData uri="http://schemas.openxmlformats.org/drawingml/2006/picture">
                 <pic:pic>
                   <pic:nvPicPr>
-                    <pic:cNvPr descr="figs/fig2_simulated_sweep.png" id="29" name="Picture"/>
+                    <pic:cNvPr descr="figs/fig2_simulated_sweep.png" id="32" name="Picture"/>
                     <pic:cNvPicPr>
                       <a:picLocks noChangeArrowheads="1" noChangeAspect="1"/>
                     </pic:cNvPicPr>
                   </pic:nvPicPr>
                   <pic:blipFill>
-                    <a:blip r:embed="rId27"/>
+                    <a:blip r:embed="rId30"/>
                     <a:stretch>
                       <a:fillRect/>
                     </a:stretch>
@@ -2478,23 +3108,23 @@
         <w:t xml:space="preserve"> </w:t>
       </w:r>
       <w:r>
-        <w:t xml:space="preserve">here (cosine + zero scan on the measured patterns). The dips of the zero-scan scores at 0.05° and 0.15° in</w:t>
-      </w:r>
-      <w:r>
-        <w:t xml:space="preserve"> </w:t>
-      </w:r>
-      <w:r>
-        <w:t xml:space="preserve">(a) are offsets that fall between grid points; the ln q score stays below 1.00 because its offset grid</w:t>
-      </w:r>
-      <w:r>
-        <w:t xml:space="preserve"> </w:t>
-      </w:r>
-      <w:r>
-        <w:t xml:space="preserve">skips zero (Section 3.2).</w:t>
-      </w:r>
-    </w:p>
-    <w:bookmarkEnd w:id="30"/>
-    <w:bookmarkStart w:id="31" w:name="Xe27908ce711f1b7b4301467a877ce520b07468c"/>
+        <w:t xml:space="preserve">here (cosine + zero scan on the measured patterns). In (a), the zero-scan scores dip at offsets that fall</w:t>
+      </w:r>
+      <w:r>
+        <w:t xml:space="preserve"> </w:t>
+      </w:r>
+      <w:r>
+        <w:t xml:space="preserve">between the points of their 0.02° offset grid (0.05° and 0.15°), and the ln q score at offsets off its</w:t>
+      </w:r>
+      <w:r>
+        <w:t xml:space="preserve"> </w:t>
+      </w:r>
+      <w:r>
+        <w:t xml:space="preserve">0.04° grid (0.05°, 0.1°, 0.15° and 0.3°).</w:t>
+      </w:r>
+    </w:p>
+    <w:bookmarkEnd w:id="33"/>
+    <w:bookmarkStart w:id="34" w:name="Xe27908ce711f1b7b4301467a877ce520b07468c"/>
     <w:p>
       <w:pPr>
         <w:pStyle w:val="Heading3"/>
@@ -2528,19 +3158,25 @@
         <w:pStyle w:val="BodyText"/>
       </w:pPr>
       <w:r>
-        <w:t xml:space="preserve">Here shift and strain tolerance pays. Paired over compounds, the ln q scan beats fixed-grid Pearson by 0.18</w:t>
-      </w:r>
-      <w:r>
-        <w:t xml:space="preserve"> </w:t>
-      </w:r>
-      <w:r>
-        <w:t xml:space="preserve">[0.02, 0.35] and WCC (l = 1°) by 0.20 [0.03, 0.36]; cosine + zero scan (+0.10 [−0.05, 0.24]) and WCC</w:t>
-      </w:r>
-      <w:r>
-        <w:t xml:space="preserve"> </w:t>
-      </w:r>
-      <w:r>
-        <w:t xml:space="preserve">(l = 2°, +0.16 [−0.03, 0.35]) are not resolved. The ln q scan has the best median rank, 6.</w:t>
+        <w:t xml:space="preserve">Strain tolerance helps here, although the intervals are wide. Paired over compounds, WCC (l = 1°) beats</w:t>
+      </w:r>
+      <w:r>
+        <w:t xml:space="preserve"> </w:t>
+      </w:r>
+      <w:r>
+        <w:t xml:space="preserve">fixed-grid Pearson by 0.20 [0.03, 0.36]; the ln q scan (+0.15 [0.00, 0.31]), cosine + zero scan</w:t>
+      </w:r>
+      <w:r>
+        <w:t xml:space="preserve"> </w:t>
+      </w:r>
+      <w:r>
+        <w:t xml:space="preserve">(+0.10 [−0.05, 0.24]) and WCC (l = 2°, +0.16 [−0.03, 0.35]) are not resolved. The ln q scan has the best</w:t>
+      </w:r>
+      <w:r>
+        <w:t xml:space="preserve"> </w:t>
+      </w:r>
+      <w:r>
+        <w:t xml:space="preserve">median rank, 7.</w:t>
       </w:r>
     </w:p>
     <w:p>
@@ -2554,7 +3190,7 @@
         <w:t xml:space="preserve"> </w:t>
       </w:r>
       <w:r>
-        <w:t xml:space="preserve">has every cell length within 1 % of the powder-study entry’s, the ln q scan ranks it first for 0.71 of</w:t>
+        <w:t xml:space="preserve">has every cell length within 1 % of the powder-study entry’s, the ln q scan ranks it first for 0.68 of</w:t>
       </w:r>
       <w:r>
         <w:t xml:space="preserve"> </w:t>
@@ -2580,7 +3216,7 @@
             <w:rStyle w:val="Hyperlink"/>
             <w:vertAlign w:val="superscript"/>
           </w:rPr>
-          <w:t xml:space="preserve">38</w:t>
+          <w:t xml:space="preserve">40</w:t>
         </w:r>
       </w:hyperlink>
       <w:r>
@@ -2608,7 +3244,85 @@
         <w:t xml:space="preserve"> </w:t>
       </w:r>
       <w:r>
-        <w:t xml:space="preserve">cell differences, which none of the scores tested here absorbs.</w:t>
+        <w:t xml:space="preserve">cell differences, which variable-cell comparison is designed to absorb.</w:t>
+      </w:r>
+    </w:p>
+    <w:p>
+      <w:pPr>
+        <w:pStyle w:val="BodyText"/>
+      </w:pPr>
+      <w:r>
+        <w:rPr>
+          <w:b/>
+          <w:bCs/>
+        </w:rPr>
+        <w:t xml:space="preserve">Variable-cell re-rank.</w:t>
+      </w:r>
+      <w:r>
+        <w:t xml:space="preserve"> </w:t>
+      </w:r>
+      <w:r>
+        <w:t xml:space="preserve">Re-ranking the ln q top 50 with VC-GPWDF (Section 3.8) gives a compound-weighted</w:t>
+      </w:r>
+      <w:r>
+        <w:t xml:space="preserve"> </w:t>
+      </w:r>
+      <w:r>
+        <w:t xml:space="preserve">top-1 of 0.50 [0.32, 0.67], against 0.45 [0.28, 0.63] for the ln q scan on the same patterns; the paired</w:t>
+      </w:r>
+      <w:r>
+        <w:t xml:space="preserve"> </w:t>
+      </w:r>
+      <w:r>
+        <w:t xml:space="preserve">difference, +0.05 [−0.11, 0.20], does not resolve them, and at top-10 the re-rank is no better (0.59</w:t>
+      </w:r>
+      <w:r>
+        <w:t xml:space="preserve"> </w:t>
+      </w:r>
+      <w:r>
+        <w:t xml:space="preserve">against 0.61). Per pattern, the re-rank ranks the answer first for 26 of the 59 patterns and the ln q scan</w:t>
+      </w:r>
+      <w:r>
+        <w:t xml:space="preserve"> </w:t>
+      </w:r>
+      <w:r>
+        <w:t xml:space="preserve">for 25. Of the 36 patterns whose shortlist holds the answer, the re-rank moves it to first place for 4 (from</w:t>
+      </w:r>
+      <w:r>
+        <w:t xml:space="preserve"> </w:t>
+      </w:r>
+      <w:r>
+        <w:t xml:space="preserve">ln q ranks 2, 3, 7 and 9) and moves ln q’s correct first choice down for 3 (to ranks 2, 22 and 50, the last</w:t>
+      </w:r>
+      <w:r>
+        <w:t xml:space="preserve"> </w:t>
+      </w:r>
+      <w:r>
+        <w:t xml:space="preserve">of its shortlist). Where the cells differ by more than 1 %, it ranks the answer first for 4 of the 25</w:t>
+      </w:r>
+      <w:r>
+        <w:t xml:space="preserve"> </w:t>
+      </w:r>
+      <w:r>
+        <w:t xml:space="preserve">patterns, against 2 for the ln q scan; where they agree, for 22 of 34, against 23. Variable-cell comparison</w:t>
+      </w:r>
+      <w:r>
+        <w:t xml:space="preserve"> </w:t>
+      </w:r>
+      <w:r>
+        <w:t xml:space="preserve">recovers a few of the mismatched cells, but most single-crystal failures remain: for 23 of the 59 patterns</w:t>
+      </w:r>
+      <w:r>
+        <w:t xml:space="preserve"> </w:t>
+      </w:r>
+      <w:r>
+        <w:t xml:space="preserve">the answer is not among the 50 entries re-ranked, and 21 of the 25 patterns with mismatched cells still</w:t>
+      </w:r>
+      <w:r>
+        <w:t xml:space="preserve"> </w:t>
+      </w:r>
+      <w:r>
+        <w:t xml:space="preserve">fail.</w:t>
       </w:r>
     </w:p>
     <w:p>
@@ -2639,6 +3353,18 @@
       </w:r>
       <w:r>
         <w:t xml:space="preserve">compound-bootstrap CIs for top-1; per-pattern top-1; median rank of the first correct entry over patterns.</w:t>
+      </w:r>
+      <w:r>
+        <w:t xml:space="preserve"> </w:t>
+      </w:r>
+      <w:r>
+        <w:t xml:space="preserve">The variable-cell re-rank exists for the single-crystal set only; a pattern whose answer is not in its</w:t>
+      </w:r>
+      <w:r>
+        <w:t xml:space="preserve"> </w:t>
+      </w:r>
+      <w:r>
+        <w:t xml:space="preserve">shortlist counts as a miss, and its median rank falls inside the shortlist.</w:t>
       </w:r>
     </w:p>
     <w:tbl>
@@ -2759,18 +3485,18 @@
               <w:pStyle w:val="Compact"/>
             </w:pPr>
             <w:r>
-              <w:t xml:space="preserve">ln q lag + zero scan</w:t>
-            </w:r>
-          </w:p>
-        </w:tc>
-        <w:tc>
-          <w:tcPr/>
-          <w:p>
-            <w:pPr>
-              <w:pStyle w:val="Compact"/>
-            </w:pPr>
-            <w:r>
-              <w:t xml:space="preserve">0.49 [0.31, 0.67]</w:t>
+              <w:t xml:space="preserve">VC-GPWDF re-rank of the ln q top 50</w:t>
+            </w:r>
+          </w:p>
+        </w:tc>
+        <w:tc>
+          <w:tcPr/>
+          <w:p>
+            <w:pPr>
+              <w:pStyle w:val="Compact"/>
+            </w:pPr>
+            <w:r>
+              <w:t xml:space="preserve">0.50 [0.32, 0.67]</w:t>
             </w:r>
           </w:p>
         </w:tc>
@@ -2792,51 +3518,51 @@
               <w:pStyle w:val="Compact"/>
             </w:pPr>
             <w:r>
-              <w:t xml:space="preserve">6</w:t>
-            </w:r>
-          </w:p>
-        </w:tc>
-        <w:tc>
-          <w:tcPr/>
-          <w:p>
-            <w:pPr>
-              <w:pStyle w:val="Compact"/>
-            </w:pPr>
-            <w:r>
-              <w:t xml:space="preserve">0.87 [0.82, 0.93]</w:t>
-            </w:r>
-          </w:p>
-        </w:tc>
-        <w:tc>
-          <w:tcPr/>
-          <w:p>
-            <w:pPr>
-              <w:pStyle w:val="Compact"/>
-            </w:pPr>
-            <w:r>
-              <w:t xml:space="preserve">0.93</w:t>
-            </w:r>
-          </w:p>
-        </w:tc>
-        <w:tc>
-          <w:tcPr/>
-          <w:p>
-            <w:pPr>
-              <w:pStyle w:val="Compact"/>
-            </w:pPr>
-            <w:r>
-              <w:t xml:space="preserve">0.72</w:t>
-            </w:r>
-          </w:p>
-        </w:tc>
-        <w:tc>
-          <w:tcPr/>
-          <w:p>
-            <w:pPr>
-              <w:pStyle w:val="Compact"/>
-            </w:pPr>
-            <w:r>
-              <w:t xml:space="preserve">1</w:t>
+              <w:t xml:space="preserve">3</w:t>
+            </w:r>
+          </w:p>
+        </w:tc>
+        <w:tc>
+          <w:tcPr/>
+          <w:p>
+            <w:pPr>
+              <w:pStyle w:val="Compact"/>
+            </w:pPr>
+            <w:r>
+              <w:t xml:space="preserve">–</w:t>
+            </w:r>
+          </w:p>
+        </w:tc>
+        <w:tc>
+          <w:tcPr/>
+          <w:p>
+            <w:pPr>
+              <w:pStyle w:val="Compact"/>
+            </w:pPr>
+            <w:r>
+              <w:t xml:space="preserve">–</w:t>
+            </w:r>
+          </w:p>
+        </w:tc>
+        <w:tc>
+          <w:tcPr/>
+          <w:p>
+            <w:pPr>
+              <w:pStyle w:val="Compact"/>
+            </w:pPr>
+            <w:r>
+              <w:t xml:space="preserve">–</w:t>
+            </w:r>
+          </w:p>
+        </w:tc>
+        <w:tc>
+          <w:tcPr/>
+          <w:p>
+            <w:pPr>
+              <w:pStyle w:val="Compact"/>
+            </w:pPr>
+            <w:r>
+              <w:t xml:space="preserve">–</w:t>
             </w:r>
           </w:p>
         </w:tc>
@@ -2849,73 +3575,73 @@
               <w:pStyle w:val="Compact"/>
             </w:pPr>
             <w:r>
-              <w:t xml:space="preserve">WCC, l = 1° + zero scan</w:t>
-            </w:r>
-          </w:p>
-        </w:tc>
-        <w:tc>
-          <w:tcPr/>
-          <w:p>
-            <w:pPr>
-              <w:pStyle w:val="Compact"/>
-            </w:pPr>
-            <w:r>
-              <w:t xml:space="preserve">0.50 [0.32, 0.67]</w:t>
-            </w:r>
-          </w:p>
-        </w:tc>
-        <w:tc>
-          <w:tcPr/>
-          <w:p>
-            <w:pPr>
-              <w:pStyle w:val="Compact"/>
-            </w:pPr>
-            <w:r>
-              <w:t xml:space="preserve">0.57</w:t>
-            </w:r>
-          </w:p>
-        </w:tc>
-        <w:tc>
-          <w:tcPr/>
-          <w:p>
-            <w:pPr>
-              <w:pStyle w:val="Compact"/>
-            </w:pPr>
-            <w:r>
-              <w:t xml:space="preserve">50</w:t>
-            </w:r>
-          </w:p>
-        </w:tc>
-        <w:tc>
-          <w:tcPr/>
-          <w:p>
-            <w:pPr>
-              <w:pStyle w:val="Compact"/>
-            </w:pPr>
-            <w:r>
-              <w:t xml:space="preserve">0.83 [0.76, 0.89]</w:t>
-            </w:r>
-          </w:p>
-        </w:tc>
-        <w:tc>
-          <w:tcPr/>
-          <w:p>
-            <w:pPr>
-              <w:pStyle w:val="Compact"/>
-            </w:pPr>
-            <w:r>
-              <w:t xml:space="preserve">0.89</w:t>
-            </w:r>
-          </w:p>
-        </w:tc>
-        <w:tc>
-          <w:tcPr/>
-          <w:p>
-            <w:pPr>
-              <w:pStyle w:val="Compact"/>
-            </w:pPr>
-            <w:r>
-              <w:t xml:space="preserve">0.68</w:t>
+              <w:t xml:space="preserve">ln q lag + zero scan</w:t>
+            </w:r>
+          </w:p>
+        </w:tc>
+        <w:tc>
+          <w:tcPr/>
+          <w:p>
+            <w:pPr>
+              <w:pStyle w:val="Compact"/>
+            </w:pPr>
+            <w:r>
+              <w:t xml:space="preserve">0.45 [0.28, 0.63]</w:t>
+            </w:r>
+          </w:p>
+        </w:tc>
+        <w:tc>
+          <w:tcPr/>
+          <w:p>
+            <w:pPr>
+              <w:pStyle w:val="Compact"/>
+            </w:pPr>
+            <w:r>
+              <w:t xml:space="preserve">0.61</w:t>
+            </w:r>
+          </w:p>
+        </w:tc>
+        <w:tc>
+          <w:tcPr/>
+          <w:p>
+            <w:pPr>
+              <w:pStyle w:val="Compact"/>
+            </w:pPr>
+            <w:r>
+              <w:t xml:space="preserve">7</w:t>
+            </w:r>
+          </w:p>
+        </w:tc>
+        <w:tc>
+          <w:tcPr/>
+          <w:p>
+            <w:pPr>
+              <w:pStyle w:val="Compact"/>
+            </w:pPr>
+            <w:r>
+              <w:t xml:space="preserve">0.87 [0.82, 0.93]</w:t>
+            </w:r>
+          </w:p>
+        </w:tc>
+        <w:tc>
+          <w:tcPr/>
+          <w:p>
+            <w:pPr>
+              <w:pStyle w:val="Compact"/>
+            </w:pPr>
+            <w:r>
+              <w:t xml:space="preserve">0.93</w:t>
+            </w:r>
+          </w:p>
+        </w:tc>
+        <w:tc>
+          <w:tcPr/>
+          <w:p>
+            <w:pPr>
+              <w:pStyle w:val="Compact"/>
+            </w:pPr>
+            <w:r>
+              <w:t xml:space="preserve">0.72</w:t>
             </w:r>
           </w:p>
         </w:tc>
@@ -2939,62 +3665,18 @@
               <w:pStyle w:val="Compact"/>
             </w:pPr>
             <w:r>
-              <w:t xml:space="preserve">WCC, l = 2° + zero scan</w:t>
-            </w:r>
-          </w:p>
-        </w:tc>
-        <w:tc>
-          <w:tcPr/>
-          <w:p>
-            <w:pPr>
-              <w:pStyle w:val="Compact"/>
-            </w:pPr>
-            <w:r>
-              <w:t xml:space="preserve">0.47 [0.30, 0.63]</w:t>
-            </w:r>
-          </w:p>
-        </w:tc>
-        <w:tc>
-          <w:tcPr/>
-          <w:p>
-            <w:pPr>
-              <w:pStyle w:val="Compact"/>
-            </w:pPr>
-            <w:r>
-              <w:t xml:space="preserve">0.53</w:t>
-            </w:r>
-          </w:p>
-        </w:tc>
-        <w:tc>
-          <w:tcPr/>
-          <w:p>
-            <w:pPr>
-              <w:pStyle w:val="Compact"/>
-            </w:pPr>
-            <w:r>
-              <w:t xml:space="preserve">350</w:t>
-            </w:r>
-          </w:p>
-        </w:tc>
-        <w:tc>
-          <w:tcPr/>
-          <w:p>
-            <w:pPr>
-              <w:pStyle w:val="Compact"/>
-            </w:pPr>
-            <w:r>
-              <w:t xml:space="preserve">0.71 [0.63, 0.78]</w:t>
-            </w:r>
-          </w:p>
-        </w:tc>
-        <w:tc>
-          <w:tcPr/>
-          <w:p>
-            <w:pPr>
-              <w:pStyle w:val="Compact"/>
-            </w:pPr>
-            <w:r>
-              <w:t xml:space="preserve">0.81</w:t>
+              <w:t xml:space="preserve">WCC, l = 1° + zero scan</w:t>
+            </w:r>
+          </w:p>
+        </w:tc>
+        <w:tc>
+          <w:tcPr/>
+          <w:p>
+            <w:pPr>
+              <w:pStyle w:val="Compact"/>
+            </w:pPr>
+            <w:r>
+              <w:t xml:space="preserve">0.50 [0.32, 0.67]</w:t>
             </w:r>
           </w:p>
         </w:tc>
@@ -3006,6 +3688,50 @@
             </w:pPr>
             <w:r>
               <w:t xml:space="preserve">0.57</w:t>
+            </w:r>
+          </w:p>
+        </w:tc>
+        <w:tc>
+          <w:tcPr/>
+          <w:p>
+            <w:pPr>
+              <w:pStyle w:val="Compact"/>
+            </w:pPr>
+            <w:r>
+              <w:t xml:space="preserve">50</w:t>
+            </w:r>
+          </w:p>
+        </w:tc>
+        <w:tc>
+          <w:tcPr/>
+          <w:p>
+            <w:pPr>
+              <w:pStyle w:val="Compact"/>
+            </w:pPr>
+            <w:r>
+              <w:t xml:space="preserve">0.83 [0.76, 0.89]</w:t>
+            </w:r>
+          </w:p>
+        </w:tc>
+        <w:tc>
+          <w:tcPr/>
+          <w:p>
+            <w:pPr>
+              <w:pStyle w:val="Compact"/>
+            </w:pPr>
+            <w:r>
+              <w:t xml:space="preserve">0.89</w:t>
+            </w:r>
+          </w:p>
+        </w:tc>
+        <w:tc>
+          <w:tcPr/>
+          <w:p>
+            <w:pPr>
+              <w:pStyle w:val="Compact"/>
+            </w:pPr>
+            <w:r>
+              <w:t xml:space="preserve">0.68</w:t>
             </w:r>
           </w:p>
         </w:tc>
@@ -3029,73 +3755,73 @@
               <w:pStyle w:val="Compact"/>
             </w:pPr>
             <w:r>
-              <w:t xml:space="preserve">Cosine + zero scan</w:t>
-            </w:r>
-          </w:p>
-        </w:tc>
-        <w:tc>
-          <w:tcPr/>
-          <w:p>
-            <w:pPr>
-              <w:pStyle w:val="Compact"/>
-            </w:pPr>
-            <w:r>
-              <w:t xml:space="preserve">0.40 [0.24, 0.57]</w:t>
-            </w:r>
-          </w:p>
-        </w:tc>
-        <w:tc>
-          <w:tcPr/>
-          <w:p>
-            <w:pPr>
-              <w:pStyle w:val="Compact"/>
-            </w:pPr>
-            <w:r>
-              <w:t xml:space="preserve">0.46</w:t>
-            </w:r>
-          </w:p>
-        </w:tc>
-        <w:tc>
-          <w:tcPr/>
-          <w:p>
-            <w:pPr>
-              <w:pStyle w:val="Compact"/>
-            </w:pPr>
-            <w:r>
-              <w:t xml:space="preserve">31</w:t>
-            </w:r>
-          </w:p>
-        </w:tc>
-        <w:tc>
-          <w:tcPr/>
-          <w:p>
-            <w:pPr>
-              <w:pStyle w:val="Compact"/>
-            </w:pPr>
-            <w:r>
-              <w:t xml:space="preserve">0.84 [0.78, 0.90]</w:t>
-            </w:r>
-          </w:p>
-        </w:tc>
-        <w:tc>
-          <w:tcPr/>
-          <w:p>
-            <w:pPr>
-              <w:pStyle w:val="Compact"/>
-            </w:pPr>
-            <w:r>
-              <w:t xml:space="preserve">0.94</w:t>
-            </w:r>
-          </w:p>
-        </w:tc>
-        <w:tc>
-          <w:tcPr/>
-          <w:p>
-            <w:pPr>
-              <w:pStyle w:val="Compact"/>
-            </w:pPr>
-            <w:r>
-              <w:t xml:space="preserve">0.72</w:t>
+              <w:t xml:space="preserve">WCC, l = 2° + zero scan</w:t>
+            </w:r>
+          </w:p>
+        </w:tc>
+        <w:tc>
+          <w:tcPr/>
+          <w:p>
+            <w:pPr>
+              <w:pStyle w:val="Compact"/>
+            </w:pPr>
+            <w:r>
+              <w:t xml:space="preserve">0.47 [0.30, 0.63]</w:t>
+            </w:r>
+          </w:p>
+        </w:tc>
+        <w:tc>
+          <w:tcPr/>
+          <w:p>
+            <w:pPr>
+              <w:pStyle w:val="Compact"/>
+            </w:pPr>
+            <w:r>
+              <w:t xml:space="preserve">0.53</w:t>
+            </w:r>
+          </w:p>
+        </w:tc>
+        <w:tc>
+          <w:tcPr/>
+          <w:p>
+            <w:pPr>
+              <w:pStyle w:val="Compact"/>
+            </w:pPr>
+            <w:r>
+              <w:t xml:space="preserve">350</w:t>
+            </w:r>
+          </w:p>
+        </w:tc>
+        <w:tc>
+          <w:tcPr/>
+          <w:p>
+            <w:pPr>
+              <w:pStyle w:val="Compact"/>
+            </w:pPr>
+            <w:r>
+              <w:t xml:space="preserve">0.71 [0.63, 0.78]</w:t>
+            </w:r>
+          </w:p>
+        </w:tc>
+        <w:tc>
+          <w:tcPr/>
+          <w:p>
+            <w:pPr>
+              <w:pStyle w:val="Compact"/>
+            </w:pPr>
+            <w:r>
+              <w:t xml:space="preserve">0.81</w:t>
+            </w:r>
+          </w:p>
+        </w:tc>
+        <w:tc>
+          <w:tcPr/>
+          <w:p>
+            <w:pPr>
+              <w:pStyle w:val="Compact"/>
+            </w:pPr>
+            <w:r>
+              <w:t xml:space="preserve">0.57</w:t>
             </w:r>
           </w:p>
         </w:tc>
@@ -3119,73 +3845,73 @@
               <w:pStyle w:val="Compact"/>
             </w:pPr>
             <w:r>
-              <w:t xml:space="preserve">Pearson, fixed grid</w:t>
-            </w:r>
-          </w:p>
-        </w:tc>
-        <w:tc>
-          <w:tcPr/>
-          <w:p>
-            <w:pPr>
-              <w:pStyle w:val="Compact"/>
-            </w:pPr>
-            <w:r>
-              <w:t xml:space="preserve">0.30 [0.15, 0.48]</w:t>
-            </w:r>
-          </w:p>
-        </w:tc>
-        <w:tc>
-          <w:tcPr/>
-          <w:p>
-            <w:pPr>
-              <w:pStyle w:val="Compact"/>
-            </w:pPr>
-            <w:r>
-              <w:t xml:space="preserve">0.32</w:t>
-            </w:r>
-          </w:p>
-        </w:tc>
-        <w:tc>
-          <w:tcPr/>
-          <w:p>
-            <w:pPr>
-              <w:pStyle w:val="Compact"/>
-            </w:pPr>
-            <w:r>
-              <w:t xml:space="preserve">131</w:t>
-            </w:r>
-          </w:p>
-        </w:tc>
-        <w:tc>
-          <w:tcPr/>
-          <w:p>
-            <w:pPr>
-              <w:pStyle w:val="Compact"/>
-            </w:pPr>
-            <w:r>
-              <w:t xml:space="preserve">0.83 [0.77, 0.89]</w:t>
-            </w:r>
-          </w:p>
-        </w:tc>
-        <w:tc>
-          <w:tcPr/>
-          <w:p>
-            <w:pPr>
-              <w:pStyle w:val="Compact"/>
-            </w:pPr>
-            <w:r>
-              <w:t xml:space="preserve">0.88</w:t>
-            </w:r>
-          </w:p>
-        </w:tc>
-        <w:tc>
-          <w:tcPr/>
-          <w:p>
-            <w:pPr>
-              <w:pStyle w:val="Compact"/>
-            </w:pPr>
-            <w:r>
-              <w:t xml:space="preserve">0.82</w:t>
+              <w:t xml:space="preserve">Cosine + zero scan</w:t>
+            </w:r>
+          </w:p>
+        </w:tc>
+        <w:tc>
+          <w:tcPr/>
+          <w:p>
+            <w:pPr>
+              <w:pStyle w:val="Compact"/>
+            </w:pPr>
+            <w:r>
+              <w:t xml:space="preserve">0.40 [0.24, 0.57]</w:t>
+            </w:r>
+          </w:p>
+        </w:tc>
+        <w:tc>
+          <w:tcPr/>
+          <w:p>
+            <w:pPr>
+              <w:pStyle w:val="Compact"/>
+            </w:pPr>
+            <w:r>
+              <w:t xml:space="preserve">0.46</w:t>
+            </w:r>
+          </w:p>
+        </w:tc>
+        <w:tc>
+          <w:tcPr/>
+          <w:p>
+            <w:pPr>
+              <w:pStyle w:val="Compact"/>
+            </w:pPr>
+            <w:r>
+              <w:t xml:space="preserve">31</w:t>
+            </w:r>
+          </w:p>
+        </w:tc>
+        <w:tc>
+          <w:tcPr/>
+          <w:p>
+            <w:pPr>
+              <w:pStyle w:val="Compact"/>
+            </w:pPr>
+            <w:r>
+              <w:t xml:space="preserve">0.84 [0.78, 0.90]</w:t>
+            </w:r>
+          </w:p>
+        </w:tc>
+        <w:tc>
+          <w:tcPr/>
+          <w:p>
+            <w:pPr>
+              <w:pStyle w:val="Compact"/>
+            </w:pPr>
+            <w:r>
+              <w:t xml:space="preserve">0.94</w:t>
+            </w:r>
+          </w:p>
+        </w:tc>
+        <w:tc>
+          <w:tcPr/>
+          <w:p>
+            <w:pPr>
+              <w:pStyle w:val="Compact"/>
+            </w:pPr>
+            <w:r>
+              <w:t xml:space="preserve">0.72</w:t>
             </w:r>
           </w:p>
         </w:tc>
@@ -3209,6 +3935,96 @@
               <w:pStyle w:val="Compact"/>
             </w:pPr>
             <w:r>
+              <w:t xml:space="preserve">Pearson, fixed grid</w:t>
+            </w:r>
+          </w:p>
+        </w:tc>
+        <w:tc>
+          <w:tcPr/>
+          <w:p>
+            <w:pPr>
+              <w:pStyle w:val="Compact"/>
+            </w:pPr>
+            <w:r>
+              <w:t xml:space="preserve">0.30 [0.15, 0.48]</w:t>
+            </w:r>
+          </w:p>
+        </w:tc>
+        <w:tc>
+          <w:tcPr/>
+          <w:p>
+            <w:pPr>
+              <w:pStyle w:val="Compact"/>
+            </w:pPr>
+            <w:r>
+              <w:t xml:space="preserve">0.32</w:t>
+            </w:r>
+          </w:p>
+        </w:tc>
+        <w:tc>
+          <w:tcPr/>
+          <w:p>
+            <w:pPr>
+              <w:pStyle w:val="Compact"/>
+            </w:pPr>
+            <w:r>
+              <w:t xml:space="preserve">131</w:t>
+            </w:r>
+          </w:p>
+        </w:tc>
+        <w:tc>
+          <w:tcPr/>
+          <w:p>
+            <w:pPr>
+              <w:pStyle w:val="Compact"/>
+            </w:pPr>
+            <w:r>
+              <w:t xml:space="preserve">0.83 [0.77, 0.89]</w:t>
+            </w:r>
+          </w:p>
+        </w:tc>
+        <w:tc>
+          <w:tcPr/>
+          <w:p>
+            <w:pPr>
+              <w:pStyle w:val="Compact"/>
+            </w:pPr>
+            <w:r>
+              <w:t xml:space="preserve">0.88</w:t>
+            </w:r>
+          </w:p>
+        </w:tc>
+        <w:tc>
+          <w:tcPr/>
+          <w:p>
+            <w:pPr>
+              <w:pStyle w:val="Compact"/>
+            </w:pPr>
+            <w:r>
+              <w:t xml:space="preserve">0.82</w:t>
+            </w:r>
+          </w:p>
+        </w:tc>
+        <w:tc>
+          <w:tcPr/>
+          <w:p>
+            <w:pPr>
+              <w:pStyle w:val="Compact"/>
+            </w:pPr>
+            <w:r>
+              <w:t xml:space="preserve">1</w:t>
+            </w:r>
+          </w:p>
+        </w:tc>
+      </w:tr>
+      <w:tr>
+        <w:tc>
+          <w:tcPr/>
+          <w:p>
+            <w:pPr>
+              <w:pStyle w:val="Compact"/>
+            </w:pPr>
+            <w:r>
               <w:t xml:space="preserve">Learned embedding</w:t>
             </w:r>
           </w:p>
@@ -3292,8 +4108,8 @@
         </w:tc>
       </w:tr>
     </w:tbl>
-    <w:bookmarkEnd w:id="31"/>
-    <w:bookmarkStart w:id="35" w:name="when-the-patterns-own-entry-counts"/>
+    <w:bookmarkEnd w:id="34"/>
+    <w:bookmarkStart w:id="38" w:name="when-the-patterns-own-entry-counts"/>
     <w:p>
       <w:pPr>
         <w:pStyle w:val="Heading3"/>
@@ -3341,20 +4157,20 @@
       <w:r>
         <w:drawing>
           <wp:inline>
-            <wp:extent cx="5334000" cy="1821302"/>
+            <wp:extent cx="5334000" cy="2031752"/>
             <wp:effectExtent b="0" l="0" r="0" t="0"/>
-            <wp:docPr descr="" title="" id="33" name="Picture"/>
+            <wp:docPr descr="" title="" id="36" name="Picture"/>
             <a:graphic>
               <a:graphicData uri="http://schemas.openxmlformats.org/drawingml/2006/picture">
                 <pic:pic>
                   <pic:nvPicPr>
-                    <pic:cNvPr descr="figs/fig3_real_benchmark.png" id="34" name="Picture"/>
+                    <pic:cNvPr descr="figs/fig3_real_benchmark.png" id="37" name="Picture"/>
                     <pic:cNvPicPr>
                       <a:picLocks noChangeArrowheads="1" noChangeAspect="1"/>
                     </pic:cNvPicPr>
                   </pic:nvPicPr>
                   <pic:blipFill>
-                    <a:blip r:embed="rId32"/>
+                    <a:blip r:embed="rId35"/>
                     <a:stretch>
                       <a:fillRect/>
                     </a:stretch>
@@ -3362,7 +4178,7 @@
                   <pic:spPr bwMode="auto">
                     <a:xfrm>
                       <a:off x="0" y="0"/>
-                      <a:ext cx="5334000" cy="1821302"/>
+                      <a:ext cx="5334000" cy="2031752"/>
                     </a:xfrm>
                     <a:prstGeom prst="rect">
                       <a:avLst/>
@@ -3414,7 +4230,13 @@
         <w:t xml:space="preserve"> </w:t>
       </w:r>
       <w:r>
-        <w:t xml:space="preserve">(open squares, 30 compounds); vertical bars mark the value with the CSLS hubness correction.</w:t>
+        <w:t xml:space="preserve">(open squares, 30 compounds); vertical bars mark the value with the CSLS hubness correction. The top row is</w:t>
+      </w:r>
+      <w:r>
+        <w:t xml:space="preserve"> </w:t>
+      </w:r>
+      <w:r>
+        <w:t xml:space="preserve">the variable-cell re-rank of the ln q top 50, which exists for the single-crystal set only.</w:t>
       </w:r>
       <w:r>
         <w:t xml:space="preserve"> </w:t>
@@ -3576,7 +4398,7 @@
         <w:t xml:space="preserve"> </w:t>
       </w:r>
       <w:r>
-        <w:t xml:space="preserve">0.90 → 0.83, WCC l = 2° 0.83 → 0.71 and ln q 0.94 → 0.87. Results on small libraries overstate accuracy at</w:t>
+        <w:t xml:space="preserve">0.90 → 0.83, WCC l = 2° 0.83 → 0.71 and ln q 0.93 → 0.87. Results on small libraries overstate accuracy at</w:t>
       </w:r>
       <w:r>
         <w:t xml:space="preserve"> </w:t>
@@ -3609,8 +4431,8 @@
         <w:t xml:space="preserve">reach 0.94–0.98 top-1 and the model 0.71 (51 patterns).</w:t>
       </w:r>
     </w:p>
-    <w:bookmarkEnd w:id="35"/>
-    <w:bookmarkStart w:id="39" w:name="X326caf1ad4de8f630beaf9cf4662ea4e20903e8"/>
+    <w:bookmarkEnd w:id="38"/>
+    <w:bookmarkStart w:id="42" w:name="X326caf1ad4de8f630beaf9cf4662ea4e20903e8"/>
     <w:p>
       <w:pPr>
         <w:pStyle w:val="Heading3"/>
@@ -3640,7 +4462,7 @@
         <w:t xml:space="preserve"> </w:t>
       </w:r>
       <w:r>
-        <w:t xml:space="preserve">probes is 18.7 for cosine + zero scan, 12.7 for ln q, 8.0 for Pearson and 3.6 for both WCC widths.</w:t>
+        <w:t xml:space="preserve">probes is 18.7 for cosine + zero scan, 12.6 for ln q, 8.0 for Pearson and 3.6 for both WCC widths.</w:t>
       </w:r>
     </w:p>
     <w:p>
@@ -3824,18 +4646,18 @@
           <wp:inline>
             <wp:extent cx="5334000" cy="1814034"/>
             <wp:effectExtent b="0" l="0" r="0" t="0"/>
-            <wp:docPr descr="" title="" id="37" name="Picture"/>
+            <wp:docPr descr="" title="" id="40" name="Picture"/>
             <a:graphic>
               <a:graphicData uri="http://schemas.openxmlformats.org/drawingml/2006/picture">
                 <pic:pic>
                   <pic:nvPicPr>
-                    <pic:cNvPr descr="figs/fig4_case_zzzuwk.png" id="38" name="Picture"/>
+                    <pic:cNvPr descr="figs/fig4_case_zzzuwk.png" id="41" name="Picture"/>
                     <pic:cNvPicPr>
                       <a:picLocks noChangeArrowheads="1" noChangeAspect="1"/>
                     </pic:cNvPicPr>
                   </pic:nvPicPr>
                   <pic:blipFill>
-                    <a:blip r:embed="rId36"/>
+                    <a:blip r:embed="rId39"/>
                     <a:stretch>
                       <a:fillRect/>
                     </a:stretch>
@@ -3925,7 +4747,7 @@
         <w:t xml:space="preserve"> </w:t>
       </w:r>
       <w:r>
-        <w:t xml:space="preserve">(12 → 17) and ln q (0 → 3); for WCC it only exchanges one decoy for another. Per pattern, cosine + zero</w:t>
+        <w:t xml:space="preserve">(12 → 17) and ln q (0 → 2); for WCC it only exchanges one decoy for another. Per pattern, cosine + zero</w:t>
       </w:r>
       <w:r>
         <w:t xml:space="preserve"> </w:t>
@@ -3943,7 +4765,7 @@
         <w:t xml:space="preserve"> </w:t>
       </w:r>
       <w:r>
-        <w:t xml:space="preserve">single-crystal references the change is +0.01 to +0.06, with upper CI bounds up to 0.17, and for the</w:t>
+        <w:t xml:space="preserve">single-crystal references the change is +0.01 to +0.10, with upper CI bounds up to 0.20, and for the</w:t>
       </w:r>
       <w:r>
         <w:t xml:space="preserve"> </w:t>
@@ -3958,8 +4780,8 @@
         <w:t xml:space="preserve">that removes hub-like confusions when they occur.</w:t>
       </w:r>
     </w:p>
-    <w:bookmarkEnd w:id="39"/>
-    <w:bookmarkStart w:id="43" w:name="why-the-learned-model-fails"/>
+    <w:bookmarkEnd w:id="42"/>
+    <w:bookmarkStart w:id="49" w:name="why-the-learned-model-fails"/>
     <w:p>
       <w:pPr>
         <w:pStyle w:val="Heading3"/>
@@ -3973,7 +4795,7 @@
         <w:pStyle w:val="FirstParagraph"/>
       </w:pPr>
       <w:r>
-        <w:t xml:space="preserve">The model ranks the first correct entry at a median of about 6,000 of 309,080 (Fig. 5a). Two diagnostics</w:t>
+        <w:t xml:space="preserve">The model ranks the first correct entry at a median of about 6,000 of 309,080 (Fig. 5a). Four diagnostics</w:t>
       </w:r>
       <w:r>
         <w:t xml:space="preserve"> </w:t>
@@ -4083,6 +4905,180 @@
         <w:pStyle w:val="BodyText"/>
       </w:pPr>
       <w:r>
+        <w:rPr>
+          <w:b/>
+          <w:bCs/>
+        </w:rPr>
+        <w:t xml:space="preserve">No single measured effect explains the gap.</w:t>
+      </w:r>
+      <w:r>
+        <w:t xml:space="preserve"> </w:t>
+      </w:r>
+      <w:r>
+        <w:t xml:space="preserve">Rendering each pattern’s own entry with the effects of its</w:t>
+      </w:r>
+      <w:r>
+        <w:t xml:space="preserve"> </w:t>
+      </w:r>
+      <w:r>
+        <w:t xml:space="preserve">measurement (Section 3.4) shows where the model loses ground (Fig. 6). Clean, it reaches a compound-weighted</w:t>
+      </w:r>
+      <w:r>
+        <w:t xml:space="preserve"> </w:t>
+      </w:r>
+      <w:r>
+        <w:t xml:space="preserve">top-1 of 0.27 with a median rank of 5. One effect at a time costs it little except Kα2 (0.18, median rank</w:t>
+      </w:r>
+      <w:r>
+        <w:t xml:space="preserve"> </w:t>
+      </w:r>
+      <w:r>
+        <w:t xml:space="preserve">33) and the background with its subtraction (0.24, median rank 130). With all six effects it reaches 0.15</w:t>
+      </w:r>
+      <w:r>
+        <w:t xml:space="preserve"> </w:t>
+      </w:r>
+      <w:r>
+        <w:t xml:space="preserve">(median rank 176), and with the Debye–Waller factor added 0.05 (median rank 744), against 0.02 and about</w:t>
+      </w:r>
+      <w:r>
+        <w:t xml:space="preserve"> </w:t>
+      </w:r>
+      <w:r>
+        <w:t xml:space="preserve">6,000 on the measured patterns. Fixed-grid Pearson shows the contrast: with all six effects, the</w:t>
+      </w:r>
+      <w:r>
+        <w:t xml:space="preserve"> </w:t>
+      </w:r>
+      <w:r>
+        <w:t xml:space="preserve">Debye–Waller factor and jitter its ladder ends at 0.83, the value it reaches on the measured patterns</w:t>
+      </w:r>
+      <w:r>
+        <w:t xml:space="preserve"> </w:t>
+      </w:r>
+      <w:r>
+        <w:t xml:space="preserve">(0.83), whereas for the model the same simulated patterns leave the median rank at about 750, against about</w:t>
+      </w:r>
+      <w:r>
+        <w:t xml:space="preserve"> </w:t>
+      </w:r>
+      <w:r>
+        <w:t xml:space="preserve">6,000 on the measured ones.</w:t>
+      </w:r>
+    </w:p>
+    <w:p>
+      <w:pPr>
+        <w:pStyle w:val="BodyText"/>
+      </w:pPr>
+      <w:r>
+        <w:rPr>
+          <w:b/>
+          <w:bCs/>
+        </w:rPr>
+        <w:t xml:space="preserve">A retrain with these effects fixes them in simulation only.</w:t>
+      </w:r>
+      <w:r>
+        <w:t xml:space="preserve"> </w:t>
+      </w:r>
+      <w:r>
+        <w:t xml:space="preserve">We retrained the model with Kα2, a</w:t>
+      </w:r>
+      <w:r>
+        <w:t xml:space="preserve"> </w:t>
+      </w:r>
+      <w:r>
+        <w:t xml:space="preserve">Debye–Waller factor, intensity jitter, range cuts and the background subtraction in its training simulation</w:t>
+      </w:r>
+      <w:r>
+        <w:t xml:space="preserve"> </w:t>
+      </w:r>
+      <w:r>
+        <w:t xml:space="preserve">(Section 3.4). It learned them: on its own entries with all six effects and the Debye–Waller factor, top-1</w:t>
+      </w:r>
+      <w:r>
+        <w:t xml:space="preserve"> </w:t>
+      </w:r>
+      <w:r>
+        <w:t xml:space="preserve">rises from 0.05 to 0.23 and the median rank falls from 744 to 34 (Fig. 6); Kα2 alone is the exception (0.18</w:t>
+      </w:r>
+      <w:r>
+        <w:t xml:space="preserve"> </w:t>
+      </w:r>
+      <w:r>
+        <w:t xml:space="preserve">to 0.11). On the measured patterns the retrained model reaches a compound-weighted top-1 of</w:t>
+      </w:r>
+      <w:r>
+        <w:t xml:space="preserve"> </w:t>
+      </w:r>
+      <w:r>
+        <w:t xml:space="preserve">0.02 [0.00, 0.06], against 0.02 [0.00, 0.04] before, and 0.00 for single-crystal references, although its</w:t>
+      </w:r>
+      <w:r>
+        <w:t xml:space="preserve"> </w:t>
+      </w:r>
+      <w:r>
+        <w:t xml:space="preserve">median rank halves, to about 3,000. Before training we had predicted a measured per-pattern top-1 of</w:t>
+      </w:r>
+      <w:r>
+        <w:t xml:space="preserve"> </w:t>
+      </w:r>
+      <w:r>
+        <w:t xml:space="preserve">0.05–0.20, and that a value below 0.03 would mean the remaining gap is not the modelled effects; it is 0.02.</w:t>
+      </w:r>
+      <w:r>
+        <w:t xml:space="preserve"> </w:t>
+      </w:r>
+      <w:r>
+        <w:t xml:space="preserve">For this model, what separates the measured patterns from their simulations is something we did not model.</w:t>
+      </w:r>
+    </w:p>
+    <w:p>
+      <w:pPr>
+        <w:pStyle w:val="BodyText"/>
+      </w:pPr>
+      <w:r>
+        <w:rPr>
+          <w:b/>
+          <w:bCs/>
+        </w:rPr>
+        <w:t xml:space="preserve">Pattern to pattern.</w:t>
+      </w:r>
+      <w:r>
+        <w:t xml:space="preserve"> </w:t>
+      </w:r>
+      <w:r>
+        <w:t xml:space="preserve">Matching the measured patterns to the simulated library patterns in the model’s</w:t>
+      </w:r>
+      <w:r>
+        <w:t xml:space="preserve"> </w:t>
+      </w:r>
+      <w:r>
+        <w:t xml:space="preserve">pattern space, without the structure encoder, reaches a compound-weighted top-1 of 0.13 (median rank about</w:t>
+      </w:r>
+      <w:r>
+        <w:t xml:space="preserve"> </w:t>
+      </w:r>
+      <w:r>
+        <w:t xml:space="preserve">1,600), and 0.21 (about 270) with the retrained encoder. The classical scores do the same task, measured</w:t>
+      </w:r>
+      <w:r>
+        <w:t xml:space="preserve"> </w:t>
+      </w:r>
+      <w:r>
+        <w:t xml:space="preserve">pattern against simulated pattern, at 0.71–0.87. The pattern encoder itself, not only the step to the</w:t>
+      </w:r>
+      <w:r>
+        <w:t xml:space="preserve"> </w:t>
+      </w:r>
+      <w:r>
+        <w:t xml:space="preserve">structure encoder, places measured patterns away from simulations of the same structures.</w:t>
+      </w:r>
+    </w:p>
+    <w:p>
+      <w:pPr>
+        <w:pStyle w:val="BodyText"/>
+      </w:pPr>
+      <w:r>
         <w:t xml:space="preserve">Within families, where it only has to separate a compound’s forms, the model reaches 0.71 against</w:t>
       </w:r>
       <w:r>
@@ -4102,50 +5098,6 @@
       </w:r>
       <w:r>
         <w:t xml:space="preserve">top-1, against 0.57–0.82 for the same scores on the full library.</w:t>
-      </w:r>
-    </w:p>
-    <w:p>
-      <w:pPr>
-        <w:pStyle w:val="BodyText"/>
-      </w:pPr>
-      <w:r>
-        <w:t xml:space="preserve">The training simulation covers zero offset, strain, broadening, texture, background and noise, but not Kα2,</w:t>
-      </w:r>
-      <w:r>
-        <w:t xml:space="preserve"> </w:t>
-      </w:r>
-      <w:r>
-        <w:t xml:space="preserve">real instrument profiles or real background shapes, and correlation-based scores do not have to transfer a</w:t>
-      </w:r>
-      <w:r>
-        <w:t xml:space="preserve"> </w:t>
-      </w:r>
-      <w:r>
-        <w:t xml:space="preserve">learned representation across that gap. Full-profile generative models have shown the same sensitivity to</w:t>
-      </w:r>
-      <w:r>
-        <w:t xml:space="preserve"> </w:t>
-      </w:r>
-      <w:r>
-        <w:t xml:space="preserve">how realistic the training patterns are</w:t>
-      </w:r>
-      <w:hyperlink w:anchor="ref-segal2026xrdiff">
-        <w:r>
-          <w:rPr>
-            <w:rStyle w:val="Hyperlink"/>
-            <w:vertAlign w:val="superscript"/>
-          </w:rPr>
-          <w:t xml:space="preserve">9</w:t>
-        </w:r>
-      </w:hyperlink>
-      <w:r>
-        <w:t xml:space="preserve">. Our experiments do not say which missing</w:t>
-      </w:r>
-      <w:r>
-        <w:t xml:space="preserve"> </w:t>
-      </w:r>
-      <w:r>
-        <w:t xml:space="preserve">ingredient matters most.</w:t>
       </w:r>
     </w:p>
     <w:p>
@@ -4157,18 +5109,18 @@
           <wp:inline>
             <wp:extent cx="5334000" cy="2012480"/>
             <wp:effectExtent b="0" l="0" r="0" t="0"/>
-            <wp:docPr descr="" title="" id="41" name="Picture"/>
+            <wp:docPr descr="" title="" id="44" name="Picture"/>
             <a:graphic>
               <a:graphicData uri="http://schemas.openxmlformats.org/drawingml/2006/picture">
                 <pic:pic>
                   <pic:nvPicPr>
-                    <pic:cNvPr descr="figs/fig5_rank_distributions.png" id="42" name="Picture"/>
+                    <pic:cNvPr descr="figs/fig5_rank_distributions.png" id="45" name="Picture"/>
                     <pic:cNvPicPr>
                       <a:picLocks noChangeArrowheads="1" noChangeAspect="1"/>
                     </pic:cNvPicPr>
                   </pic:nvPicPr>
                   <pic:blipFill>
-                    <a:blip r:embed="rId40"/>
+                    <a:blip r:embed="rId43"/>
                     <a:stretch>
                       <a:fillRect/>
                     </a:stretch>
@@ -4225,9 +5177,821 @@
         <w:t xml:space="preserve">Background-subtracted queries, no hubness correction.</w:t>
       </w:r>
     </w:p>
-    <w:bookmarkEnd w:id="43"/>
-    <w:bookmarkEnd w:id="44"/>
-    <w:bookmarkStart w:id="45" w:name="discussion"/>
+    <w:p>
+      <w:pPr>
+        <w:pStyle w:val="BodyText"/>
+      </w:pPr>
+      <w:r>
+        <w:drawing>
+          <wp:inline>
+            <wp:extent cx="5334000" cy="2105180"/>
+            <wp:effectExtent b="0" l="0" r="0" t="0"/>
+            <wp:docPr descr="" title="" id="47" name="Picture"/>
+            <a:graphic>
+              <a:graphicData uri="http://schemas.openxmlformats.org/drawingml/2006/picture">
+                <pic:pic>
+                  <pic:nvPicPr>
+                    <pic:cNvPr descr="figs/fig6_effect_ladder.png" id="48" name="Picture"/>
+                    <pic:cNvPicPr>
+                      <a:picLocks noChangeArrowheads="1" noChangeAspect="1"/>
+                    </pic:cNvPicPr>
+                  </pic:nvPicPr>
+                  <pic:blipFill>
+                    <a:blip r:embed="rId46"/>
+                    <a:stretch>
+                      <a:fillRect/>
+                    </a:stretch>
+                  </pic:blipFill>
+                  <pic:spPr bwMode="auto">
+                    <a:xfrm>
+                      <a:off x="0" y="0"/>
+                      <a:ext cx="5334000" cy="2105180"/>
+                    </a:xfrm>
+                    <a:prstGeom prst="rect">
+                      <a:avLst/>
+                    </a:prstGeom>
+                    <a:noFill/>
+                    <a:ln w="9525">
+                      <a:noFill/>
+                      <a:headEnd/>
+                      <a:tailEnd/>
+                    </a:ln>
+                  </pic:spPr>
+                </pic:pic>
+              </a:graphicData>
+            </a:graphic>
+          </wp:inline>
+        </w:drawing>
+      </w:r>
+    </w:p>
+    <w:p>
+      <w:pPr>
+        <w:pStyle w:val="BodyText"/>
+      </w:pPr>
+      <w:r>
+        <w:rPr>
+          <w:b/>
+          <w:bCs/>
+        </w:rPr>
+        <w:t xml:space="preserve">Fig. 6</w:t>
+      </w:r>
+      <w:r>
+        <w:t xml:space="preserve"> </w:t>
+      </w:r>
+      <w:r>
+        <w:t xml:space="preserve">Effect ladder. Each pattern’s own library entry is rendered cleanly, with one effect of its</w:t>
+      </w:r>
+      <w:r>
+        <w:t xml:space="preserve"> </w:t>
+      </w:r>
+      <w:r>
+        <w:t xml:space="preserve">measurement at a time, with all six, and with an overall Debye–Waller factor (B), log-normal intensity</w:t>
+      </w:r>
+      <w:r>
+        <w:t xml:space="preserve"> </w:t>
+      </w:r>
+      <w:r>
+        <w:t xml:space="preserve">jitter per reflection (σ = 0.3 or 0.5) or both added; the last point is the measured patterns themselves</w:t>
+      </w:r>
+      <w:r>
+        <w:t xml:space="preserve"> </w:t>
+      </w:r>
+      <w:r>
+        <w:t xml:space="preserve">(Section 3.4). Answer set: any same-form entry (188 patterns, 123 compounds). (a) Compound-weighted top-1 for</w:t>
+      </w:r>
+      <w:r>
+        <w:t xml:space="preserve"> </w:t>
+      </w:r>
+      <w:r>
+        <w:t xml:space="preserve">fixed-grid Pearson, the original model and the model retrained with these effects; (b) median rank of the</w:t>
+      </w:r>
+      <w:r>
+        <w:t xml:space="preserve"> </w:t>
+      </w:r>
+      <w:r>
+        <w:t xml:space="preserve">first correct entry for the two models.</w:t>
+      </w:r>
+    </w:p>
+    <w:bookmarkEnd w:id="49"/>
+    <w:bookmarkStart w:id="50" w:name="a-library-closer-to-the-measurements-1"/>
+    <w:p>
+      <w:pPr>
+        <w:pStyle w:val="Heading3"/>
+      </w:pPr>
+      <w:r>
+        <w:t xml:space="preserve">4.6 A library closer to the measurements</w:t>
+      </w:r>
+    </w:p>
+    <w:p>
+      <w:pPr>
+        <w:pStyle w:val="FirstParagraph"/>
+      </w:pPr>
+      <w:r>
+        <w:t xml:space="preserve">With the package of Section 3.7, the classical scores change by −0.04 to +0.04 in compound-weighted top-1,</w:t>
+      </w:r>
+      <w:r>
+        <w:t xml:space="preserve"> </w:t>
+      </w:r>
+      <w:r>
+        <w:t xml:space="preserve">paired against the main benchmark (Table 2). Only one change is resolved: cosine + zero scan rises by</w:t>
+      </w:r>
+      <w:r>
+        <w:t xml:space="preserve"> </w:t>
+      </w:r>
+      <w:r>
+        <w:t xml:space="preserve">0.04 [0.01, 0.08] when any same-form entry counts. The one-off ablations, each change removed alone and</w:t>
+      </w:r>
+      <w:r>
+        <w:t xml:space="preserve"> </w:t>
+      </w:r>
+      <w:r>
+        <w:t xml:space="preserve">paired against the full package, attribute that gain to the Kα2 nuisance (−0.03 [−0.07, −0.01] without it)</w:t>
+      </w:r>
+      <w:r>
+        <w:t xml:space="preserve"> </w:t>
+      </w:r>
+      <w:r>
+        <w:t xml:space="preserve">and show that restricting the comparison to the measured range costs WCC (l = 2°) when any same-form entry</w:t>
+      </w:r>
+      <w:r>
+        <w:t xml:space="preserve"> </w:t>
+      </w:r>
+      <w:r>
+        <w:t xml:space="preserve">counts (+0.05 [0.02, 0.09] without it). We had expected every single-crystal score to rise; they move by</w:t>
+      </w:r>
+      <w:r>
+        <w:t xml:space="preserve"> </w:t>
+      </w:r>
+      <w:r>
+        <w:t xml:space="preserve">−0.04 to +0.04, with every interval including zero. The learned model scores 0.00 with this library on both</w:t>
+      </w:r>
+      <w:r>
+        <w:t xml:space="preserve"> </w:t>
+      </w:r>
+      <w:r>
+        <w:t xml:space="preserve">sets. The classical results are therefore robust to these choices of library simulation, and the</w:t>
+      </w:r>
+      <w:r>
+        <w:t xml:space="preserve"> </w:t>
+      </w:r>
+      <w:r>
+        <w:t xml:space="preserve">single-crystal failures are not caused by them.</w:t>
+      </w:r>
+    </w:p>
+    <w:bookmarkEnd w:id="50"/>
+    <w:bookmarkStart w:id="51" w:name="the-open-replica"/>
+    <w:p>
+      <w:pPr>
+        <w:pStyle w:val="Heading3"/>
+      </w:pPr>
+      <w:r>
+        <w:t xml:space="preserve">4.7 The open replica</w:t>
+      </w:r>
+    </w:p>
+    <w:p>
+      <w:pPr>
+        <w:pStyle w:val="FirstParagraph"/>
+      </w:pPr>
+      <w:r>
+        <w:t xml:space="preserve">Against the 108,902 COD entries, the 190 patterns reproduce the main result (Table 2). When any same-form</w:t>
+      </w:r>
+      <w:r>
+        <w:t xml:space="preserve"> </w:t>
+      </w:r>
+      <w:r>
+        <w:t xml:space="preserve">entry counts, the classical scores reach a compound-weighted top-1 of 0.77–0.90 (125 compounds; ln q</w:t>
+      </w:r>
+      <w:r>
+        <w:t xml:space="preserve"> </w:t>
+      </w:r>
+      <w:r>
+        <w:t xml:space="preserve">0.90 [0.85, 0.95]) and the model 0.02 [0.00, 0.04]. The single-crystal set has 35 patterns but only 9</w:t>
+      </w:r>
+      <w:r>
+        <w:t xml:space="preserve"> </w:t>
+      </w:r>
+      <w:r>
+        <w:t xml:space="preserve">compounds; there the classical scores reach 0.26–0.58 and the model 0.00, with intervals too wide to order</w:t>
+      </w:r>
+      <w:r>
+        <w:t xml:space="preserve"> </w:t>
+      </w:r>
+      <w:r>
+        <w:t xml:space="preserve">the classical scores. The COD library is about a third of the size of the CSD library, and smaller libraries</w:t>
+      </w:r>
+      <w:r>
+        <w:t xml:space="preserve"> </w:t>
+      </w:r>
+      <w:r>
+        <w:t xml:space="preserve">favour every score (Fig. 3b). All numbers in this section can be regenerated without a CSD licence.</w:t>
+      </w:r>
+    </w:p>
+    <w:p>
+      <w:pPr>
+        <w:pStyle w:val="BodyText"/>
+      </w:pPr>
+      <w:r>
+        <w:rPr>
+          <w:b/>
+          <w:bCs/>
+        </w:rPr>
+        <w:t xml:space="preserve">Table 2</w:t>
+      </w:r>
+      <w:r>
+        <w:t xml:space="preserve"> </w:t>
+      </w:r>
+      <w:r>
+        <w:t xml:space="preserve">Compound-weighted top-1 on the main benchmark (CSD library, Table 1), with the library of</w:t>
+      </w:r>
+      <w:r>
+        <w:t xml:space="preserve"> </w:t>
+      </w:r>
+      <w:r>
+        <w:t xml:space="preserve">Section 3.7 (CSD, realistic) and on the open replica (COD library, Section 2.6). The single-crystal set has</w:t>
+      </w:r>
+      <w:r>
+        <w:t xml:space="preserve"> </w:t>
+      </w:r>
+      <w:r>
+        <w:t xml:space="preserve">30 compounds in the CSD and 9 in the COD; the any-same-form set has 123 and 125. Intervals are in the ESI.†</w:t>
+      </w:r>
+    </w:p>
+    <w:tbl>
+      <w:tblPr>
+        <w:tblStyle w:val="Table"/>
+        <w:tblW w:type="pct" w:w="5000"/>
+        <w:tblLayout w:type="fixed"/>
+        <w:tblLook w:firstRow="1" w:lastRow="0" w:firstColumn="0" w:lastColumn="0" w:noHBand="0" w:noVBand="0" w:val="0020"/>
+      </w:tblPr>
+      <w:tblGrid>
+        <w:gridCol w:w="1131"/>
+        <w:gridCol w:w="1131"/>
+        <w:gridCol w:w="1131"/>
+        <w:gridCol w:w="1131"/>
+        <w:gridCol w:w="1131"/>
+        <w:gridCol w:w="1131"/>
+        <w:gridCol w:w="1131"/>
+      </w:tblGrid>
+      <w:tr>
+        <w:trPr>
+          <w:tblHeader w:val="on"/>
+        </w:trPr>
+        <w:tc>
+          <w:tcPr/>
+          <w:p>
+            <w:pPr>
+              <w:pStyle w:val="Compact"/>
+            </w:pPr>
+            <w:r>
+              <w:t xml:space="preserve">Score</w:t>
+            </w:r>
+          </w:p>
+        </w:tc>
+        <w:tc>
+          <w:tcPr/>
+          <w:p>
+            <w:pPr>
+              <w:pStyle w:val="Compact"/>
+            </w:pPr>
+            <w:r>
+              <w:t xml:space="preserve">Single-crystal: CSD</w:t>
+            </w:r>
+          </w:p>
+        </w:tc>
+        <w:tc>
+          <w:tcPr/>
+          <w:p>
+            <w:pPr>
+              <w:pStyle w:val="Compact"/>
+            </w:pPr>
+            <w:r>
+              <w:t xml:space="preserve">CSD, realistic</w:t>
+            </w:r>
+          </w:p>
+        </w:tc>
+        <w:tc>
+          <w:tcPr/>
+          <w:p>
+            <w:pPr>
+              <w:pStyle w:val="Compact"/>
+            </w:pPr>
+            <w:r>
+              <w:t xml:space="preserve">COD</w:t>
+            </w:r>
+          </w:p>
+        </w:tc>
+        <w:tc>
+          <w:tcPr/>
+          <w:p>
+            <w:pPr>
+              <w:pStyle w:val="Compact"/>
+            </w:pPr>
+            <w:r>
+              <w:t xml:space="preserve">Any same-form: CSD</w:t>
+            </w:r>
+          </w:p>
+        </w:tc>
+        <w:tc>
+          <w:tcPr/>
+          <w:p>
+            <w:pPr>
+              <w:pStyle w:val="Compact"/>
+            </w:pPr>
+            <w:r>
+              <w:t xml:space="preserve">CSD, realistic</w:t>
+            </w:r>
+          </w:p>
+        </w:tc>
+        <w:tc>
+          <w:tcPr/>
+          <w:p>
+            <w:pPr>
+              <w:pStyle w:val="Compact"/>
+            </w:pPr>
+            <w:r>
+              <w:t xml:space="preserve">COD</w:t>
+            </w:r>
+          </w:p>
+        </w:tc>
+      </w:tr>
+      <w:tr>
+        <w:tc>
+          <w:tcPr/>
+          <w:p>
+            <w:pPr>
+              <w:pStyle w:val="Compact"/>
+            </w:pPr>
+            <w:r>
+              <w:t xml:space="preserve">ln q lag + zero scan</w:t>
+            </w:r>
+          </w:p>
+        </w:tc>
+        <w:tc>
+          <w:tcPr/>
+          <w:p>
+            <w:pPr>
+              <w:pStyle w:val="Compact"/>
+            </w:pPr>
+            <w:r>
+              <w:t xml:space="preserve">0.45</w:t>
+            </w:r>
+          </w:p>
+        </w:tc>
+        <w:tc>
+          <w:tcPr/>
+          <w:p>
+            <w:pPr>
+              <w:pStyle w:val="Compact"/>
+            </w:pPr>
+            <w:r>
+              <w:t xml:space="preserve">0.49</w:t>
+            </w:r>
+          </w:p>
+        </w:tc>
+        <w:tc>
+          <w:tcPr/>
+          <w:p>
+            <w:pPr>
+              <w:pStyle w:val="Compact"/>
+            </w:pPr>
+            <w:r>
+              <w:t xml:space="preserve">0.56</w:t>
+            </w:r>
+          </w:p>
+        </w:tc>
+        <w:tc>
+          <w:tcPr/>
+          <w:p>
+            <w:pPr>
+              <w:pStyle w:val="Compact"/>
+            </w:pPr>
+            <w:r>
+              <w:t xml:space="preserve">0.87</w:t>
+            </w:r>
+          </w:p>
+        </w:tc>
+        <w:tc>
+          <w:tcPr/>
+          <w:p>
+            <w:pPr>
+              <w:pStyle w:val="Compact"/>
+            </w:pPr>
+            <w:r>
+              <w:t xml:space="preserve">0.86</w:t>
+            </w:r>
+          </w:p>
+        </w:tc>
+        <w:tc>
+          <w:tcPr/>
+          <w:p>
+            <w:pPr>
+              <w:pStyle w:val="Compact"/>
+            </w:pPr>
+            <w:r>
+              <w:t xml:space="preserve">0.90</w:t>
+            </w:r>
+          </w:p>
+        </w:tc>
+      </w:tr>
+      <w:tr>
+        <w:tc>
+          <w:tcPr/>
+          <w:p>
+            <w:pPr>
+              <w:pStyle w:val="Compact"/>
+            </w:pPr>
+            <w:r>
+              <w:t xml:space="preserve">WCC, l = 1° + zero scan</w:t>
+            </w:r>
+          </w:p>
+        </w:tc>
+        <w:tc>
+          <w:tcPr/>
+          <w:p>
+            <w:pPr>
+              <w:pStyle w:val="Compact"/>
+            </w:pPr>
+            <w:r>
+              <w:t xml:space="preserve">0.50</w:t>
+            </w:r>
+          </w:p>
+        </w:tc>
+        <w:tc>
+          <w:tcPr/>
+          <w:p>
+            <w:pPr>
+              <w:pStyle w:val="Compact"/>
+            </w:pPr>
+            <w:r>
+              <w:t xml:space="preserve">0.52</w:t>
+            </w:r>
+          </w:p>
+        </w:tc>
+        <w:tc>
+          <w:tcPr/>
+          <w:p>
+            <w:pPr>
+              <w:pStyle w:val="Compact"/>
+            </w:pPr>
+            <w:r>
+              <w:t xml:space="preserve">0.56</w:t>
+            </w:r>
+          </w:p>
+        </w:tc>
+        <w:tc>
+          <w:tcPr/>
+          <w:p>
+            <w:pPr>
+              <w:pStyle w:val="Compact"/>
+            </w:pPr>
+            <w:r>
+              <w:t xml:space="preserve">0.83</w:t>
+            </w:r>
+          </w:p>
+        </w:tc>
+        <w:tc>
+          <w:tcPr/>
+          <w:p>
+            <w:pPr>
+              <w:pStyle w:val="Compact"/>
+            </w:pPr>
+            <w:r>
+              <w:t xml:space="preserve">0.81</w:t>
+            </w:r>
+          </w:p>
+        </w:tc>
+        <w:tc>
+          <w:tcPr/>
+          <w:p>
+            <w:pPr>
+              <w:pStyle w:val="Compact"/>
+            </w:pPr>
+            <w:r>
+              <w:t xml:space="preserve">0.88</w:t>
+            </w:r>
+          </w:p>
+        </w:tc>
+      </w:tr>
+      <w:tr>
+        <w:tc>
+          <w:tcPr/>
+          <w:p>
+            <w:pPr>
+              <w:pStyle w:val="Compact"/>
+            </w:pPr>
+            <w:r>
+              <w:t xml:space="preserve">WCC, l = 2° + zero scan</w:t>
+            </w:r>
+          </w:p>
+        </w:tc>
+        <w:tc>
+          <w:tcPr/>
+          <w:p>
+            <w:pPr>
+              <w:pStyle w:val="Compact"/>
+            </w:pPr>
+            <w:r>
+              <w:t xml:space="preserve">0.47</w:t>
+            </w:r>
+          </w:p>
+        </w:tc>
+        <w:tc>
+          <w:tcPr/>
+          <w:p>
+            <w:pPr>
+              <w:pStyle w:val="Compact"/>
+            </w:pPr>
+            <w:r>
+              <w:t xml:space="preserve">0.50</w:t>
+            </w:r>
+          </w:p>
+        </w:tc>
+        <w:tc>
+          <w:tcPr/>
+          <w:p>
+            <w:pPr>
+              <w:pStyle w:val="Compact"/>
+            </w:pPr>
+            <w:r>
+              <w:t xml:space="preserve">0.44</w:t>
+            </w:r>
+          </w:p>
+        </w:tc>
+        <w:tc>
+          <w:tcPr/>
+          <w:p>
+            <w:pPr>
+              <w:pStyle w:val="Compact"/>
+            </w:pPr>
+            <w:r>
+              <w:t xml:space="preserve">0.71</w:t>
+            </w:r>
+          </w:p>
+        </w:tc>
+        <w:tc>
+          <w:tcPr/>
+          <w:p>
+            <w:pPr>
+              <w:pStyle w:val="Compact"/>
+            </w:pPr>
+            <w:r>
+              <w:t xml:space="preserve">0.69</w:t>
+            </w:r>
+          </w:p>
+        </w:tc>
+        <w:tc>
+          <w:tcPr/>
+          <w:p>
+            <w:pPr>
+              <w:pStyle w:val="Compact"/>
+            </w:pPr>
+            <w:r>
+              <w:t xml:space="preserve">0.77</w:t>
+            </w:r>
+          </w:p>
+        </w:tc>
+      </w:tr>
+      <w:tr>
+        <w:tc>
+          <w:tcPr/>
+          <w:p>
+            <w:pPr>
+              <w:pStyle w:val="Compact"/>
+            </w:pPr>
+            <w:r>
+              <w:t xml:space="preserve">Cosine + zero scan</w:t>
+            </w:r>
+          </w:p>
+        </w:tc>
+        <w:tc>
+          <w:tcPr/>
+          <w:p>
+            <w:pPr>
+              <w:pStyle w:val="Compact"/>
+            </w:pPr>
+            <w:r>
+              <w:t xml:space="preserve">0.40</w:t>
+            </w:r>
+          </w:p>
+        </w:tc>
+        <w:tc>
+          <w:tcPr/>
+          <w:p>
+            <w:pPr>
+              <w:pStyle w:val="Compact"/>
+            </w:pPr>
+            <w:r>
+              <w:t xml:space="preserve">0.44</w:t>
+            </w:r>
+          </w:p>
+        </w:tc>
+        <w:tc>
+          <w:tcPr/>
+          <w:p>
+            <w:pPr>
+              <w:pStyle w:val="Compact"/>
+            </w:pPr>
+            <w:r>
+              <w:t xml:space="preserve">0.58</w:t>
+            </w:r>
+          </w:p>
+        </w:tc>
+        <w:tc>
+          <w:tcPr/>
+          <w:p>
+            <w:pPr>
+              <w:pStyle w:val="Compact"/>
+            </w:pPr>
+            <w:r>
+              <w:t xml:space="preserve">0.84</w:t>
+            </w:r>
+          </w:p>
+        </w:tc>
+        <w:tc>
+          <w:tcPr/>
+          <w:p>
+            <w:pPr>
+              <w:pStyle w:val="Compact"/>
+            </w:pPr>
+            <w:r>
+              <w:t xml:space="preserve">0.88</w:t>
+            </w:r>
+          </w:p>
+        </w:tc>
+        <w:tc>
+          <w:tcPr/>
+          <w:p>
+            <w:pPr>
+              <w:pStyle w:val="Compact"/>
+            </w:pPr>
+            <w:r>
+              <w:t xml:space="preserve">0.89</w:t>
+            </w:r>
+          </w:p>
+        </w:tc>
+      </w:tr>
+      <w:tr>
+        <w:tc>
+          <w:tcPr/>
+          <w:p>
+            <w:pPr>
+              <w:pStyle w:val="Compact"/>
+            </w:pPr>
+            <w:r>
+              <w:t xml:space="preserve">Pearson, fixed grid</w:t>
+            </w:r>
+          </w:p>
+        </w:tc>
+        <w:tc>
+          <w:tcPr/>
+          <w:p>
+            <w:pPr>
+              <w:pStyle w:val="Compact"/>
+            </w:pPr>
+            <w:r>
+              <w:t xml:space="preserve">0.30</w:t>
+            </w:r>
+          </w:p>
+        </w:tc>
+        <w:tc>
+          <w:tcPr/>
+          <w:p>
+            <w:pPr>
+              <w:pStyle w:val="Compact"/>
+            </w:pPr>
+            <w:r>
+              <w:t xml:space="preserve">0.27</w:t>
+            </w:r>
+          </w:p>
+        </w:tc>
+        <w:tc>
+          <w:tcPr/>
+          <w:p>
+            <w:pPr>
+              <w:pStyle w:val="Compact"/>
+            </w:pPr>
+            <w:r>
+              <w:t xml:space="preserve">0.26</w:t>
+            </w:r>
+          </w:p>
+        </w:tc>
+        <w:tc>
+          <w:tcPr/>
+          <w:p>
+            <w:pPr>
+              <w:pStyle w:val="Compact"/>
+            </w:pPr>
+            <w:r>
+              <w:t xml:space="preserve">0.83</w:t>
+            </w:r>
+          </w:p>
+        </w:tc>
+        <w:tc>
+          <w:tcPr/>
+          <w:p>
+            <w:pPr>
+              <w:pStyle w:val="Compact"/>
+            </w:pPr>
+            <w:r>
+              <w:t xml:space="preserve">0.81</w:t>
+            </w:r>
+          </w:p>
+        </w:tc>
+        <w:tc>
+          <w:tcPr/>
+          <w:p>
+            <w:pPr>
+              <w:pStyle w:val="Compact"/>
+            </w:pPr>
+            <w:r>
+              <w:t xml:space="preserve">0.87</w:t>
+            </w:r>
+          </w:p>
+        </w:tc>
+      </w:tr>
+      <w:tr>
+        <w:tc>
+          <w:tcPr/>
+          <w:p>
+            <w:pPr>
+              <w:pStyle w:val="Compact"/>
+            </w:pPr>
+            <w:r>
+              <w:t xml:space="preserve">Learned embedding</w:t>
+            </w:r>
+          </w:p>
+        </w:tc>
+        <w:tc>
+          <w:tcPr/>
+          <w:p>
+            <w:pPr>
+              <w:pStyle w:val="Compact"/>
+            </w:pPr>
+            <w:r>
+              <w:t xml:space="preserve">0.00</w:t>
+            </w:r>
+          </w:p>
+        </w:tc>
+        <w:tc>
+          <w:tcPr/>
+          <w:p>
+            <w:pPr>
+              <w:pStyle w:val="Compact"/>
+            </w:pPr>
+            <w:r>
+              <w:t xml:space="preserve">0.00</w:t>
+            </w:r>
+          </w:p>
+        </w:tc>
+        <w:tc>
+          <w:tcPr/>
+          <w:p>
+            <w:pPr>
+              <w:pStyle w:val="Compact"/>
+            </w:pPr>
+            <w:r>
+              <w:t xml:space="preserve">0.00</w:t>
+            </w:r>
+          </w:p>
+        </w:tc>
+        <w:tc>
+          <w:tcPr/>
+          <w:p>
+            <w:pPr>
+              <w:pStyle w:val="Compact"/>
+            </w:pPr>
+            <w:r>
+              <w:t xml:space="preserve">0.02</w:t>
+            </w:r>
+          </w:p>
+        </w:tc>
+        <w:tc>
+          <w:tcPr/>
+          <w:p>
+            <w:pPr>
+              <w:pStyle w:val="Compact"/>
+            </w:pPr>
+            <w:r>
+              <w:t xml:space="preserve">0.00</w:t>
+            </w:r>
+          </w:p>
+        </w:tc>
+        <w:tc>
+          <w:tcPr/>
+          <w:p>
+            <w:pPr>
+              <w:pStyle w:val="Compact"/>
+            </w:pPr>
+            <w:r>
+              <w:t xml:space="preserve">0.02</w:t>
+            </w:r>
+          </w:p>
+        </w:tc>
+      </w:tr>
+    </w:tbl>
+    <w:bookmarkEnd w:id="51"/>
+    <w:bookmarkEnd w:id="52"/>
+    <w:bookmarkStart w:id="53" w:name="discussion"/>
     <w:p>
       <w:pPr>
         <w:pStyle w:val="Heading2"/>
@@ -4263,13 +6027,13 @@
         <w:t xml:space="preserve"> </w:t>
       </w:r>
       <w:r>
-        <w:t xml:space="preserve">about 0.5 when the reference is an independent single-crystal structure, reached by strain-tolerant scores</w:t>
-      </w:r>
-      <w:r>
-        <w:t xml:space="preserve"> </w:t>
-      </w:r>
-      <w:r>
-        <w:t xml:space="preserve">(ln q scan, WCC), and of 0.83–0.87 when the pattern’s own powder-study entry is in the library, where even</w:t>
+        <w:t xml:space="preserve">about 0.5 when the reference is an independent single-crystal structure, reached by the strain-tolerant</w:t>
+      </w:r>
+      <w:r>
+        <w:t xml:space="preserve"> </w:t>
+      </w:r>
+      <w:r>
+        <w:t xml:space="preserve">WCC and ln q scans and by a variable-cell re-rank, and of 0.83–0.87 when the pattern’s own powder-study entry is in the library, where even</w:t>
       </w:r>
       <w:r>
         <w:t xml:space="preserve"> </w:t>
@@ -4299,7 +6063,13 @@
         <w:t xml:space="preserve"> </w:t>
       </w:r>
       <w:r>
-        <w:t xml:space="preserve">determination. The benchmark released with this paper supports all five.</w:t>
+        <w:t xml:space="preserve">determination. The benchmark released with this paper supports all five, and its open replica lets them be</w:t>
+      </w:r>
+      <w:r>
+        <w:t xml:space="preserve"> </w:t>
+      </w:r>
+      <w:r>
+        <w:t xml:space="preserve">checked without a CSD licence.</w:t>
       </w:r>
     </w:p>
     <w:p>
@@ -4329,19 +6099,31 @@
         <w:t xml:space="preserve"> </w:t>
       </w:r>
       <w:r>
-        <w:t xml:space="preserve">needs about 0.5 s per query for fixed-grid Pearson, about 30 s for a zero scan and about 8 min for the ln q</w:t>
-      </w:r>
-      <w:r>
-        <w:t xml:space="preserve"> </w:t>
-      </w:r>
-      <w:r>
-        <w:t xml:space="preserve">scan. On one GPU, all five classical scores of 8,188 patterns against the full library took 761 s. Speed</w:t>
-      </w:r>
-      <w:r>
-        <w:t xml:space="preserve"> </w:t>
-      </w:r>
-      <w:r>
-        <w:t xml:space="preserve">only matters once accuracy does, and a shortlist from this model loses most correct entries (Section 4.5).</w:t>
+        <w:t xml:space="preserve">needs about 0.4 s per query for fixed-grid Pearson, about 20 s for a zero scan and about 6 min for the ln q</w:t>
+      </w:r>
+      <w:r>
+        <w:t xml:space="preserve"> </w:t>
+      </w:r>
+      <w:r>
+        <w:t xml:space="preserve">scan. On one GPU, all five classical scores of 8,188 patterns against the full library took 761 s, and the</w:t>
+      </w:r>
+      <w:r>
+        <w:t xml:space="preserve"> </w:t>
+      </w:r>
+      <w:r>
+        <w:t xml:space="preserve">corrected ln q scan alone 405 s. The variable-cell re-rank is much slower: a median of 2.2 CPU-minutes per</w:t>
+      </w:r>
+      <w:r>
+        <w:t xml:space="preserve"> </w:t>
+      </w:r>
+      <w:r>
+        <w:t xml:space="preserve">comparison and about 400 CPU-hours for the 2,950 comparisons of 59 shortlists. Speed only matters once</w:t>
+      </w:r>
+      <w:r>
+        <w:t xml:space="preserve"> </w:t>
+      </w:r>
+      <w:r>
+        <w:t xml:space="preserve">accuracy does, and a shortlist from this model loses most correct entries (Section 4.5).</w:t>
       </w:r>
     </w:p>
     <w:p>
@@ -4371,61 +6153,76 @@
         <w:t xml:space="preserve"> </w:t>
       </w:r>
       <w:r>
-        <w:t xml:space="preserve">more than about 1 %; variable-cell comparison</w:t>
-      </w:r>
-      <w:hyperlink w:anchor="ref-mayo2023vcxpwdf">
+        <w:t xml:space="preserve">more than about 1 %. The published variable-cell method</w:t>
+      </w:r>
+      <w:hyperlink w:anchor="ref-oterodelaroza2024vcgpwdf">
         <w:r>
           <w:rPr>
             <w:rStyle w:val="Hyperlink"/>
             <w:vertAlign w:val="superscript"/>
           </w:rPr>
-          <w:t xml:space="preserve">21</w:t>
+          <w:t xml:space="preserve">22</w:t>
         </w:r>
       </w:hyperlink>
       <w:r>
-        <w:rPr>
-          <w:vertAlign w:val="superscript"/>
-        </w:rPr>
-        <w:t xml:space="preserve">,</w:t>
-      </w:r>
-      <w:hyperlink w:anchor="ref-oterodelaroza2024vcgpwdf">
+        <w:t xml:space="preserve"> </w:t>
+      </w:r>
+      <w:r>
+        <w:t xml:space="preserve">recovers few of these</w:t>
+      </w:r>
+      <w:r>
+        <w:t xml:space="preserve"> </w:t>
+      </w:r>
+      <w:r>
+        <w:t xml:space="preserve">cases and is bounded by the shortlist it re-ranks, so the case stays open for classical methods too, and it is</w:t>
+      </w:r>
+      <w:r>
+        <w:t xml:space="preserve"> </w:t>
+      </w:r>
+      <w:r>
+        <w:t xml:space="preserve">where a learned method could show its value. For the learned model, the failure is the transfer from</w:t>
+      </w:r>
+      <w:r>
+        <w:t xml:space="preserve"> </w:t>
+      </w:r>
+      <w:r>
+        <w:t xml:space="preserve">simulated to measured patterns, not the size of the library, and it survives a retrain with every</w:t>
+      </w:r>
+      <w:r>
+        <w:t xml:space="preserve"> </w:t>
+      </w:r>
+      <w:r>
+        <w:t xml:space="preserve">measurement effect we could simulate. Full-profile generative models have shown the same sensitivity to how</w:t>
+      </w:r>
+      <w:r>
+        <w:t xml:space="preserve"> </w:t>
+      </w:r>
+      <w:r>
+        <w:t xml:space="preserve">realistic the training patterns are</w:t>
+      </w:r>
+      <w:hyperlink w:anchor="ref-segal2026xrdiff">
         <w:r>
           <w:rPr>
             <w:rStyle w:val="Hyperlink"/>
             <w:vertAlign w:val="superscript"/>
           </w:rPr>
-          <w:t xml:space="preserve">22</w:t>
+          <w:t xml:space="preserve">9</w:t>
         </w:r>
       </w:hyperlink>
       <w:r>
-        <w:t xml:space="preserve"> </w:t>
-      </w:r>
-      <w:r>
-        <w:t xml:space="preserve">is the natural</w:t>
-      </w:r>
-      <w:r>
-        <w:t xml:space="preserve"> </w:t>
-      </w:r>
-      <w:r>
-        <w:t xml:space="preserve">classical next step, and we did not test it. For the learned model, the failure is the transfer from</w:t>
-      </w:r>
-      <w:r>
-        <w:t xml:space="preserve"> </w:t>
-      </w:r>
-      <w:r>
-        <w:t xml:space="preserve">simulated to measured patterns, not the size of the library. A learned method aimed at that transfer, for</w:t>
-      </w:r>
-      <w:r>
-        <w:t xml:space="preserve"> </w:t>
-      </w:r>
-      <w:r>
-        <w:t xml:space="preserve">example trained on more realistic simulations or adapted with measured patterns, is the more promising use</w:t>
-      </w:r>
-      <w:r>
-        <w:t xml:space="preserve"> </w:t>
-      </w:r>
-      <w:r>
-        <w:t xml:space="preserve">of learning than a stand-alone retriever.</w:t>
+        <w:t xml:space="preserve">. A learned method aimed at that transfer, for example</w:t>
+      </w:r>
+      <w:r>
+        <w:t xml:space="preserve"> </w:t>
+      </w:r>
+      <w:r>
+        <w:t xml:space="preserve">one adapted with measured patterns rather than with more simulated effects, is the more promising use of</w:t>
+      </w:r>
+      <w:r>
+        <w:t xml:space="preserve"> </w:t>
+      </w:r>
+      <w:r>
+        <w:t xml:space="preserve">learning than a stand-alone retriever.</w:t>
       </w:r>
     </w:p>
     <w:p>
@@ -4443,43 +6240,61 @@
         <w:t xml:space="preserve"> </w:t>
       </w:r>
       <w:r>
-        <w:t xml:space="preserve">We tested one learned model, trained once; another architecture, loss or training</w:t>
-      </w:r>
-      <w:r>
-        <w:t xml:space="preserve"> </w:t>
-      </w:r>
-      <w:r>
-        <w:t xml:space="preserve">simulation could do better, and our conclusions about learning are about this model. The benchmark has 123</w:t>
-      </w:r>
-      <w:r>
-        <w:t xml:space="preserve"> </w:t>
-      </w:r>
-      <w:r>
-        <w:t xml:space="preserve">compounds, all organic, from one contributor to opXRD, and most patterns are the data their own entry was</w:t>
-      </w:r>
-      <w:r>
-        <w:t xml:space="preserve"> </w:t>
-      </w:r>
-      <w:r>
-        <w:t xml:space="preserve">refined against; the single-crystal set has 30 compounds, so its intervals are wide. The library is</w:t>
-      </w:r>
-      <w:r>
-        <w:t xml:space="preserve"> </w:t>
-      </w:r>
-      <w:r>
-        <w:t xml:space="preserve">simulated with one peak profile, without Debye–Waller factors or Kα2, and disordered entries only</w:t>
-      </w:r>
-      <w:r>
-        <w:t xml:space="preserve"> </w:t>
-      </w:r>
-      <w:r>
-        <w:t xml:space="preserve">approximately; the measured patterns keep Kα2 and have a simple background removal. The ln q score is</w:t>
-      </w:r>
-      <w:r>
-        <w:t xml:space="preserve"> </w:t>
-      </w:r>
-      <w:r>
-        <w:t xml:space="preserve">handicapped by its offset grid (Section 3.2). The correct answers rely on packing similarity, set aside</w:t>
+        <w:t xml:space="preserve">We tested one learned model, trained once and retrained once with a more realistic</w:t>
+      </w:r>
+      <w:r>
+        <w:t xml:space="preserve"> </w:t>
+      </w:r>
+      <w:r>
+        <w:t xml:space="preserve">simulation; another architecture, loss or training strategy could do better, and our conclusions about</w:t>
+      </w:r>
+      <w:r>
+        <w:t xml:space="preserve"> </w:t>
+      </w:r>
+      <w:r>
+        <w:t xml:space="preserve">learning are about this model. The benchmark has 123 compounds, all organic, from one contributor to opXRD,</w:t>
+      </w:r>
+      <w:r>
+        <w:t xml:space="preserve"> </w:t>
+      </w:r>
+      <w:r>
+        <w:t xml:space="preserve">and most patterns are the data their own entry was refined against; the single-crystal set has 30</w:t>
+      </w:r>
+      <w:r>
+        <w:t xml:space="preserve"> </w:t>
+      </w:r>
+      <w:r>
+        <w:t xml:space="preserve">compounds, so its intervals are wide, and that of the open replica only 9. The main library is simulated</w:t>
+      </w:r>
+      <w:r>
+        <w:t xml:space="preserve"> </w:t>
+      </w:r>
+      <w:r>
+        <w:t xml:space="preserve">with one peak profile and without Debye–Waller factors or Kα2; a package of such changes moved little</w:t>
+      </w:r>
+      <w:r>
+        <w:t xml:space="preserve"> </w:t>
+      </w:r>
+      <w:r>
+        <w:t xml:space="preserve">(Section 4.6) but does not exhaust them, and disordered entries are simulated only approximately. The</w:t>
+      </w:r>
+      <w:r>
+        <w:t xml:space="preserve"> </w:t>
+      </w:r>
+      <w:r>
+        <w:t xml:space="preserve">measured patterns have a simple background removal. The zero scans use fixed offset grids (0.02°, and</w:t>
+      </w:r>
+      <w:r>
+        <w:t xml:space="preserve"> </w:t>
+      </w:r>
+      <w:r>
+        <w:t xml:space="preserve">0.04° for the ln q scan), and the variable-cell re-rank covers a shortlist of 50 with a 4-hour limit per</w:t>
+      </w:r>
+      <w:r>
+        <w:t xml:space="preserve"> </w:t>
+      </w:r>
+      <w:r>
+        <w:t xml:space="preserve">comparison. The correct answers rely on packing similarity, set aside</w:t>
       </w:r>
       <w:r>
         <w:t xml:space="preserve"> </w:t>
@@ -4505,15 +6320,15 @@
             <w:rStyle w:val="Hyperlink"/>
             <w:vertAlign w:val="superscript"/>
           </w:rPr>
-          <w:t xml:space="preserve">39</w:t>
+          <w:t xml:space="preserve">42</w:t>
         </w:r>
       </w:hyperlink>
       <w:r>
         <w:t xml:space="preserve">.</w:t>
       </w:r>
     </w:p>
-    <w:bookmarkEnd w:id="45"/>
-    <w:bookmarkStart w:id="46" w:name="conclusions"/>
+    <w:bookmarkEnd w:id="53"/>
+    <w:bookmarkStart w:id="54" w:name="conclusions"/>
     <w:p>
       <w:pPr>
         <w:pStyle w:val="Heading2"/>
@@ -4539,19 +6354,37 @@
         <w:t xml:space="preserve"> </w:t>
       </w:r>
       <w:r>
-        <w:t xml:space="preserve">matching; with independent single-crystal references, 0.00 against 0.30–0.50, where shift- and</w:t>
-      </w:r>
-      <w:r>
-        <w:t xml:space="preserve"> </w:t>
-      </w:r>
-      <w:r>
-        <w:t xml:space="preserve">strain-tolerant scores beat fixed-grid correlation. The model retrieves clean simulated patterns of the</w:t>
-      </w:r>
-      <w:r>
-        <w:t xml:space="preserve"> </w:t>
-      </w:r>
-      <w:r>
-        <w:t xml:space="preserve">same targets, so its failure lies in the step from simulated to measured data. The hard open case is a</w:t>
+        <w:t xml:space="preserve">matching; with independent single-crystal references, 0.00 against 0.30–0.50, and 0.50 for a</w:t>
+      </w:r>
+      <w:r>
+        <w:t xml:space="preserve"> </w:t>
+      </w:r>
+      <w:r>
+        <w:t xml:space="preserve">variable-cell re-rank, which is not resolved from the ln q scan it re-ranks. The model retrieves clean</w:t>
+      </w:r>
+      <w:r>
+        <w:t xml:space="preserve"> </w:t>
+      </w:r>
+      <w:r>
+        <w:t xml:space="preserve">simulated patterns of the same targets, and a retrain with the measurement effects we could simulate fixes</w:t>
+      </w:r>
+      <w:r>
+        <w:t xml:space="preserve"> </w:t>
+      </w:r>
+      <w:r>
+        <w:t xml:space="preserve">those effects in simulation but not on the measured patterns, so its failure lies in a part of the step</w:t>
+      </w:r>
+      <w:r>
+        <w:t xml:space="preserve"> </w:t>
+      </w:r>
+      <w:r>
+        <w:t xml:space="preserve">from simulated to measured data that we did not model. A more realistic library and an open replica built</w:t>
+      </w:r>
+      <w:r>
+        <w:t xml:space="preserve"> </w:t>
+      </w:r>
+      <w:r>
+        <w:t xml:space="preserve">from the COD give the same picture. The hard open case is a</w:t>
       </w:r>
       <w:r>
         <w:t xml:space="preserve"> </w:t>
@@ -4572,8 +6405,8 @@
         <w:t xml:space="preserve">on measured data.</w:t>
       </w:r>
     </w:p>
-    <w:bookmarkEnd w:id="46"/>
-    <w:bookmarkStart w:id="47" w:name="data-availability"/>
+    <w:bookmarkEnd w:id="54"/>
+    <w:bookmarkStart w:id="55" w:name="data-availability"/>
     <w:p>
       <w:pPr>
         <w:pStyle w:val="Heading2"/>
@@ -4605,25 +6438,37 @@
         <w:t xml:space="preserve"> </w:t>
       </w:r>
       <w:r>
-        <w:t xml:space="preserve">every score and correction, including the learned model’s; the scripts that build the library from a CSD</w:t>
-      </w:r>
-      <w:r>
-        <w:t xml:space="preserve"> </w:t>
-      </w:r>
-      <w:r>
-        <w:t xml:space="preserve">installation, compute the scores (CPU and GPU) and regenerate every table and figure; and</w:t>
-      </w:r>
-      <w:r>
-        <w:t xml:space="preserve"> </w:t>
-      </w:r>
-      <w:r>
-        <w:t xml:space="preserve">results/paper_numbers.json, from which every number in this article is checked by scripts/verify_claims.py.</w:t>
-      </w:r>
-      <w:r>
-        <w:t xml:space="preserve"> </w:t>
-      </w:r>
-      <w:r>
-        <w:t xml:space="preserve">The measured patterns are from opXRD</w:t>
+        <w:t xml:space="preserve">every score and correction, including the learned model’s and the variable-cell re-rank’s; the scripts</w:t>
+      </w:r>
+      <w:r>
+        <w:t xml:space="preserve"> </w:t>
+      </w:r>
+      <w:r>
+        <w:t xml:space="preserve">that build the library from a CSD installation, compute the scores (CPU and GPU) and regenerate every table</w:t>
+      </w:r>
+      <w:r>
+        <w:t xml:space="preserve"> </w:t>
+      </w:r>
+      <w:r>
+        <w:t xml:space="preserve">and figure; and results/paper_numbers.json, from which every number in this article is checked by</w:t>
+      </w:r>
+      <w:r>
+        <w:t xml:space="preserve"> </w:t>
+      </w:r>
+      <w:r>
+        <w:t xml:space="preserve">scripts/verify_claims.py. The open replica of Section 2.6 is included in full: the COD identifiers, the</w:t>
+      </w:r>
+      <w:r>
+        <w:t xml:space="preserve"> </w:t>
+      </w:r>
+      <w:r>
+        <w:t xml:space="preserve">simulated COD library, its answer sets and the ranks of every score, from which Section 4.7 and Table 2 can</w:t>
+      </w:r>
+      <w:r>
+        <w:t xml:space="preserve"> </w:t>
+      </w:r>
+      <w:r>
+        <w:t xml:space="preserve">be reproduced without a CSD licence. The measured patterns are from opXRD</w:t>
       </w:r>
       <w:hyperlink w:anchor="ref-opxrd2025zenodo">
         <w:r>
@@ -4638,29 +6483,29 @@
         <w:t xml:space="preserve"> </w:t>
       </w:r>
       <w:r>
-        <w:t xml:space="preserve">under CC BY 4.0. CSD structures and the simulated</w:t>
-      </w:r>
-      <w:r>
-        <w:t xml:space="preserve"> </w:t>
-      </w:r>
-      <w:r>
-        <w:t xml:space="preserve">patterns derived from them cannot be redistributed; users with a CSD licence regenerate them from the</w:t>
-      </w:r>
-      <w:r>
-        <w:t xml:space="preserve"> </w:t>
-      </w:r>
-      <w:r>
-        <w:t xml:space="preserve">refcode lists. The model checkpoint was trained on CSD data and is not distributed. [Representative open</w:t>
-      </w:r>
-      <w:r>
-        <w:t xml:space="preserve"> </w:t>
-      </w:r>
-      <w:r>
-        <w:t xml:space="preserve">dataset: FRANK]</w:t>
-      </w:r>
-    </w:p>
-    <w:bookmarkEnd w:id="47"/>
-    <w:bookmarkStart w:id="48" w:name="author-contributions"/>
+        <w:t xml:space="preserve">under CC BY</w:t>
+      </w:r>
+      <w:r>
+        <w:t xml:space="preserve"> </w:t>
+      </w:r>
+      <w:r>
+        <w:t xml:space="preserve">4.0, and the COD structures are CC0. CSD structures and the simulated patterns derived from them cannot be</w:t>
+      </w:r>
+      <w:r>
+        <w:t xml:space="preserve"> </w:t>
+      </w:r>
+      <w:r>
+        <w:t xml:space="preserve">redistributed; users with a CSD licence regenerate them from the refcode lists. The model checkpoints, the</w:t>
+      </w:r>
+      <w:r>
+        <w:t xml:space="preserve"> </w:t>
+      </w:r>
+      <w:r>
+        <w:t xml:space="preserve">original and the retrained one, were trained on CSD data and are not distributed.</w:t>
+      </w:r>
+    </w:p>
+    <w:bookmarkEnd w:id="55"/>
+    <w:bookmarkStart w:id="56" w:name="author-contributions"/>
     <w:p>
       <w:pPr>
         <w:pStyle w:val="Heading2"/>
@@ -4677,8 +6522,8 @@
         <w:t xml:space="preserve">F. C. conceived the study, wrote the code, ran the computations and analysis, and wrote the manuscript.</w:t>
       </w:r>
     </w:p>
-    <w:bookmarkEnd w:id="48"/>
-    <w:bookmarkStart w:id="49" w:name="conflicts-of-interest"/>
+    <w:bookmarkEnd w:id="56"/>
+    <w:bookmarkStart w:id="57" w:name="conflicts-of-interest"/>
     <w:p>
       <w:pPr>
         <w:pStyle w:val="Heading2"/>
@@ -4695,8 +6540,8 @@
         <w:t xml:space="preserve">There are no conflicts to declare.</w:t>
       </w:r>
     </w:p>
-    <w:bookmarkEnd w:id="49"/>
-    <w:bookmarkStart w:id="50" w:name="acknowledgements"/>
+    <w:bookmarkEnd w:id="57"/>
+    <w:bookmarkStart w:id="58" w:name="acknowledgements"/>
     <w:p>
       <w:pPr>
         <w:pStyle w:val="Heading2"/>
@@ -4731,8 +6576,8 @@
         <w:t xml:space="preserve">sectors. [AI-use statement: FRANK, in his own words; RSC asks for it here.]</w:t>
       </w:r>
     </w:p>
-    <w:bookmarkEnd w:id="50"/>
-    <w:bookmarkStart w:id="118" w:name="notes-and-references"/>
+    <w:bookmarkEnd w:id="58"/>
+    <w:bookmarkStart w:id="132" w:name="notes-and-references"/>
     <w:p>
       <w:pPr>
         <w:pStyle w:val="Heading2"/>
@@ -4741,8 +6586,8 @@
         <w:t xml:space="preserve">Notes and references</w:t>
       </w:r>
     </w:p>
-    <w:bookmarkStart w:id="117" w:name="refs"/>
-    <w:bookmarkStart w:id="52" w:name="ref-gatesrector2019pdf"/>
+    <w:bookmarkStart w:id="131" w:name="refs"/>
+    <w:bookmarkStart w:id="60" w:name="ref-gatesrector2019pdf"/>
     <w:p>
       <w:pPr>
         <w:pStyle w:val="Bibliography"/>
@@ -4756,7 +6601,7 @@
       <w:r>
         <w:t xml:space="preserve">	</w:t>
       </w:r>
-      <w:hyperlink r:id="rId51">
+      <w:hyperlink r:id="rId59">
         <w:r>
           <w:rPr>
             <w:rStyle w:val="Hyperlink"/>
@@ -4808,8 +6653,8 @@
         <w:t xml:space="preserve">.</w:t>
       </w:r>
     </w:p>
-    <w:bookmarkEnd w:id="52"/>
-    <w:bookmarkStart w:id="54" w:name="ref-groom2016csd"/>
+    <w:bookmarkEnd w:id="60"/>
+    <w:bookmarkStart w:id="62" w:name="ref-groom2016csd"/>
     <w:p>
       <w:pPr>
         <w:pStyle w:val="Bibliography"/>
@@ -4823,7 +6668,7 @@
       <w:r>
         <w:t xml:space="preserve">	</w:t>
       </w:r>
-      <w:hyperlink r:id="rId53">
+      <w:hyperlink r:id="rId61">
         <w:r>
           <w:rPr>
             <w:rStyle w:val="Hyperlink"/>
@@ -4875,8 +6720,8 @@
         <w:t xml:space="preserve">.</w:t>
       </w:r>
     </w:p>
-    <w:bookmarkEnd w:id="54"/>
-    <w:bookmarkStart w:id="56" w:name="ref-bauer2001ritonavir"/>
+    <w:bookmarkEnd w:id="62"/>
+    <w:bookmarkStart w:id="64" w:name="ref-bauer2001ritonavir"/>
     <w:p>
       <w:pPr>
         <w:pStyle w:val="Bibliography"/>
@@ -4890,7 +6735,7 @@
       <w:r>
         <w:t xml:space="preserve">	</w:t>
       </w:r>
-      <w:hyperlink r:id="rId55">
+      <w:hyperlink r:id="rId63">
         <w:r>
           <w:rPr>
             <w:rStyle w:val="Hyperlink"/>
@@ -4942,8 +6787,8 @@
         <w:t xml:space="preserve">.</w:t>
       </w:r>
     </w:p>
-    <w:bookmarkEnd w:id="56"/>
-    <w:bookmarkStart w:id="58" w:name="ref-cruzcabeza2015polymorph"/>
+    <w:bookmarkEnd w:id="64"/>
+    <w:bookmarkStart w:id="66" w:name="ref-cruzcabeza2015polymorph"/>
     <w:p>
       <w:pPr>
         <w:pStyle w:val="Bibliography"/>
@@ -4957,7 +6802,7 @@
       <w:r>
         <w:t xml:space="preserve">	</w:t>
       </w:r>
-      <w:hyperlink r:id="rId57">
+      <w:hyperlink r:id="rId65">
         <w:r>
           <w:rPr>
             <w:rStyle w:val="Hyperlink"/>
@@ -5009,8 +6854,8 @@
         <w:t xml:space="preserve">.</w:t>
       </w:r>
     </w:p>
-    <w:bookmarkEnd w:id="58"/>
-    <w:bookmarkStart w:id="60" w:name="ref-lai2025xtalnet"/>
+    <w:bookmarkEnd w:id="66"/>
+    <w:bookmarkStart w:id="68" w:name="ref-lai2025xtalnet"/>
     <w:p>
       <w:pPr>
         <w:pStyle w:val="Bibliography"/>
@@ -5024,7 +6869,7 @@
       <w:r>
         <w:t xml:space="preserve">	</w:t>
       </w:r>
-      <w:hyperlink r:id="rId59">
+      <w:hyperlink r:id="rId67">
         <w:r>
           <w:rPr>
             <w:rStyle w:val="Hyperlink"/>
@@ -5076,8 +6921,8 @@
         <w:t xml:space="preserve">.</w:t>
       </w:r>
     </w:p>
-    <w:bookmarkEnd w:id="60"/>
-    <w:bookmarkStart w:id="62" w:name="ref-xu2026xccp"/>
+    <w:bookmarkEnd w:id="68"/>
+    <w:bookmarkStart w:id="70" w:name="ref-xu2026xccp"/>
     <w:p>
       <w:pPr>
         <w:pStyle w:val="Bibliography"/>
@@ -5091,7 +6936,7 @@
       <w:r>
         <w:t xml:space="preserve">	</w:t>
       </w:r>
-      <w:hyperlink r:id="rId61">
+      <w:hyperlink r:id="rId69">
         <w:r>
           <w:rPr>
             <w:rStyle w:val="Hyperlink"/>
@@ -5143,8 +6988,8 @@
         <w:t xml:space="preserve">.</w:t>
       </w:r>
     </w:p>
-    <w:bookmarkEnd w:id="62"/>
-    <w:bookmarkStart w:id="63" w:name="ref-yang2026pxtal"/>
+    <w:bookmarkEnd w:id="70"/>
+    <w:bookmarkStart w:id="71" w:name="ref-yang2026pxtal"/>
     <w:p>
       <w:pPr>
         <w:pStyle w:val="Bibliography"/>
@@ -5175,8 +7020,8 @@
         <w:t xml:space="preserve">, 2026, arXiv:2610.10653.</w:t>
       </w:r>
     </w:p>
-    <w:bookmarkEnd w:id="63"/>
-    <w:bookmarkStart w:id="64" w:name="ref-johansen2026decifer"/>
+    <w:bookmarkEnd w:id="71"/>
+    <w:bookmarkStart w:id="72" w:name="ref-johansen2026decifer"/>
     <w:p>
       <w:pPr>
         <w:pStyle w:val="Bibliography"/>
@@ -5207,8 +7052,8 @@
         <w:t xml:space="preserve">, 2026, https://openreview.net/forum?id=LftFQ35l47.</w:t>
       </w:r>
     </w:p>
-    <w:bookmarkEnd w:id="64"/>
-    <w:bookmarkStart w:id="65" w:name="ref-segal2026xrdiff"/>
+    <w:bookmarkEnd w:id="72"/>
+    <w:bookmarkStart w:id="73" w:name="ref-segal2026xrdiff"/>
     <w:p>
       <w:pPr>
         <w:pStyle w:val="Bibliography"/>
@@ -5239,8 +7084,8 @@
         <w:t xml:space="preserve">, 2026, arXiv:2606.14003.</w:t>
       </w:r>
     </w:p>
-    <w:bookmarkEnd w:id="65"/>
-    <w:bookmarkStart w:id="67" w:name="ref-johansen2026realworld"/>
+    <w:bookmarkEnd w:id="73"/>
+    <w:bookmarkStart w:id="75" w:name="ref-johansen2026realworld"/>
     <w:p>
       <w:pPr>
         <w:pStyle w:val="Bibliography"/>
@@ -5254,7 +7099,7 @@
       <w:r>
         <w:t xml:space="preserve">	</w:t>
       </w:r>
-      <w:hyperlink r:id="rId66">
+      <w:hyperlink r:id="rId74">
         <w:r>
           <w:rPr>
             <w:rStyle w:val="Hyperlink"/>
@@ -5306,8 +7151,8 @@
         <w:t xml:space="preserve">.</w:t>
       </w:r>
     </w:p>
-    <w:bookmarkEnd w:id="67"/>
-    <w:bookmarkStart w:id="68" w:name="ref-srivastava2026realbind"/>
+    <w:bookmarkEnd w:id="75"/>
+    <w:bookmarkStart w:id="76" w:name="ref-srivastava2026realbind"/>
     <w:p>
       <w:pPr>
         <w:pStyle w:val="Bibliography"/>
@@ -5338,8 +7183,8 @@
         <w:t xml:space="preserve">, 2026, DOI: 10.26434/chemrxiv.15009668/v2.</w:t>
       </w:r>
     </w:p>
-    <w:bookmarkEnd w:id="68"/>
-    <w:bookmarkStart w:id="69" w:name="ref-lange2024smolnet"/>
+    <w:bookmarkEnd w:id="76"/>
+    <w:bookmarkStart w:id="77" w:name="ref-lange2024smolnet"/>
     <w:p>
       <w:pPr>
         <w:pStyle w:val="Bibliography"/>
@@ -5370,8 +7215,8 @@
         <w:t xml:space="preserve">, 2024, arXiv:2411.03308.</w:t>
       </w:r>
     </w:p>
-    <w:bookmarkEnd w:id="69"/>
-    <w:bookmarkStart w:id="70" w:name="ref-wang2026matdiffract"/>
+    <w:bookmarkEnd w:id="77"/>
+    <w:bookmarkStart w:id="78" w:name="ref-wang2026matdiffract"/>
     <w:p>
       <w:pPr>
         <w:pStyle w:val="Bibliography"/>
@@ -5402,8 +7247,8 @@
         <w:t xml:space="preserve">, 2026, arXiv:2607.20880.</w:t>
       </w:r>
     </w:p>
-    <w:bookmarkEnd w:id="70"/>
-    <w:bookmarkStart w:id="72" w:name="ref-schopmans2023synthetic"/>
+    <w:bookmarkEnd w:id="78"/>
+    <w:bookmarkStart w:id="80" w:name="ref-schopmans2023synthetic"/>
     <w:p>
       <w:pPr>
         <w:pStyle w:val="Bibliography"/>
@@ -5417,7 +7262,7 @@
       <w:r>
         <w:t xml:space="preserve">	</w:t>
       </w:r>
-      <w:hyperlink r:id="rId71">
+      <w:hyperlink r:id="rId79">
         <w:r>
           <w:rPr>
             <w:rStyle w:val="Hyperlink"/>
@@ -5469,8 +7314,8 @@
         <w:t xml:space="preserve">.</w:t>
       </w:r>
     </w:p>
-    <w:bookmarkEnd w:id="72"/>
-    <w:bookmarkStart w:id="74" w:name="ref-ferraridacrema2019progress"/>
+    <w:bookmarkEnd w:id="80"/>
+    <w:bookmarkStart w:id="82" w:name="ref-ferraridacrema2019progress"/>
     <w:p>
       <w:pPr>
         <w:pStyle w:val="Bibliography"/>
@@ -5484,7 +7329,7 @@
       <w:r>
         <w:t xml:space="preserve">	</w:t>
       </w:r>
-      <w:hyperlink r:id="rId73">
+      <w:hyperlink r:id="rId81">
         <w:r>
           <w:rPr>
             <w:rStyle w:val="Hyperlink"/>
@@ -5516,8 +7361,8 @@
         <w:t xml:space="preserve">.</w:t>
       </w:r>
     </w:p>
-    <w:bookmarkEnd w:id="74"/>
-    <w:bookmarkStart w:id="76" w:name="ref-musgrave2020reality"/>
+    <w:bookmarkEnd w:id="82"/>
+    <w:bookmarkStart w:id="84" w:name="ref-musgrave2020reality"/>
     <w:p>
       <w:pPr>
         <w:pStyle w:val="Bibliography"/>
@@ -5531,7 +7376,7 @@
       <w:r>
         <w:t xml:space="preserve">	</w:t>
       </w:r>
-      <w:hyperlink r:id="rId75">
+      <w:hyperlink r:id="rId83">
         <w:r>
           <w:rPr>
             <w:rStyle w:val="Hyperlink"/>
@@ -5563,8 +7408,8 @@
         <w:t xml:space="preserve">.</w:t>
       </w:r>
     </w:p>
-    <w:bookmarkEnd w:id="76"/>
-    <w:bookmarkStart w:id="78" w:name="ref-bushuiev2024massspecgym"/>
+    <w:bookmarkEnd w:id="84"/>
+    <w:bookmarkStart w:id="86" w:name="ref-bushuiev2024massspecgym"/>
     <w:p>
       <w:pPr>
         <w:pStyle w:val="Bibliography"/>
@@ -5578,7 +7423,7 @@
       <w:r>
         <w:t xml:space="preserve">	</w:t>
       </w:r>
-      <w:hyperlink r:id="rId77">
+      <w:hyperlink r:id="rId85">
         <w:r>
           <w:rPr>
             <w:rStyle w:val="Hyperlink"/>
@@ -5610,8 +7455,8 @@
         <w:t xml:space="preserve">.</w:t>
       </w:r>
     </w:p>
-    <w:bookmarkEnd w:id="78"/>
-    <w:bookmarkStart w:id="79" w:name="ref-cai2026urtc"/>
+    <w:bookmarkEnd w:id="86"/>
+    <w:bookmarkStart w:id="87" w:name="ref-cai2026urtc"/>
     <w:p>
       <w:pPr>
         <w:pStyle w:val="Bibliography"/>
@@ -5642,8 +7487,8 @@
         <w:t xml:space="preserve">, 2026.</w:t>
       </w:r>
     </w:p>
-    <w:bookmarkEnd w:id="79"/>
-    <w:bookmarkStart w:id="81" w:name="ref-degelder2001wcc"/>
+    <w:bookmarkEnd w:id="87"/>
+    <w:bookmarkStart w:id="89" w:name="ref-degelder2001wcc"/>
     <w:p>
       <w:pPr>
         <w:pStyle w:val="Bibliography"/>
@@ -5657,7 +7502,7 @@
       <w:r>
         <w:t xml:space="preserve">	</w:t>
       </w:r>
-      <w:hyperlink r:id="rId80">
+      <w:hyperlink r:id="rId88">
         <w:r>
           <w:rPr>
             <w:rStyle w:val="Hyperlink"/>
@@ -5709,8 +7554,8 @@
         <w:t xml:space="preserve">.</w:t>
       </w:r>
     </w:p>
-    <w:bookmarkEnd w:id="81"/>
-    <w:bookmarkStart w:id="83" w:name="ref-mayo2022vcpwdf"/>
+    <w:bookmarkEnd w:id="89"/>
+    <w:bookmarkStart w:id="91" w:name="ref-mayo2022vcpwdf"/>
     <w:p>
       <w:pPr>
         <w:pStyle w:val="Bibliography"/>
@@ -5724,7 +7569,7 @@
       <w:r>
         <w:t xml:space="preserve">	</w:t>
       </w:r>
-      <w:hyperlink r:id="rId82">
+      <w:hyperlink r:id="rId90">
         <w:r>
           <w:rPr>
             <w:rStyle w:val="Hyperlink"/>
@@ -5776,8 +7621,8 @@
         <w:t xml:space="preserve">.</w:t>
       </w:r>
     </w:p>
-    <w:bookmarkEnd w:id="83"/>
-    <w:bookmarkStart w:id="85" w:name="ref-mayo2023vcxpwdf"/>
+    <w:bookmarkEnd w:id="91"/>
+    <w:bookmarkStart w:id="93" w:name="ref-mayo2023vcxpwdf"/>
     <w:p>
       <w:pPr>
         <w:pStyle w:val="Bibliography"/>
@@ -5791,7 +7636,7 @@
       <w:r>
         <w:t xml:space="preserve">	</w:t>
       </w:r>
-      <w:hyperlink r:id="rId84">
+      <w:hyperlink r:id="rId92">
         <w:r>
           <w:rPr>
             <w:rStyle w:val="Hyperlink"/>
@@ -5843,8 +7688,8 @@
         <w:t xml:space="preserve">.</w:t>
       </w:r>
     </w:p>
-    <w:bookmarkEnd w:id="85"/>
-    <w:bookmarkStart w:id="87" w:name="ref-oterodelaroza2024vcgpwdf"/>
+    <w:bookmarkEnd w:id="93"/>
+    <w:bookmarkStart w:id="95" w:name="ref-oterodelaroza2024vcgpwdf"/>
     <w:p>
       <w:pPr>
         <w:pStyle w:val="Bibliography"/>
@@ -5858,7 +7703,7 @@
       <w:r>
         <w:t xml:space="preserve">	</w:t>
       </w:r>
-      <w:hyperlink r:id="rId86">
+      <w:hyperlink r:id="rId94">
         <w:r>
           <w:rPr>
             <w:rStyle w:val="Hyperlink"/>
@@ -5910,8 +7755,8 @@
         <w:t xml:space="preserve">.</w:t>
       </w:r>
     </w:p>
-    <w:bookmarkEnd w:id="87"/>
-    <w:bookmarkStart w:id="89" w:name="ref-hollarek2025opxrd"/>
+    <w:bookmarkEnd w:id="95"/>
+    <w:bookmarkStart w:id="97" w:name="ref-hollarek2025opxrd"/>
     <w:p>
       <w:pPr>
         <w:pStyle w:val="Bibliography"/>
@@ -5925,7 +7770,7 @@
       <w:r>
         <w:t xml:space="preserve">	</w:t>
       </w:r>
-      <w:hyperlink r:id="rId88">
+      <w:hyperlink r:id="rId96">
         <w:r>
           <w:rPr>
             <w:rStyle w:val="Hyperlink"/>
@@ -5977,8 +7822,8 @@
         <w:t xml:space="preserve">.</w:t>
       </w:r>
     </w:p>
-    <w:bookmarkEnd w:id="89"/>
-    <w:bookmarkStart w:id="91" w:name="ref-chisholm2005compack"/>
+    <w:bookmarkEnd w:id="97"/>
+    <w:bookmarkStart w:id="99" w:name="ref-chisholm2005compack"/>
     <w:p>
       <w:pPr>
         <w:pStyle w:val="Bibliography"/>
@@ -5992,7 +7837,7 @@
       <w:r>
         <w:t xml:space="preserve">	</w:t>
       </w:r>
-      <w:hyperlink r:id="rId90">
+      <w:hyperlink r:id="rId98">
         <w:r>
           <w:rPr>
             <w:rStyle w:val="Hyperlink"/>
@@ -6044,8 +7889,8 @@
         <w:t xml:space="preserve">.</w:t>
       </w:r>
     </w:p>
-    <w:bookmarkEnd w:id="91"/>
-    <w:bookmarkStart w:id="93" w:name="ref-macrae2008mercury"/>
+    <w:bookmarkEnd w:id="99"/>
+    <w:bookmarkStart w:id="101" w:name="ref-macrae2008mercury"/>
     <w:p>
       <w:pPr>
         <w:pStyle w:val="Bibliography"/>
@@ -6059,7 +7904,7 @@
       <w:r>
         <w:t xml:space="preserve">	</w:t>
       </w:r>
-      <w:hyperlink r:id="rId92">
+      <w:hyperlink r:id="rId100">
         <w:r>
           <w:rPr>
             <w:rStyle w:val="Hyperlink"/>
@@ -6111,8 +7956,8 @@
         <w:t xml:space="preserve">.</w:t>
       </w:r>
     </w:p>
-    <w:bookmarkEnd w:id="93"/>
-    <w:bookmarkStart w:id="95" w:name="ref-radovanovic2010hubs"/>
+    <w:bookmarkEnd w:id="101"/>
+    <w:bookmarkStart w:id="103" w:name="ref-radovanovic2010hubs"/>
     <w:p>
       <w:pPr>
         <w:pStyle w:val="Bibliography"/>
@@ -6126,7 +7971,7 @@
       <w:r>
         <w:t xml:space="preserve">	</w:t>
       </w:r>
-      <w:hyperlink r:id="rId94">
+      <w:hyperlink r:id="rId102">
         <w:r>
           <w:rPr>
             <w:rStyle w:val="Hyperlink"/>
@@ -6178,8 +8023,8 @@
         <w:t xml:space="preserve">.</w:t>
       </w:r>
     </w:p>
-    <w:bookmarkEnd w:id="95"/>
-    <w:bookmarkStart w:id="96" w:name="ref-opxrd2025zenodo"/>
+    <w:bookmarkEnd w:id="103"/>
+    <w:bookmarkStart w:id="104" w:name="ref-opxrd2025zenodo"/>
     <w:p>
       <w:pPr>
         <w:pStyle w:val="Bibliography"/>
@@ -6210,8 +8055,8 @@
         <w:t xml:space="preserve">, 2025, DOI: 10.5281/zenodo.15298026.</w:t>
       </w:r>
     </w:p>
-    <w:bookmarkEnd w:id="96"/>
-    <w:bookmarkStart w:id="98" w:name="ref-rietveld1969"/>
+    <w:bookmarkEnd w:id="104"/>
+    <w:bookmarkStart w:id="106" w:name="ref-rietveld1969"/>
     <w:p>
       <w:pPr>
         <w:pStyle w:val="Bibliography"/>
@@ -6225,7 +8070,7 @@
       <w:r>
         <w:t xml:space="preserve">	</w:t>
       </w:r>
-      <w:hyperlink r:id="rId97">
+      <w:hyperlink r:id="rId105">
         <w:r>
           <w:rPr>
             <w:rStyle w:val="Hyperlink"/>
@@ -6277,8 +8122,8 @@
         <w:t xml:space="preserve">.</w:t>
       </w:r>
     </w:p>
-    <w:bookmarkEnd w:id="98"/>
-    <w:bookmarkStart w:id="100" w:name="ref-ong2013pymatgen"/>
+    <w:bookmarkEnd w:id="106"/>
+    <w:bookmarkStart w:id="108" w:name="ref-ong2013pymatgen"/>
     <w:p>
       <w:pPr>
         <w:pStyle w:val="Bibliography"/>
@@ -6292,7 +8137,7 @@
       <w:r>
         <w:t xml:space="preserve">	</w:t>
       </w:r>
-      <w:hyperlink r:id="rId99">
+      <w:hyperlink r:id="rId107">
         <w:r>
           <w:rPr>
             <w:rStyle w:val="Hyperlink"/>
@@ -6344,8 +8189,8 @@
         <w:t xml:space="preserve">.</w:t>
       </w:r>
     </w:p>
-    <w:bookmarkEnd w:id="100"/>
-    <w:bookmarkStart w:id="102" w:name="ref-caglioti1958"/>
+    <w:bookmarkEnd w:id="108"/>
+    <w:bookmarkStart w:id="110" w:name="ref-caglioti1958"/>
     <w:p>
       <w:pPr>
         <w:pStyle w:val="Bibliography"/>
@@ -6359,7 +8204,7 @@
       <w:r>
         <w:t xml:space="preserve">	</w:t>
       </w:r>
-      <w:hyperlink r:id="rId101">
+      <w:hyperlink r:id="rId109">
         <w:r>
           <w:rPr>
             <w:rStyle w:val="Hyperlink"/>
@@ -6411,8 +8256,8 @@
         <w:t xml:space="preserve">.</w:t>
       </w:r>
     </w:p>
-    <w:bookmarkEnd w:id="102"/>
-    <w:bookmarkStart w:id="104" w:name="ref-field2007cluster"/>
+    <w:bookmarkEnd w:id="110"/>
+    <w:bookmarkStart w:id="112" w:name="ref-field2007cluster"/>
     <w:p>
       <w:pPr>
         <w:pStyle w:val="Bibliography"/>
@@ -6426,7 +8271,7 @@
       <w:r>
         <w:t xml:space="preserve">	</w:t>
       </w:r>
-      <w:hyperlink r:id="rId103">
+      <w:hyperlink r:id="rId111">
         <w:r>
           <w:rPr>
             <w:rStyle w:val="Hyperlink"/>
@@ -6478,14 +8323,148 @@
         <w:t xml:space="preserve">.</w:t>
       </w:r>
     </w:p>
-    <w:bookmarkEnd w:id="104"/>
-    <w:bookmarkStart w:id="105" w:name="ref-paszke2019pytorch"/>
+    <w:bookmarkEnd w:id="112"/>
+    <w:bookmarkStart w:id="114" w:name="ref-grazulis2009cod"/>
     <w:p>
       <w:pPr>
         <w:pStyle w:val="Bibliography"/>
       </w:pPr>
       <w:r>
         <w:t xml:space="preserve">32</w:t>
+      </w:r>
+      <w:r>
+        <w:t xml:space="preserve"> </w:t>
+      </w:r>
+      <w:r>
+        <w:t xml:space="preserve">	</w:t>
+      </w:r>
+      <w:hyperlink r:id="rId113">
+        <w:r>
+          <w:rPr>
+            <w:rStyle w:val="Hyperlink"/>
+          </w:rPr>
+          <w:t xml:space="preserve">S. Gražulis, D. Chateigner, R. T. Downs, A. F. T. Yokochi, M. Quirós, L. Lutterotti, E. Manakova, J. Butkus, P. Moeck and A. Le Bail,</w:t>
+        </w:r>
+        <w:r>
+          <w:rPr>
+            <w:rStyle w:val="Hyperlink"/>
+          </w:rPr>
+          <w:t xml:space="preserve"> </w:t>
+        </w:r>
+        <w:r>
+          <w:rPr>
+            <w:rStyle w:val="Hyperlink"/>
+            <w:i/>
+            <w:iCs/>
+          </w:rPr>
+          <w:t xml:space="preserve">J. Appl. Crystallogr.</w:t>
+        </w:r>
+        <w:r>
+          <w:rPr>
+            <w:rStyle w:val="Hyperlink"/>
+          </w:rPr>
+          <w:t xml:space="preserve">, 2009,</w:t>
+        </w:r>
+        <w:r>
+          <w:rPr>
+            <w:rStyle w:val="Hyperlink"/>
+          </w:rPr>
+          <w:t xml:space="preserve"> </w:t>
+        </w:r>
+        <w:r>
+          <w:rPr>
+            <w:rStyle w:val="Hyperlink"/>
+            <w:b/>
+            <w:bCs/>
+          </w:rPr>
+          <w:t xml:space="preserve">42</w:t>
+        </w:r>
+        <w:r>
+          <w:rPr>
+            <w:rStyle w:val="Hyperlink"/>
+          </w:rPr>
+          <w:t xml:space="preserve">, 726–729</w:t>
+        </w:r>
+      </w:hyperlink>
+      <w:r>
+        <w:t xml:space="preserve">.</w:t>
+      </w:r>
+    </w:p>
+    <w:bookmarkEnd w:id="114"/>
+    <w:bookmarkStart w:id="116" w:name="ref-vaitkus2021cod"/>
+    <w:p>
+      <w:pPr>
+        <w:pStyle w:val="Bibliography"/>
+      </w:pPr>
+      <w:r>
+        <w:t xml:space="preserve">33</w:t>
+      </w:r>
+      <w:r>
+        <w:t xml:space="preserve"> </w:t>
+      </w:r>
+      <w:r>
+        <w:t xml:space="preserve">	</w:t>
+      </w:r>
+      <w:hyperlink r:id="rId115">
+        <w:r>
+          <w:rPr>
+            <w:rStyle w:val="Hyperlink"/>
+          </w:rPr>
+          <w:t xml:space="preserve">A. Vaitkus, A. Merkys and S. Gražulis,</w:t>
+        </w:r>
+        <w:r>
+          <w:rPr>
+            <w:rStyle w:val="Hyperlink"/>
+          </w:rPr>
+          <w:t xml:space="preserve"> </w:t>
+        </w:r>
+        <w:r>
+          <w:rPr>
+            <w:rStyle w:val="Hyperlink"/>
+            <w:i/>
+            <w:iCs/>
+          </w:rPr>
+          <w:t xml:space="preserve">J. Appl. Crystallogr.</w:t>
+        </w:r>
+        <w:r>
+          <w:rPr>
+            <w:rStyle w:val="Hyperlink"/>
+          </w:rPr>
+          <w:t xml:space="preserve">, 2021,</w:t>
+        </w:r>
+        <w:r>
+          <w:rPr>
+            <w:rStyle w:val="Hyperlink"/>
+          </w:rPr>
+          <w:t xml:space="preserve"> </w:t>
+        </w:r>
+        <w:r>
+          <w:rPr>
+            <w:rStyle w:val="Hyperlink"/>
+            <w:b/>
+            <w:bCs/>
+          </w:rPr>
+          <w:t xml:space="preserve">54</w:t>
+        </w:r>
+        <w:r>
+          <w:rPr>
+            <w:rStyle w:val="Hyperlink"/>
+          </w:rPr>
+          <w:t xml:space="preserve">, 661–672</w:t>
+        </w:r>
+      </w:hyperlink>
+      <w:r>
+        <w:t xml:space="preserve">.</w:t>
+      </w:r>
+    </w:p>
+    <w:bookmarkEnd w:id="116"/>
+    <w:bookmarkStart w:id="117" w:name="ref-paszke2019pytorch"/>
+    <w:p>
+      <w:pPr>
+        <w:pStyle w:val="Bibliography"/>
+      </w:pPr>
+      <w:r>
+        <w:t xml:space="preserve">34</w:t>
       </w:r>
       <w:r>
         <w:t xml:space="preserve"> </w:t>
@@ -6510,14 +8489,14 @@
         <w:t xml:space="preserve">, 2019.</w:t>
       </w:r>
     </w:p>
-    <w:bookmarkEnd w:id="105"/>
-    <w:bookmarkStart w:id="106" w:name="ref-oord2018cpc"/>
+    <w:bookmarkEnd w:id="117"/>
+    <w:bookmarkStart w:id="118" w:name="ref-oord2018cpc"/>
     <w:p>
       <w:pPr>
         <w:pStyle w:val="Bibliography"/>
       </w:pPr>
       <w:r>
-        <w:t xml:space="preserve">33</w:t>
+        <w:t xml:space="preserve">35</w:t>
       </w:r>
       <w:r>
         <w:t xml:space="preserve"> </w:t>
@@ -6542,14 +8521,14 @@
         <w:t xml:space="preserve">, 2018, arXiv:1807.03748.</w:t>
       </w:r>
     </w:p>
-    <w:bookmarkEnd w:id="106"/>
-    <w:bookmarkStart w:id="107" w:name="ref-radford2021clip"/>
+    <w:bookmarkEnd w:id="118"/>
+    <w:bookmarkStart w:id="119" w:name="ref-radford2021clip"/>
     <w:p>
       <w:pPr>
         <w:pStyle w:val="Bibliography"/>
       </w:pPr>
       <w:r>
-        <w:t xml:space="preserve">34</w:t>
+        <w:t xml:space="preserve">36</w:t>
       </w:r>
       <w:r>
         <w:t xml:space="preserve"> </w:t>
@@ -6574,14 +8553,14 @@
         <w:t xml:space="preserve">, 2021, vol. 139, pp. 8748–8763.</w:t>
       </w:r>
     </w:p>
-    <w:bookmarkEnd w:id="107"/>
-    <w:bookmarkStart w:id="109" w:name="ref-dollase1986"/>
+    <w:bookmarkEnd w:id="119"/>
+    <w:bookmarkStart w:id="121" w:name="ref-dollase1986"/>
     <w:p>
       <w:pPr>
         <w:pStyle w:val="Bibliography"/>
       </w:pPr>
       <w:r>
-        <w:t xml:space="preserve">35</w:t>
+        <w:t xml:space="preserve">37</w:t>
       </w:r>
       <w:r>
         <w:t xml:space="preserve"> </w:t>
@@ -6589,7 +8568,7 @@
       <w:r>
         <w:t xml:space="preserve">	</w:t>
       </w:r>
-      <w:hyperlink r:id="rId108">
+      <w:hyperlink r:id="rId120">
         <w:r>
           <w:rPr>
             <w:rStyle w:val="Hyperlink"/>
@@ -6641,14 +8620,14 @@
         <w:t xml:space="preserve">.</w:t>
       </w:r>
     </w:p>
-    <w:bookmarkEnd w:id="109"/>
-    <w:bookmarkStart w:id="111" w:name="ref-conneau2018muse"/>
+    <w:bookmarkEnd w:id="121"/>
+    <w:bookmarkStart w:id="123" w:name="ref-conneau2018muse"/>
     <w:p>
       <w:pPr>
         <w:pStyle w:val="Bibliography"/>
       </w:pPr>
       <w:r>
-        <w:t xml:space="preserve">36</w:t>
+        <w:t xml:space="preserve">38</w:t>
       </w:r>
       <w:r>
         <w:t xml:space="preserve"> </w:t>
@@ -6656,7 +8635,7 @@
       <w:r>
         <w:t xml:space="preserve">	</w:t>
       </w:r>
-      <w:hyperlink r:id="rId110">
+      <w:hyperlink r:id="rId122">
         <w:r>
           <w:rPr>
             <w:rStyle w:val="Hyperlink"/>
@@ -6688,14 +8667,14 @@
         <w:t xml:space="preserve">.</w:t>
       </w:r>
     </w:p>
-    <w:bookmarkEnd w:id="111"/>
-    <w:bookmarkStart w:id="113" w:name="ref-schnitzer2012mp"/>
+    <w:bookmarkEnd w:id="123"/>
+    <w:bookmarkStart w:id="125" w:name="ref-schnitzer2012mp"/>
     <w:p>
       <w:pPr>
         <w:pStyle w:val="Bibliography"/>
       </w:pPr>
       <w:r>
-        <w:t xml:space="preserve">37</w:t>
+        <w:t xml:space="preserve">39</w:t>
       </w:r>
       <w:r>
         <w:t xml:space="preserve"> </w:t>
@@ -6703,7 +8682,7 @@
       <w:r>
         <w:t xml:space="preserve">	</w:t>
       </w:r>
-      <w:hyperlink r:id="rId112">
+      <w:hyperlink r:id="rId124">
         <w:r>
           <w:rPr>
             <w:rStyle w:val="Hyperlink"/>
@@ -6755,14 +8734,14 @@
         <w:t xml:space="preserve">.</w:t>
       </w:r>
     </w:p>
-    <w:bookmarkEnd w:id="113"/>
-    <w:bookmarkStart w:id="115" w:name="ref-bond2021thermal"/>
+    <w:bookmarkEnd w:id="125"/>
+    <w:bookmarkStart w:id="127" w:name="ref-bond2021thermal"/>
     <w:p>
       <w:pPr>
         <w:pStyle w:val="Bibliography"/>
       </w:pPr>
       <w:r>
-        <w:t xml:space="preserve">38</w:t>
+        <w:t xml:space="preserve">40</w:t>
       </w:r>
       <w:r>
         <w:t xml:space="preserve"> </w:t>
@@ -6770,7 +8749,7 @@
       <w:r>
         <w:t xml:space="preserve">	</w:t>
       </w:r>
-      <w:hyperlink r:id="rId114">
+      <w:hyperlink r:id="rId126">
         <w:r>
           <w:rPr>
             <w:rStyle w:val="Hyperlink"/>
@@ -6822,14 +8801,81 @@
         <w:t xml:space="preserve">.</w:t>
       </w:r>
     </w:p>
-    <w:bookmarkEnd w:id="115"/>
-    <w:bookmarkStart w:id="116" w:name="ref-glick2025csp"/>
+    <w:bookmarkEnd w:id="127"/>
+    <w:bookmarkStart w:id="129" w:name="ref-oterodelaroza2014critic2"/>
     <w:p>
       <w:pPr>
         <w:pStyle w:val="Bibliography"/>
       </w:pPr>
       <w:r>
-        <w:t xml:space="preserve">39</w:t>
+        <w:t xml:space="preserve">41</w:t>
+      </w:r>
+      <w:r>
+        <w:t xml:space="preserve"> </w:t>
+      </w:r>
+      <w:r>
+        <w:t xml:space="preserve">	</w:t>
+      </w:r>
+      <w:hyperlink r:id="rId128">
+        <w:r>
+          <w:rPr>
+            <w:rStyle w:val="Hyperlink"/>
+          </w:rPr>
+          <w:t xml:space="preserve">A. Otero-de-la-Roza, E. R. Johnson and V. Luaña,</w:t>
+        </w:r>
+        <w:r>
+          <w:rPr>
+            <w:rStyle w:val="Hyperlink"/>
+          </w:rPr>
+          <w:t xml:space="preserve"> </w:t>
+        </w:r>
+        <w:r>
+          <w:rPr>
+            <w:rStyle w:val="Hyperlink"/>
+            <w:i/>
+            <w:iCs/>
+          </w:rPr>
+          <w:t xml:space="preserve">Comput. Phys. Commun.</w:t>
+        </w:r>
+        <w:r>
+          <w:rPr>
+            <w:rStyle w:val="Hyperlink"/>
+          </w:rPr>
+          <w:t xml:space="preserve">, 2014,</w:t>
+        </w:r>
+        <w:r>
+          <w:rPr>
+            <w:rStyle w:val="Hyperlink"/>
+          </w:rPr>
+          <w:t xml:space="preserve"> </w:t>
+        </w:r>
+        <w:r>
+          <w:rPr>
+            <w:rStyle w:val="Hyperlink"/>
+            <w:b/>
+            <w:bCs/>
+          </w:rPr>
+          <w:t xml:space="preserve">185</w:t>
+        </w:r>
+        <w:r>
+          <w:rPr>
+            <w:rStyle w:val="Hyperlink"/>
+          </w:rPr>
+          <w:t xml:space="preserve">, 1007–1018</w:t>
+        </w:r>
+      </w:hyperlink>
+      <w:r>
+        <w:t xml:space="preserve">.</w:t>
+      </w:r>
+    </w:p>
+    <w:bookmarkEnd w:id="129"/>
+    <w:bookmarkStart w:id="130" w:name="ref-glick2025csp"/>
+    <w:p>
+      <w:pPr>
+        <w:pStyle w:val="Bibliography"/>
+      </w:pPr>
+      <w:r>
+        <w:t xml:space="preserve">42</w:t>
       </w:r>
       <w:r>
         <w:t xml:space="preserve"> </w:t>
@@ -6854,9 +8900,9 @@
         <w:t xml:space="preserve">, 2025, arXiv:2507.16218.</w:t>
       </w:r>
     </w:p>
-    <w:bookmarkEnd w:id="116"/>
-    <w:bookmarkEnd w:id="117"/>
-    <w:bookmarkEnd w:id="118"/>
+    <w:bookmarkEnd w:id="130"/>
+    <w:bookmarkEnd w:id="131"/>
+    <w:bookmarkEnd w:id="132"/>
     <w:sectPr>
       <w:footnotePr>
         <w:numRestart w:val="eachSect"/>

</xml_diff>

<commit_message>
Referee pass done: control finished (own entry rank 1 for 29/36 ambient vs 1/22 pressure-series patterns), corrected disordered injections, control ranked against wrong entries only, Fig. 5 caption; verify 186/186, docx built; plan 13f + todo readouts
</commit_message>
<xml_diff>
--- a/paper/dd/manuscript.docx
+++ b/paper/dd/manuscript.docx
@@ -82,7 +82,7 @@
         <w:t xml:space="preserve"> </w:t>
       </w:r>
       <w:r>
-        <w:t xml:space="preserve">123 organic compounds from the open opXRD database. Correct answers are fixed by packing similarity, and</w:t>
+        <w:t xml:space="preserve">123 organic compounds from the opXRD database. Correct answers are fixed by packing similarity, and</w:t>
       </w:r>
       <w:r>
         <w:t xml:space="preserve"> </w:t>
@@ -94,61 +94,67 @@
         <w:t xml:space="preserve"> </w:t>
       </w:r>
       <w:r>
-        <w:t xml:space="preserve">single-crystal determination, the realistic case, the classical scores reach a compound-weighted top-1 of</w:t>
-      </w:r>
-      <w:r>
-        <w:t xml:space="preserve"> </w:t>
-      </w:r>
-      <w:r>
-        <w:t xml:space="preserve">0.30–0.50 (30 compounds) and the model 0.00; a variable-cell re-rank (VC-GPWDF) reaches 0.50, not resolved</w:t>
-      </w:r>
-      <w:r>
-        <w:t xml:space="preserve"> </w:t>
-      </w:r>
-      <w:r>
-        <w:t xml:space="preserve">from the ln q scan it re-ranks (0.45). When the pattern’s own powder-study entry also counts, the classical</w:t>
-      </w:r>
-      <w:r>
-        <w:t xml:space="preserve"> </w:t>
-      </w:r>
-      <w:r>
-        <w:t xml:space="preserve">scores reach 0.71–0.87 and the model 0.02. Yet on clean simulated patterns of the same</w:t>
-      </w:r>
-      <w:r>
-        <w:t xml:space="preserve"> </w:t>
-      </w:r>
-      <w:r>
-        <w:t xml:space="preserve">targets its top-1 is 0.21 and its median rank 5. Retrained with the measurement effects we could simulate,</w:t>
-      </w:r>
-      <w:r>
-        <w:t xml:space="preserve"> </w:t>
-      </w:r>
-      <w:r>
-        <w:t xml:space="preserve">it handles them in simulation but stays at 0.02 on measured patterns, so the gap lies in effects we did not</w:t>
-      </w:r>
-      <w:r>
-        <w:t xml:space="preserve"> </w:t>
-      </w:r>
-      <w:r>
-        <w:t xml:space="preserve">model. In 34 simulated degradation conditions, each of the shift-tolerant classical scores beats it in at</w:t>
-      </w:r>
-      <w:r>
-        <w:t xml:space="preserve"> </w:t>
-      </w:r>
-      <w:r>
-        <w:t xml:space="preserve">least 32. A more realistic library, a hubness correction (CSLS, +0.01 to +0.04, indistinguishable from</w:t>
-      </w:r>
-      <w:r>
-        <w:t xml:space="preserve"> </w:t>
-      </w:r>
-      <w:r>
-        <w:t xml:space="preserve">zero) and an open replica on the Crystallography Open Database change none of this. We release the</w:t>
-      </w:r>
-      <w:r>
-        <w:t xml:space="preserve"> </w:t>
-      </w:r>
-      <w:r>
-        <w:t xml:space="preserve">benchmark as code, refcode lists and the open replica.</w:t>
+        <w:t xml:space="preserve">single-crystal determination, the classical scores reach a compound-weighted top-1 of 0.30–0.50 (30</w:t>
+      </w:r>
+      <w:r>
+        <w:t xml:space="preserve"> </w:t>
+      </w:r>
+      <w:r>
+        <w:t xml:space="preserve">compounds) and the model 0.00; a variable-cell re-rank (VC-GPWDF) reaches 0.53, not resolved from the ln q</w:t>
+      </w:r>
+      <w:r>
+        <w:t xml:space="preserve"> </w:t>
+      </w:r>
+      <w:r>
+        <w:t xml:space="preserve">scan it re-ranks (0.45). Most failures involve references determined at other pressures or temperatures.</w:t>
+      </w:r>
+      <w:r>
+        <w:t xml:space="preserve"> </w:t>
+      </w:r>
+      <w:r>
+        <w:t xml:space="preserve">When the pattern’s own powder-study entry also counts, the classical scores reach 0.71–0.87 and the model</w:t>
+      </w:r>
+      <w:r>
+        <w:t xml:space="preserve"> </w:t>
+      </w:r>
+      <w:r>
+        <w:t xml:space="preserve">0.02. Yet on clean simulations of the same targets it reaches 0.27 (median rank 5). Retrained with</w:t>
+      </w:r>
+      <w:r>
+        <w:t xml:space="preserve"> </w:t>
+      </w:r>
+      <w:r>
+        <w:t xml:space="preserve">five modelled measurement effects, it handles them in simulation but stays at 0.02 on measured patterns, so</w:t>
+      </w:r>
+      <w:r>
+        <w:t xml:space="preserve"> </w:t>
+      </w:r>
+      <w:r>
+        <w:t xml:space="preserve">the gap lies in what our simulation does not reproduce. In 34 simulated degradation conditions, each</w:t>
+      </w:r>
+      <w:r>
+        <w:t xml:space="preserve"> </w:t>
+      </w:r>
+      <w:r>
+        <w:t xml:space="preserve">of the shift-tolerant classical scores beats it in at least 32. A more realistic library and a hubness</w:t>
+      </w:r>
+      <w:r>
+        <w:t xml:space="preserve"> </w:t>
+      </w:r>
+      <w:r>
+        <w:t xml:space="preserve">correction (CSLS) change none of this, and an open replica on</w:t>
+      </w:r>
+      <w:r>
+        <w:t xml:space="preserve"> </w:t>
+      </w:r>
+      <w:r>
+        <w:t xml:space="preserve">the Crystallography Open Database reproduces the any-same-form result. We release the benchmark as code,</w:t>
+      </w:r>
+      <w:r>
+        <w:t xml:space="preserve"> </w:t>
+      </w:r>
+      <w:r>
+        <w:t xml:space="preserve">refcode lists and the open replica.</w:t>
       </w:r>
     </w:p>
     <w:bookmarkEnd w:id="9"/>
@@ -1332,7 +1338,7 @@
         <w:t xml:space="preserve"> </w:t>
       </w:r>
       <w:r>
-        <w:t xml:space="preserve">headline.</w:t>
+        <w:t xml:space="preserve">headline; 22 of these patterns come from variable-pressure studies (Section 4.2).</w:t>
       </w:r>
     </w:p>
     <w:p>
@@ -1589,7 +1595,19 @@
         <w:t xml:space="preserve"> </w:t>
       </w:r>
       <w:r>
-        <w:t xml:space="preserve">compounds.</w:t>
+        <w:t xml:space="preserve">compounds. Our primary comparison is the learned model against the classical scores in compound-weighted</w:t>
+      </w:r>
+      <w:r>
+        <w:t xml:space="preserve"> </w:t>
+      </w:r>
+      <w:r>
+        <w:t xml:space="preserve">top-1. Comparisons among classical scores, and among the variants of Sections 3.5 and 3.7, are exploratory and</w:t>
+      </w:r>
+      <w:r>
+        <w:t xml:space="preserve"> </w:t>
+      </w:r>
+      <w:r>
+        <w:t xml:space="preserve">are not corrected for multiple comparisons.</w:t>
       </w:r>
     </w:p>
     <w:bookmarkEnd w:id="18"/>
@@ -1920,19 +1938,31 @@
         <w:t xml:space="preserve"> </w:t>
       </w:r>
       <w:r>
-        <w:t xml:space="preserve">absorbs a zero error exactly and a sample-displacement error, which varies as cos θ, approximately. For</w:t>
-      </w:r>
-      <w:r>
-        <w:t xml:space="preserve"> </w:t>
-      </w:r>
-      <w:r>
-        <w:t xml:space="preserve">converted synchrotron patterns a native zero error becomes a slightly angle-dependent shift on the Cu</w:t>
-      </w:r>
-      <w:r>
-        <w:t xml:space="preserve"> </w:t>
-      </w:r>
-      <w:r>
-        <w:t xml:space="preserve">axis.</w:t>
+        <w:t xml:space="preserve">absorbs a zero error exactly and a sample-displacement error, which varies as cos θ, approximately. For a</w:t>
+      </w:r>
+      <w:r>
+        <w:t xml:space="preserve"> </w:t>
+      </w:r>
+      <w:r>
+        <w:t xml:space="preserve">pattern converted from a short wavelength, a native zero error is magnified by about λ_Cu/λ (up to about</w:t>
+      </w:r>
+      <w:r>
+        <w:t xml:space="preserve"> </w:t>
+      </w:r>
+      <w:r>
+        <w:t xml:space="preserve">4.5 times) and becomes weakly angle-dependent on the Cu axis. Specimen transparency, which shifts peaks in</w:t>
+      </w:r>
+      <w:r>
+        <w:t xml:space="preserve"> </w:t>
+      </w:r>
+      <w:r>
+        <w:t xml:space="preserve">proportion to sin 2θ and is often the largest aberration for weakly absorbing organic samples in reflection</w:t>
+      </w:r>
+      <w:r>
+        <w:t xml:space="preserve"> </w:t>
+      </w:r>
+      <w:r>
+        <w:t xml:space="preserve">geometry, is not absorbed by a constant offset.</w:t>
       </w:r>
     </w:p>
     <w:p>
@@ -2067,7 +2097,13 @@
         <w:t xml:space="preserve"> </w:t>
       </w:r>
       <w:r>
-        <w:t xml:space="preserve">internal review, corrected them, and report the first version in the ESI.† The offset grid is still 0.04°, so on simulated</w:t>
+        <w:t xml:space="preserve">internal review, corrected them, and report the first version in the ESI.† The corrected version was</w:t>
+      </w:r>
+      <w:r>
+        <w:t xml:space="preserve"> </w:t>
+      </w:r>
+      <w:r>
+        <w:t xml:space="preserve">declared primary before it was scored; it lowers the single-crystal top-1 from 0.49 to 0.45 (ESI†). The offset grid is still 0.04°, so on simulated</w:t>
       </w:r>
       <w:r>
         <w:t xml:space="preserve"> </w:t>
@@ -2294,25 +2330,25 @@
         </w:r>
       </w:hyperlink>
       <w:r>
-        <w:t xml:space="preserve">, background and Poisson noise, but without Kα2. The checkpoint was chosen by in-batch</w:t>
-      </w:r>
-      <w:r>
-        <w:t xml:space="preserve"> </w:t>
-      </w:r>
-      <w:r>
-        <w:t xml:space="preserve">validation top-1. A measured pattern is scored against the library by the cosine between its pattern</w:t>
-      </w:r>
-      <w:r>
-        <w:t xml:space="preserve"> </w:t>
-      </w:r>
-      <w:r>
-        <w:t xml:space="preserve">embedding and each entry’s structure embedding. We also test the model as a shortlist, re-ranking its top</w:t>
-      </w:r>
-      <w:r>
-        <w:t xml:space="preserve"> </w:t>
-      </w:r>
-      <w:r>
-        <w:t xml:space="preserve">100 or 1,000 entries with a classical score. Further details are in the ESI.†</w:t>
+        <w:t xml:space="preserve">, background and Poisson noise, but without Kα2. The checkpoint was chosen by in-batch top-1 on</w:t>
+      </w:r>
+      <w:r>
+        <w:t xml:space="preserve"> </w:t>
+      </w:r>
+      <w:r>
+        <w:t xml:space="preserve">clean, unaugmented validation patterns. A measured pattern is scored against the library by the cosine</w:t>
+      </w:r>
+      <w:r>
+        <w:t xml:space="preserve"> </w:t>
+      </w:r>
+      <w:r>
+        <w:t xml:space="preserve">between its pattern embedding and each entry’s structure embedding. We also test the model as a shortlist,</w:t>
+      </w:r>
+      <w:r>
+        <w:t xml:space="preserve"> </w:t>
+      </w:r>
+      <w:r>
+        <w:t xml:space="preserve">re-ranking its top 100 or 1,000 entries with a classical score. Further details are in the ESI.†</w:t>
       </w:r>
     </w:p>
     <w:p>
@@ -2320,7 +2356,7 @@
         <w:pStyle w:val="BodyText"/>
       </w:pPr>
       <w:r>
-        <w:t xml:space="preserve">Three diagnostics probe the failure reported in Section 4.5. (i)</w:t>
+        <w:t xml:space="preserve">Three further diagnostics probe the failure reported in Section 4.5. (i)</w:t>
       </w:r>
       <w:r>
         <w:t xml:space="preserve"> </w:t>
@@ -2336,55 +2372,67 @@
         <w:t xml:space="preserve"> </w:t>
       </w:r>
       <w:r>
-        <w:t xml:space="preserve">Each pattern’s own</w:t>
-      </w:r>
-      <w:r>
-        <w:t xml:space="preserve"> </w:t>
-      </w:r>
-      <w:r>
-        <w:t xml:space="preserve">library entry is rendered cleanly and then with one effect of the measurement at a time, each estimated from</w:t>
-      </w:r>
-      <w:r>
-        <w:t xml:space="preserve"> </w:t>
-      </w:r>
-      <w:r>
-        <w:t xml:space="preserve">the measured pattern: its 2θ coverage, its peak width, Kα2 (lab Cu patterns), its own background followed by</w:t>
-      </w:r>
-      <w:r>
-        <w:t xml:space="preserve"> </w:t>
-      </w:r>
-      <w:r>
-        <w:t xml:space="preserve">the background subtraction of Section 3.1, noise at its noise level, and the zero offset that best aligns it</w:t>
-      </w:r>
-      <w:r>
-        <w:t xml:space="preserve"> </w:t>
-      </w:r>
-      <w:r>
-        <w:t xml:space="preserve">with its entry; then with all six, and with all six plus an overall Debye–Waller factor (B = 4.45 Å², from</w:t>
-      </w:r>
-      <w:r>
-        <w:t xml:space="preserve"> </w:t>
-      </w:r>
-      <w:r>
-        <w:t xml:space="preserve">the library, Section 3.7), log-normal intensity jitter per reflection (σ = 0.3 or 0.5), or both (σ = 0.3).</w:t>
-      </w:r>
-      <w:r>
-        <w:t xml:space="preserve"> </w:t>
-      </w:r>
-      <w:r>
-        <w:t xml:space="preserve">Every variant is scored with the</w:t>
-      </w:r>
-      <w:r>
-        <w:t xml:space="preserve"> </w:t>
-      </w:r>
-      <w:r>
-        <w:t xml:space="preserve">answer sets of the measured pattern. Two of the effects use the own entry, so the ladder diagnoses the model</w:t>
-      </w:r>
-      <w:r>
-        <w:t xml:space="preserve"> </w:t>
-      </w:r>
-      <w:r>
-        <w:t xml:space="preserve">and is not a method. (ii)</w:t>
+        <w:t xml:space="preserve">Each pattern’s</w:t>
+      </w:r>
+      <w:r>
+        <w:t xml:space="preserve"> </w:t>
+      </w:r>
+      <w:r>
+        <w:t xml:space="preserve">own library entry is rendered cleanly and then with one effect of the measurement at a time: its 2θ</w:t>
+      </w:r>
+      <w:r>
+        <w:t xml:space="preserve"> </w:t>
+      </w:r>
+      <w:r>
+        <w:t xml:space="preserve">coverage, its peak width and its noise level, each estimated from the measured pattern; Kα2, added to every</w:t>
+      </w:r>
+      <w:r>
+        <w:t xml:space="preserve"> </w:t>
+      </w:r>
+      <w:r>
+        <w:t xml:space="preserve">laboratory Cu pattern because monochromatisation is not recorded; its own background followed by the</w:t>
+      </w:r>
+      <w:r>
+        <w:t xml:space="preserve"> </w:t>
+      </w:r>
+      <w:r>
+        <w:t xml:space="preserve">background subtraction of Section 3.1; the zero offset that best aligns it with its entry; and an overall</w:t>
+      </w:r>
+      <w:r>
+        <w:t xml:space="preserve"> </w:t>
+      </w:r>
+      <w:r>
+        <w:t xml:space="preserve">Debye–Waller factor (B = 4.45 Å², from the library, Section 3.7). It is then rendered with the first six</w:t>
+      </w:r>
+      <w:r>
+        <w:t xml:space="preserve"> </w:t>
+      </w:r>
+      <w:r>
+        <w:t xml:space="preserve">together, and with those six plus the Debye–Waller factor, log-normal intensity jitter per reflection</w:t>
+      </w:r>
+      <w:r>
+        <w:t xml:space="preserve"> </w:t>
+      </w:r>
+      <w:r>
+        <w:t xml:space="preserve">(σ = 0.3 or 0.5, not estimated from the data), or both (σ = 0.3); the Debye–Waller and jitter rungs were</w:t>
+      </w:r>
+      <w:r>
+        <w:t xml:space="preserve"> </w:t>
+      </w:r>
+      <w:r>
+        <w:t xml:space="preserve">added after the first ladder. Every variant is scored with the answer sets of the measured pattern. One</w:t>
+      </w:r>
+      <w:r>
+        <w:t xml:space="preserve"> </w:t>
+      </w:r>
+      <w:r>
+        <w:t xml:space="preserve">effect, the zero offset, uses the own entry, so the ladder diagnoses the model and is not a method.</w:t>
+      </w:r>
+      <w:r>
+        <w:t xml:space="preserve"> </w:t>
+      </w:r>
+      <w:r>
+        <w:t xml:space="preserve">(ii)</w:t>
       </w:r>
       <w:r>
         <w:t xml:space="preserve"> </w:t>
@@ -2400,19 +2448,19 @@
         <w:t xml:space="preserve"> </w:t>
       </w:r>
       <w:r>
-        <w:t xml:space="preserve">The clean library patterns are passed through the model’s</w:t>
-      </w:r>
-      <w:r>
-        <w:t xml:space="preserve"> </w:t>
-      </w:r>
-      <w:r>
-        <w:t xml:space="preserve">pattern encoder, so measured patterns are matched against simulated patterns in the learned space without</w:t>
-      </w:r>
-      <w:r>
-        <w:t xml:space="preserve"> </w:t>
-      </w:r>
-      <w:r>
-        <w:t xml:space="preserve">the structure encoder. (iii)</w:t>
+        <w:t xml:space="preserve">The clean library patterns are passed through the model’s pattern encoder, so</w:t>
+      </w:r>
+      <w:r>
+        <w:t xml:space="preserve"> </w:t>
+      </w:r>
+      <w:r>
+        <w:t xml:space="preserve">measured patterns are matched against simulated patterns in the learned space without the structure encoder.</w:t>
+      </w:r>
+      <w:r>
+        <w:t xml:space="preserve"> </w:t>
+      </w:r>
+      <w:r>
+        <w:t xml:space="preserve">(iii)</w:t>
       </w:r>
       <w:r>
         <w:t xml:space="preserve"> </w:t>
@@ -2428,43 +2476,49 @@
         <w:t xml:space="preserve"> </w:t>
       </w:r>
       <w:r>
-        <w:t xml:space="preserve">The model was retrained once with the design and a</w:t>
-      </w:r>
-      <w:r>
-        <w:t xml:space="preserve"> </w:t>
-      </w:r>
-      <w:r>
-        <w:t xml:space="preserve">prediction fixed before training (repository commit 3b77818): the same split, architecture,</w:t>
-      </w:r>
-      <w:r>
-        <w:t xml:space="preserve"> </w:t>
-      </w:r>
-      <w:r>
-        <w:t xml:space="preserve">hyperparameters, epochs, hard-negative batches and checkpoint rule, with the training simulation extended by</w:t>
-      </w:r>
-      <w:r>
-        <w:t xml:space="preserve"> </w:t>
-      </w:r>
-      <w:r>
-        <w:t xml:space="preserve">a Kα2 copy (probability 0.6, I₂/I₁ = 0.5), an overall Debye–Waller factor with B drawn uniformly from 0–8 Å²,</w:t>
-      </w:r>
-      <w:r>
-        <w:t xml:space="preserve"> </w:t>
-      </w:r>
-      <w:r>
-        <w:t xml:space="preserve">log-normal intensity jitter per reflection with σ drawn uniformly from 0–0.5, a cut of the 2θ range (probability 0.25;</w:t>
-      </w:r>
-      <w:r>
-        <w:t xml:space="preserve"> </w:t>
-      </w:r>
-      <w:r>
-        <w:t xml:space="preserve">start 5–12°, end 30–50°), and the background subtraction applied to the measured patterns. The retrained</w:t>
-      </w:r>
-      <w:r>
-        <w:t xml:space="preserve"> </w:t>
-      </w:r>
-      <w:r>
-        <w:t xml:space="preserve">model is scored like the original, including the ladder.</w:t>
+        <w:t xml:space="preserve">The model was retrained once with the design and a prediction fixed before</w:t>
+      </w:r>
+      <w:r>
+        <w:t xml:space="preserve"> </w:t>
+      </w:r>
+      <w:r>
+        <w:t xml:space="preserve">training (repository commit 3b77818): the same split, architecture, hyperparameters, epochs, hard-negative</w:t>
+      </w:r>
+      <w:r>
+        <w:t xml:space="preserve"> </w:t>
+      </w:r>
+      <w:r>
+        <w:t xml:space="preserve">batches and checkpoint rule, with the training simulation extended by a Kα2 copy (probability 0.6,</w:t>
+      </w:r>
+      <w:r>
+        <w:t xml:space="preserve"> </w:t>
+      </w:r>
+      <w:r>
+        <w:t xml:space="preserve">I₂/I₁ = 0.5), an overall Debye–Waller factor with B drawn uniformly from 0–8 Å², log-normal intensity jitter</w:t>
+      </w:r>
+      <w:r>
+        <w:t xml:space="preserve"> </w:t>
+      </w:r>
+      <w:r>
+        <w:t xml:space="preserve">per reflection with σ drawn uniformly from 0–0.5, a cut of the 2θ range (probability 0.25; start 5–12°, end</w:t>
+      </w:r>
+      <w:r>
+        <w:t xml:space="preserve"> </w:t>
+      </w:r>
+      <w:r>
+        <w:t xml:space="preserve">30–50°), and the background subtraction applied to the measured patterns. The retrained model is scored like</w:t>
+      </w:r>
+      <w:r>
+        <w:t xml:space="preserve"> </w:t>
+      </w:r>
+      <w:r>
+        <w:t xml:space="preserve">the original, including the ladder; since it was trained only on background-subtracted patterns, its ladder</w:t>
+      </w:r>
+      <w:r>
+        <w:t xml:space="preserve"> </w:t>
+      </w:r>
+      <w:r>
+        <w:t xml:space="preserve">was also rerun with the background subtraction applied to every rung (ESI†).</w:t>
       </w:r>
     </w:p>
     <w:bookmarkEnd w:id="24"/>
@@ -2764,19 +2818,31 @@
         <w:t xml:space="preserve"> </w:t>
       </w:r>
       <w:r>
-        <w:t xml:space="preserve">283–303 K. (b) For the 68 patterns not measured with Cu Kα, the Lorentz–polarisation factor converted from</w:t>
-      </w:r>
-      <w:r>
-        <w:t xml:space="preserve"> </w:t>
-      </w:r>
-      <w:r>
-        <w:t xml:space="preserve">the measurement to Cu Kα1, with polarisation (1 + cos² 2θ)/2 for laboratory tubes and none for synchrotrons</w:t>
-      </w:r>
-      <w:r>
-        <w:t xml:space="preserve"> </w:t>
-      </w:r>
-      <w:r>
-        <w:t xml:space="preserve">(an assumption). (c) For the 125 laboratory-tube patterns, Kα2 as a nuisance: the score is the higher of</w:t>
+        <w:t xml:space="preserve">283–303 K, applied to every pattern whatever its temperature. (b) For the 68 patterns not measured with Cu</w:t>
+      </w:r>
+      <w:r>
+        <w:t xml:space="preserve"> </w:t>
+      </w:r>
+      <w:r>
+        <w:t xml:space="preserve">Kα, the Lorentz–polarisation factor converted from the measurement to Cu Kα1, with polarisation</w:t>
+      </w:r>
+      <w:r>
+        <w:t xml:space="preserve"> </w:t>
+      </w:r>
+      <w:r>
+        <w:t xml:space="preserve">(1 + cos² 2θ)/2 for laboratory tubes and none for synchrotrons, the two patterns at other wavelengths being</w:t>
+      </w:r>
+      <w:r>
+        <w:t xml:space="preserve"> </w:t>
+      </w:r>
+      <w:r>
+        <w:t xml:space="preserve">treated as synchrotron data. No polarisation holds for a vertical scattering plane with a point detector;</w:t>
+      </w:r>
+      <w:r>
+        <w:t xml:space="preserve"> </w:t>
+      </w:r>
+      <w:r>
+        <w:t xml:space="preserve">area-detector data integrated without a polarisation correction would carry the laboratory form. (c) For the 125 laboratory-tube patterns, Kα2 as a nuisance: the score is the higher of</w:t>
       </w:r>
       <w:r>
         <w:t xml:space="preserve"> </w:t>
@@ -2800,7 +2866,13 @@
         <w:t xml:space="preserve"> </w:t>
       </w:r>
       <w:r>
-        <w:t xml:space="preserve">removed on its own to give one-off ablations. None of the four was selected after seeing results.</w:t>
+        <w:t xml:space="preserve">removed on its own to give one-off ablations. None of the four was selected after seeing results. Changes</w:t>
+      </w:r>
+      <w:r>
+        <w:t xml:space="preserve"> </w:t>
+      </w:r>
+      <w:r>
+        <w:t xml:space="preserve">(b) and (d) act on the queries rather than on the library.</w:t>
       </w:r>
     </w:p>
     <w:bookmarkEnd w:id="27"/>
@@ -2839,7 +2911,7 @@
         <w:t xml:space="preserve"> </w:t>
       </w:r>
       <w:r>
-        <w:t xml:space="preserve">as implemented in critic2 1.4</w:t>
+        <w:t xml:space="preserve">as implemented in critic2 1.4.155</w:t>
       </w:r>
       <w:hyperlink w:anchor="ref-oterodelaroza2014critic2">
         <w:r>
@@ -2863,67 +2935,103 @@
         <w:t xml:space="preserve"> </w:t>
       </w:r>
       <w:r>
-        <w:t xml:space="preserve">angles in its quick mode). We ran the published pipeline: background fit with 20 knots, peak fit with the</w:t>
-      </w:r>
-      <w:r>
-        <w:t xml:space="preserve"> </w:t>
-      </w:r>
-      <w:r>
-        <w:t xml:space="preserve">default settings, and the global quick comparison with α = 1 as in the paper (the code’s default is 0.5) and</w:t>
-      </w:r>
-      <w:r>
-        <w:t xml:space="preserve"> </w:t>
-      </w:r>
-      <w:r>
-        <w:t xml:space="preserve">the measurement wavelength; it applies no zero-offset correction. One step was added: each pattern was cut</w:t>
-      </w:r>
-      <w:r>
-        <w:t xml:space="preserve"> </w:t>
-      </w:r>
-      <w:r>
-        <w:t xml:space="preserve">to the d-spacing window that the other scores see (Cu Kα1 2θ of 5–50°). The shortlist of each single-crystal</w:t>
-      </w:r>
-      <w:r>
-        <w:t xml:space="preserve"> </w:t>
-      </w:r>
-      <w:r>
-        <w:t xml:space="preserve">pattern is the 50 best entries of ln q, with set-aside entries excluded; a pattern whose answer is not in</w:t>
-      </w:r>
-      <w:r>
-        <w:t xml:space="preserve"> </w:t>
-      </w:r>
-      <w:r>
-        <w:t xml:space="preserve">its shortlist counts as a miss, and a comparison that fails or runs past a 4-hour limit counts as maximally</w:t>
-      </w:r>
-      <w:r>
-        <w:t xml:space="preserve"> </w:t>
-      </w:r>
-      <w:r>
-        <w:t xml:space="preserve">dissimilar. We had planned a shortlist of 100, but the shortlist holds the answer for the same 36 of the 59</w:t>
-      </w:r>
-      <w:r>
-        <w:t xml:space="preserve"> </w:t>
-      </w:r>
-      <w:r>
-        <w:t xml:space="preserve">patterns at 50 as at 100, so the further entries could only have added competitors; the shorter list is, if</w:t>
-      </w:r>
-      <w:r>
-        <w:t xml:space="preserve"> </w:t>
-      </w:r>
-      <w:r>
-        <w:t xml:space="preserve">anything, favourable to the re-rank. A comparison took a median of 2.2 CPU-minutes and up to 3.0 CPU-hours</w:t>
-      </w:r>
-      <w:r>
-        <w:t xml:space="preserve"> </w:t>
-      </w:r>
-      <w:r>
-        <w:t xml:space="preserve">for the largest cells; one of the 2,950 comparisons reached the limit, in a shortlist that does not hold the</w:t>
-      </w:r>
-      <w:r>
-        <w:t xml:space="preserve"> </w:t>
-      </w:r>
-      <w:r>
-        <w:t xml:space="preserve">answer, so it changes no result.</w:t>
+        <w:t xml:space="preserve">angles in its quick mode, so larger cell differences cannot be reached). We ran the published pipeline:</w:t>
+      </w:r>
+      <w:r>
+        <w:t xml:space="preserve"> </w:t>
+      </w:r>
+      <w:r>
+        <w:t xml:space="preserve">background fit with 20 knots, peak fit with the default settings, and the global quick comparison with α = 1</w:t>
+      </w:r>
+      <w:r>
+        <w:t xml:space="preserve"> </w:t>
+      </w:r>
+      <w:r>
+        <w:t xml:space="preserve">as in the paper (the code’s default is 0.5) and the measurement wavelength; it applies no zero-offset</w:t>
+      </w:r>
+      <w:r>
+        <w:t xml:space="preserve"> </w:t>
+      </w:r>
+      <w:r>
+        <w:t xml:space="preserve">correction, and the peak fit does not model Kα2. One step was added: each pattern was cut to the d-spacing</w:t>
+      </w:r>
+      <w:r>
+        <w:t xml:space="preserve"> </w:t>
+      </w:r>
+      <w:r>
+        <w:t xml:space="preserve">window that the other scores see (Cu Kα1 2θ of 5–50°). The shortlist of each single-crystal pattern is the</w:t>
+      </w:r>
+      <w:r>
+        <w:t xml:space="preserve"> </w:t>
+      </w:r>
+      <w:r>
+        <w:t xml:space="preserve">50 best entries of ln q, with set-aside entries excluded; a pattern whose answer is not in its shortlist</w:t>
+      </w:r>
+      <w:r>
+        <w:t xml:space="preserve"> </w:t>
+      </w:r>
+      <w:r>
+        <w:t xml:space="preserve">counts as a miss, and a comparison that fails or runs past 4 hours of wall time counts as maximally</w:t>
+      </w:r>
+      <w:r>
+        <w:t xml:space="preserve"> </w:t>
+      </w:r>
+      <w:r>
+        <w:t xml:space="preserve">dissimilar. Entries with a disorder model are given as their major component; the first run passed every</w:t>
+      </w:r>
+      <w:r>
+        <w:t xml:space="preserve"> </w:t>
+      </w:r>
+      <w:r>
+        <w:t xml:space="preserve">component at full occupancy, which affected one answer and is corrected here (ESI†). We had planned a shortlist of 100, but the shortlist holds the answer for the same 36</w:t>
+      </w:r>
+      <w:r>
+        <w:t xml:space="preserve"> </w:t>
+      </w:r>
+      <w:r>
+        <w:t xml:space="preserve">of the 59 patterns at 50 as at 100, so the further entries could only have added competitors; the shorter</w:t>
+      </w:r>
+      <w:r>
+        <w:t xml:space="preserve"> </w:t>
+      </w:r>
+      <w:r>
+        <w:t xml:space="preserve">list is, if anything, favourable to the re-rank. Because the cost of a comparison was first unknown, we ran</w:t>
+      </w:r>
+      <w:r>
+        <w:t xml:space="preserve"> </w:t>
+      </w:r>
+      <w:r>
+        <w:t xml:space="preserve">the top 10 before extending to 50 (ESI†). A comparison took a median of 2.2 CPU-minutes and up to 3.0</w:t>
+      </w:r>
+      <w:r>
+        <w:t xml:space="preserve"> </w:t>
+      </w:r>
+      <w:r>
+        <w:t xml:space="preserve">CPU-hours for the largest cells; one of the 2,950 comparisons reached the limit, in a shortlist that does</w:t>
+      </w:r>
+      <w:r>
+        <w:t xml:space="preserve"> </w:t>
+      </w:r>
+      <w:r>
+        <w:t xml:space="preserve">not hold the answer, so it changes no result. Two checks were added after an internal review (ESI†): a</w:t>
+      </w:r>
+      <w:r>
+        <w:t xml:space="preserve"> </w:t>
+      </w:r>
+      <w:r>
+        <w:t xml:space="preserve">positive control, in which each pattern is compared with its own powder-study entry, the structure refined</w:t>
+      </w:r>
+      <w:r>
+        <w:t xml:space="preserve"> </w:t>
+      </w:r>
+      <w:r>
+        <w:t xml:space="preserve">against that very pattern; and an injection test, in which each answer missing from a shortlist is compared</w:t>
+      </w:r>
+      <w:r>
+        <w:t xml:space="preserve"> </w:t>
+      </w:r>
+      <w:r>
+        <w:t xml:space="preserve">with its pattern to see where it would rank.</w:t>
       </w:r>
     </w:p>
     <w:bookmarkEnd w:id="28"/>
@@ -3029,7 +3137,7 @@
       <w:r>
         <w:drawing>
           <wp:inline>
-            <wp:extent cx="5334000" cy="2857668"/>
+            <wp:extent cx="5334000" cy="3275541"/>
             <wp:effectExtent b="0" l="0" r="0" t="0"/>
             <wp:docPr descr="" title="" id="31" name="Picture"/>
             <a:graphic>
@@ -3050,7 +3158,7 @@
                   <pic:spPr bwMode="auto">
                     <a:xfrm>
                       <a:off x="0" y="0"/>
-                      <a:ext cx="5334000" cy="2857668"/>
+                      <a:ext cx="5334000" cy="3275541"/>
                     </a:xfrm>
                     <a:prstGeom prst="rect">
                       <a:avLst/>
@@ -3150,7 +3258,13 @@
         <w:t xml:space="preserve"> </w:t>
       </w:r>
       <w:r>
-        <w:t xml:space="preserve">For 34–47 % of these patterns the first correct entry lies beyond rank 1,000 for every classical score.</w:t>
+        <w:t xml:space="preserve">Depending on the classical score, the first correct entry lies beyond rank 1,000 for 34–47 % of these</w:t>
+      </w:r>
+      <w:r>
+        <w:t xml:space="preserve"> </w:t>
+      </w:r>
+      <w:r>
+        <w:t xml:space="preserve">patterns.</w:t>
       </w:r>
     </w:p>
     <w:p>
@@ -3158,7 +3272,13 @@
         <w:pStyle w:val="BodyText"/>
       </w:pPr>
       <w:r>
-        <w:t xml:space="preserve">Strain tolerance helps here, although the intervals are wide. Paired over compounds, WCC (l = 1°) beats</w:t>
+        <w:t xml:space="preserve">The shift- and strain-tolerant scores all lie above fixed-grid Pearson, but the intervals are wide. Paired</w:t>
+      </w:r>
+      <w:r>
+        <w:t xml:space="preserve"> </w:t>
+      </w:r>
+      <w:r>
+        <w:t xml:space="preserve">over compounds, and without correction for the four comparisons, WCC (l = 1°) beats</w:t>
       </w:r>
       <w:r>
         <w:t xml:space="preserve"> </w:t>
@@ -3170,13 +3290,7 @@
         <w:t xml:space="preserve"> </w:t>
       </w:r>
       <w:r>
-        <w:t xml:space="preserve">(+0.10 [−0.05, 0.24]) and WCC (l = 2°, +0.16 [−0.03, 0.35]) are not resolved. The ln q scan has the best</w:t>
-      </w:r>
-      <w:r>
-        <w:t xml:space="preserve"> </w:t>
-      </w:r>
-      <w:r>
-        <w:t xml:space="preserve">median rank, 7.</w:t>
+        <w:t xml:space="preserve">(+0.10 [−0.05, 0.24]) and WCC (l = 2°, +0.16 [−0.03, 0.35]) are not resolved. Of the full-library scores, the ln q scan has the best median rank, 7.</w:t>
       </w:r>
     </w:p>
     <w:p>
@@ -3184,31 +3298,67 @@
         <w:pStyle w:val="BodyText"/>
       </w:pPr>
       <w:r>
-        <w:t xml:space="preserve">What separates success from failure is how well the cells agree. Where the closest single-crystal entry</w:t>
-      </w:r>
-      <w:r>
-        <w:t xml:space="preserve"> </w:t>
-      </w:r>
-      <w:r>
-        <w:t xml:space="preserve">has every cell length within 1 % of the powder-study entry’s, the ln q scan ranks it first for 0.68 of</w:t>
-      </w:r>
-      <w:r>
-        <w:t xml:space="preserve"> </w:t>
-      </w:r>
-      <w:r>
-        <w:t xml:space="preserve">patterns (34 patterns); where they differ by more, for 0.08 (25 patterns). Thermal expansion is the obvious</w:t>
-      </w:r>
-      <w:r>
-        <w:t xml:space="preserve"> </w:t>
-      </w:r>
-      <w:r>
-        <w:t xml:space="preserve">suspect, since a typical molecular crystal expands by about 3 % in volume between 100 K and room</w:t>
-      </w:r>
-      <w:r>
-        <w:t xml:space="preserve"> </w:t>
-      </w:r>
-      <w:r>
-        <w:t xml:space="preserve">temperature</w:t>
+        <w:t xml:space="preserve">What separates success from failure is how well the cells agree, and why they differ. We compare the</w:t>
+      </w:r>
+      <w:r>
+        <w:t xml:space="preserve"> </w:t>
+      </w:r>
+      <w:r>
+        <w:t xml:space="preserve">primitive Niggli-reduced cells of each pattern’s own powder-study entry and of its closest single-crystal</w:t>
+      </w:r>
+      <w:r>
+        <w:t xml:space="preserve"> </w:t>
+      </w:r>
+      <w:r>
+        <w:t xml:space="preserve">same-form entry (58 patterns; one has no powder-study entry). Where every reduced cell length agrees within</w:t>
+      </w:r>
+      <w:r>
+        <w:t xml:space="preserve"> </w:t>
+      </w:r>
+      <w:r>
+        <w:t xml:space="preserve">1 %, the ln q scan ranks a single-crystal same-form entry first for 22 of 33 patterns; where the cells differ</w:t>
+      </w:r>
+      <w:r>
+        <w:t xml:space="preserve"> </w:t>
+      </w:r>
+      <w:r>
+        <w:t xml:space="preserve">by more, for 2 of 25, one of which is a supercell description of the same lattice. Most of the differences</w:t>
+      </w:r>
+      <w:r>
+        <w:t xml:space="preserve"> </w:t>
+      </w:r>
+      <w:r>
+        <w:t xml:space="preserve">have identifiable causes. 22 of the 59 single-crystal patterns (5 compounds) come from variable-pressure</w:t>
+      </w:r>
+      <w:r>
+        <w:t xml:space="preserve"> </w:t>
+      </w:r>
+      <w:r>
+        <w:t xml:space="preserve">studies, room-temperature compression series whose single-crystal references were determined at other</w:t>
+      </w:r>
+      <w:r>
+        <w:t xml:space="preserve"> </w:t>
+      </w:r>
+      <w:r>
+        <w:t xml:space="preserve">pressures, and they account for 16 of the 25 patterns with differing cells. In 7 of the other 9, the</w:t>
+      </w:r>
+      <w:r>
+        <w:t xml:space="preserve"> </w:t>
+      </w:r>
+      <w:r>
+        <w:t xml:space="preserve">recorded temperatures of the two entries differ by more than 50 K; overall, where both temperatures are</w:t>
+      </w:r>
+      <w:r>
+        <w:t xml:space="preserve"> </w:t>
+      </w:r>
+      <w:r>
+        <w:t xml:space="preserve">recorded (35 patterns), they differ by more than 50 K for 15, and those 15 are retrieved less often (0.20</w:t>
+      </w:r>
+      <w:r>
+        <w:t xml:space="preserve"> </w:t>
+      </w:r>
+      <w:r>
+        <w:t xml:space="preserve">against 0.45). Thermal expansion of molecular crystals is generally anisotropic</w:t>
       </w:r>
       <w:hyperlink w:anchor="ref-bond2021thermal">
         <w:r>
@@ -3220,31 +3370,31 @@
         </w:r>
       </w:hyperlink>
       <w:r>
-        <w:t xml:space="preserve">, but the recorded temperatures of the two entries differ by a median of 3 K</w:t>
-      </w:r>
-      <w:r>
-        <w:t xml:space="preserve"> </w:t>
-      </w:r>
-      <w:r>
-        <w:t xml:space="preserve">for the 36 patterns where both are known, so it explains few of these mismatches. Pressure, refinement</w:t>
-      </w:r>
-      <w:r>
-        <w:t xml:space="preserve"> </w:t>
-      </w:r>
-      <w:r>
-        <w:t xml:space="preserve">differences and the low precision of some early determinations are other candidates; we did not resolve</w:t>
-      </w:r>
-      <w:r>
-        <w:t xml:space="preserve"> </w:t>
-      </w:r>
-      <w:r>
-        <w:t xml:space="preserve">them. The ln q scan absorbs isotropic strain up to 3 %, so its failures beyond 1 % suggest anisotropic</w:t>
-      </w:r>
-      <w:r>
-        <w:t xml:space="preserve"> </w:t>
-      </w:r>
-      <w:r>
-        <w:t xml:space="preserve">cell differences, which variable-cell comparison is designed to absorb.</w:t>
+        <w:t xml:space="preserve">, and so is their compression; the isotropic ln q lag cannot absorb either, but</w:t>
+      </w:r>
+      <w:r>
+        <w:t xml:space="preserve"> </w:t>
+      </w:r>
+      <w:r>
+        <w:t xml:space="preserve">variable-cell comparison is designed to.</w:t>
+      </w:r>
+      <w:r>
+        <w:t xml:space="preserve"> </w:t>
+      </w:r>
+      <w:r>
+        <w:t xml:space="preserve">The pressure-series patterns are not the routine case of a new measurement checked against a database.</w:t>
+      </w:r>
+      <w:r>
+        <w:t xml:space="preserve"> </w:t>
+      </w:r>
+      <w:r>
+        <w:t xml:space="preserve">Without them (37 patterns, 25 compounds; a split defined after an internal review), the classical scores</w:t>
+      </w:r>
+      <w:r>
+        <w:t xml:space="preserve"> </w:t>
+      </w:r>
+      <w:r>
+        <w:t xml:space="preserve">reach a compound-weighted top-1 of 0.35–0.60 and the model 0.00 (ESI†).</w:t>
       </w:r>
     </w:p>
     <w:p>
@@ -3268,61 +3418,97 @@
         <w:t xml:space="preserve"> </w:t>
       </w:r>
       <w:r>
-        <w:t xml:space="preserve">top-1 of 0.50 [0.32, 0.67], against 0.45 [0.28, 0.63] for the ln q scan on the same patterns; the paired</w:t>
-      </w:r>
-      <w:r>
-        <w:t xml:space="preserve"> </w:t>
-      </w:r>
-      <w:r>
-        <w:t xml:space="preserve">difference, +0.05 [−0.11, 0.20], does not resolve them, and at top-10 the re-rank is no better (0.59</w:t>
-      </w:r>
-      <w:r>
-        <w:t xml:space="preserve"> </w:t>
-      </w:r>
-      <w:r>
-        <w:t xml:space="preserve">against 0.61). Per pattern, the re-rank ranks the answer first for 26 of the 59 patterns and the ln q scan</w:t>
-      </w:r>
-      <w:r>
-        <w:t xml:space="preserve"> </w:t>
-      </w:r>
-      <w:r>
-        <w:t xml:space="preserve">for 25. Of the 36 patterns whose shortlist holds the answer, the re-rank moves it to first place for 4 (from</w:t>
-      </w:r>
-      <w:r>
-        <w:t xml:space="preserve"> </w:t>
-      </w:r>
-      <w:r>
-        <w:t xml:space="preserve">ln q ranks 2, 3, 7 and 9) and moves ln q’s correct first choice down for 3 (to ranks 2, 22 and 50, the last</w:t>
-      </w:r>
-      <w:r>
-        <w:t xml:space="preserve"> </w:t>
-      </w:r>
-      <w:r>
-        <w:t xml:space="preserve">of its shortlist). Where the cells differ by more than 1 %, it ranks the answer first for 4 of the 25</w:t>
-      </w:r>
-      <w:r>
-        <w:t xml:space="preserve"> </w:t>
-      </w:r>
-      <w:r>
-        <w:t xml:space="preserve">patterns, against 2 for the ln q scan; where they agree, for 22 of 34, against 23. Variable-cell comparison</w:t>
-      </w:r>
-      <w:r>
-        <w:t xml:space="preserve"> </w:t>
-      </w:r>
-      <w:r>
-        <w:t xml:space="preserve">recovers a few of the mismatched cells, but most single-crystal failures remain: for 23 of the 59 patterns</w:t>
-      </w:r>
-      <w:r>
-        <w:t xml:space="preserve"> </w:t>
-      </w:r>
-      <w:r>
-        <w:t xml:space="preserve">the answer is not among the 50 entries re-ranked, and 21 of the 25 patterns with mismatched cells still</w:t>
-      </w:r>
-      <w:r>
-        <w:t xml:space="preserve"> </w:t>
-      </w:r>
-      <w:r>
-        <w:t xml:space="preserve">fail.</w:t>
+        <w:t xml:space="preserve">top-1 of 0.53 [0.37, 0.70], against 0.45 [0.28, 0.63] for the ln q scan on the same patterns; the paired</w:t>
+      </w:r>
+      <w:r>
+        <w:t xml:space="preserve"> </w:t>
+      </w:r>
+      <w:r>
+        <w:t xml:space="preserve">difference, +0.08 [−0.05, 0.21], does not resolve them, and at top-10 the two are level (0.62 against</w:t>
+      </w:r>
+      <w:r>
+        <w:t xml:space="preserve"> </w:t>
+      </w:r>
+      <w:r>
+        <w:t xml:space="preserve">0.61). Per pattern, the re-rank ranks the answer first for 27 of the 59 patterns and the ln q scan for 25. Of</w:t>
+      </w:r>
+      <w:r>
+        <w:t xml:space="preserve"> </w:t>
+      </w:r>
+      <w:r>
+        <w:t xml:space="preserve">the 36 patterns whose shortlist holds the answer, the re-rank moves it to first place for 4 (from ln q ranks</w:t>
+      </w:r>
+      <w:r>
+        <w:t xml:space="preserve"> </w:t>
+      </w:r>
+      <w:r>
+        <w:t xml:space="preserve">2, 3, 7 and 9) and moves ln q’s correct first choice down for 2 (to ranks 2 and 22). Where the cells differ</w:t>
+      </w:r>
+      <w:r>
+        <w:t xml:space="preserve"> </w:t>
+      </w:r>
+      <w:r>
+        <w:t xml:space="preserve">by more than 1 %, it ranks the answer first for 4 of the 25 patterns, against 2 for the ln q scan; where</w:t>
+      </w:r>
+      <w:r>
+        <w:t xml:space="preserve"> </w:t>
+      </w:r>
+      <w:r>
+        <w:t xml:space="preserve">they agree, for 22 of 33, against 22. Its reach is limited in two ways. First, the shortlist: for 23 of the</w:t>
+      </w:r>
+      <w:r>
+        <w:t xml:space="preserve"> </w:t>
+      </w:r>
+      <w:r>
+        <w:t xml:space="preserve">59 patterns the answer is not among the 50 entries re-ranked, and compared directly, only 2 of those 23</w:t>
+      </w:r>
+      <w:r>
+        <w:t xml:space="preserve"> </w:t>
+      </w:r>
+      <w:r>
+        <w:t xml:space="preserve">answers would rank first. Second, the peak fits. On the pressure-series patterns, measured at short</w:t>
+      </w:r>
+      <w:r>
+        <w:t xml:space="preserve"> </w:t>
+      </w:r>
+      <w:r>
+        <w:t xml:space="preserve">wavelengths at high pressure, the fit finds 11–49 peaks (median 37), against 66–296 (median 154) on the</w:t>
+      </w:r>
+      <w:r>
+        <w:t xml:space="preserve"> </w:t>
+      </w:r>
+      <w:r>
+        <w:t xml:space="preserve">others. Compared with its own powder-study entry, the structure refined against the same data, the pipeline</w:t>
+      </w:r>
+      <w:r>
+        <w:t xml:space="preserve"> </w:t>
+      </w:r>
+      <w:r>
+        <w:t xml:space="preserve">ranks that entry above every wrong entry of the shortlist for 29 of 36 ambient-pressure patterns but for</w:t>
+      </w:r>
+      <w:r>
+        <w:t xml:space="preserve"> </w:t>
+      </w:r>
+      <w:r>
+        <w:t xml:space="preserve">only 1 of the 22 pressure-series patterns (median rank 26), so on those patterns the re-rank carries little</w:t>
+      </w:r>
+      <w:r>
+        <w:t xml:space="preserve"> </w:t>
+      </w:r>
+      <w:r>
+        <w:t xml:space="preserve">information.</w:t>
+      </w:r>
+      <w:r>
+        <w:t xml:space="preserve"> </w:t>
+      </w:r>
+      <w:r>
+        <w:t xml:space="preserve">Without the pressure-series patterns, the re-rank reaches 0.64 [0.46, 0.80] against 0.54 [0.34, 0.72] for</w:t>
+      </w:r>
+      <w:r>
+        <w:t xml:space="preserve"> </w:t>
+      </w:r>
+      <w:r>
+        <w:t xml:space="preserve">the ln q scan (paired +0.10 [−0.04, 0.26]).</w:t>
       </w:r>
     </w:p>
     <w:p>
@@ -3364,7 +3550,19 @@
         <w:t xml:space="preserve"> </w:t>
       </w:r>
       <w:r>
-        <w:t xml:space="preserve">shortlist counts as a miss, and its median rank falls inside the shortlist.</w:t>
+        <w:t xml:space="preserve">shortlist counts as a miss, and its median rank falls inside the shortlist. The model’s 0.00 [0.00, 0.00]</w:t>
+      </w:r>
+      <w:r>
+        <w:t xml:space="preserve"> </w:t>
+      </w:r>
+      <w:r>
+        <w:t xml:space="preserve">on the single-crystal set is a degenerate bootstrap interval: none of the 30 compounds is retrieved, and an</w:t>
+      </w:r>
+      <w:r>
+        <w:t xml:space="preserve"> </w:t>
+      </w:r>
+      <w:r>
+        <w:t xml:space="preserve">exact one-sided 95 % bound is 0.10.</w:t>
       </w:r>
     </w:p>
     <w:tbl>
@@ -3496,18 +3694,18 @@
               <w:pStyle w:val="Compact"/>
             </w:pPr>
             <w:r>
-              <w:t xml:space="preserve">0.50 [0.32, 0.67]</w:t>
-            </w:r>
-          </w:p>
-        </w:tc>
-        <w:tc>
-          <w:tcPr/>
-          <w:p>
-            <w:pPr>
-              <w:pStyle w:val="Compact"/>
-            </w:pPr>
-            <w:r>
-              <w:t xml:space="preserve">0.59</w:t>
+              <w:t xml:space="preserve">0.53 [0.37, 0.70]</w:t>
+            </w:r>
+          </w:p>
+        </w:tc>
+        <w:tc>
+          <w:tcPr/>
+          <w:p>
+            <w:pPr>
+              <w:pStyle w:val="Compact"/>
+            </w:pPr>
+            <w:r>
+              <w:t xml:space="preserve">0.62</w:t>
             </w:r>
           </w:p>
         </w:tc>
@@ -4795,7 +4993,7 @@
         <w:pStyle w:val="FirstParagraph"/>
       </w:pPr>
       <w:r>
-        <w:t xml:space="preserve">The model ranks the first correct entry at a median of about 6,000 of 309,080 (Fig. 5a). Four diagnostics</w:t>
+        <w:t xml:space="preserve">The model ranks the first correct entry at a median of about 6,000 of 309,080 (Fig. 5a). Five diagnostics</w:t>
       </w:r>
       <w:r>
         <w:t xml:space="preserve"> </w:t>
@@ -4837,31 +5035,31 @@
         <w:t xml:space="preserve"> </w:t>
       </w:r>
       <w:r>
-        <w:t xml:space="preserve">benchmark’s own entries, scored with the same answer sets as the measured patterns, it reaches top-1 0.21</w:t>
-      </w:r>
-      <w:r>
-        <w:t xml:space="preserve"> </w:t>
-      </w:r>
-      <w:r>
-        <w:t xml:space="preserve">and top-10 0.56, with a median rank of 5. On the measured patterns of the same targets it reaches 0.01 and</w:t>
-      </w:r>
-      <w:r>
-        <w:t xml:space="preserve"> </w:t>
-      </w:r>
-      <w:r>
-        <w:t xml:space="preserve">0.03. (A classical score would rank a clean rendering of a library entry first by construction, so this</w:t>
-      </w:r>
-      <w:r>
-        <w:t xml:space="preserve"> </w:t>
-      </w:r>
-      <w:r>
-        <w:t xml:space="preserve">test only diagnoses the model.) The model can discriminate among 309,080 entries; what it cannot do is</w:t>
-      </w:r>
-      <w:r>
-        <w:t xml:space="preserve"> </w:t>
-      </w:r>
-      <w:r>
-        <w:t xml:space="preserve">carry that ability from simulated to measured patterns.</w:t>
+        <w:t xml:space="preserve">benchmark’s own entries, scored with the same answer sets as the measured patterns, it reaches a per-pattern</w:t>
+      </w:r>
+      <w:r>
+        <w:t xml:space="preserve"> </w:t>
+      </w:r>
+      <w:r>
+        <w:t xml:space="preserve">top-1 of 0.21 and top-10 of 0.56, with a median rank of 5. On the measured patterns of the same targets it</w:t>
+      </w:r>
+      <w:r>
+        <w:t xml:space="preserve"> </w:t>
+      </w:r>
+      <w:r>
+        <w:t xml:space="preserve">reaches 0.01 and 0.03. (A classical score would rank a clean rendering of a library entry first by</w:t>
+      </w:r>
+      <w:r>
+        <w:t xml:space="preserve"> </w:t>
+      </w:r>
+      <w:r>
+        <w:t xml:space="preserve">construction, so this test only diagnoses the model.) The model can discriminate among 309,080 entries; what</w:t>
+      </w:r>
+      <w:r>
+        <w:t xml:space="preserve"> </w:t>
+      </w:r>
+      <w:r>
+        <w:t xml:space="preserve">it cannot do is carry that ability from simulated to measured patterns.</w:t>
       </w:r>
     </w:p>
     <w:p>
@@ -4909,7 +5107,7 @@
           <w:b/>
           <w:bCs/>
         </w:rPr>
-        <w:t xml:space="preserve">No single measured effect explains the gap.</w:t>
+        <w:t xml:space="preserve">No single modelled effect explains the gap.</w:t>
       </w:r>
       <w:r>
         <w:t xml:space="preserve"> </w:t>
@@ -4927,43 +5125,61 @@
         <w:t xml:space="preserve"> </w:t>
       </w:r>
       <w:r>
-        <w:t xml:space="preserve">top-1 of 0.27 with a median rank of 5. One effect at a time costs it little except Kα2 (0.18, median rank</w:t>
-      </w:r>
-      <w:r>
-        <w:t xml:space="preserve"> </w:t>
-      </w:r>
-      <w:r>
-        <w:t xml:space="preserve">33) and the background with its subtraction (0.24, median rank 130). With all six effects it reaches 0.15</w:t>
-      </w:r>
-      <w:r>
-        <w:t xml:space="preserve"> </w:t>
-      </w:r>
-      <w:r>
-        <w:t xml:space="preserve">(median rank 176), and with the Debye–Waller factor added 0.05 (median rank 744), against 0.02 and about</w:t>
-      </w:r>
-      <w:r>
-        <w:t xml:space="preserve"> </w:t>
-      </w:r>
-      <w:r>
-        <w:t xml:space="preserve">6,000 on the measured patterns. Fixed-grid Pearson shows the contrast: with all six effects, the</w:t>
-      </w:r>
-      <w:r>
-        <w:t xml:space="preserve"> </w:t>
-      </w:r>
-      <w:r>
-        <w:t xml:space="preserve">Debye–Waller factor and jitter its ladder ends at 0.83, the value it reaches on the measured patterns</w:t>
-      </w:r>
-      <w:r>
-        <w:t xml:space="preserve"> </w:t>
-      </w:r>
-      <w:r>
-        <w:t xml:space="preserve">(0.83), whereas for the model the same simulated patterns leave the median rank at about 750, against about</w:t>
-      </w:r>
-      <w:r>
-        <w:t xml:space="preserve"> </w:t>
-      </w:r>
-      <w:r>
-        <w:t xml:space="preserve">6,000 on the measured ones.</w:t>
+        <w:t xml:space="preserve">top-1 of 0.27 with a median rank of 5. The largest single cost is the Debye–Waller factor (0.07, median rank</w:t>
+      </w:r>
+      <w:r>
+        <w:t xml:space="preserve"> </w:t>
+      </w:r>
+      <w:r>
+        <w:t xml:space="preserve">46), which fixed-grid Pearson does not notice (1.00). Kα2, which we add to every laboratory Cu pattern because</w:t>
+      </w:r>
+      <w:r>
+        <w:t xml:space="preserve"> </w:t>
+      </w:r>
+      <w:r>
+        <w:t xml:space="preserve">monochromatisation is not recorded, costs 0.18 (median rank 33), and the background with its subtraction</w:t>
+      </w:r>
+      <w:r>
+        <w:t xml:space="preserve"> </w:t>
+      </w:r>
+      <w:r>
+        <w:t xml:space="preserve">0.24 (median rank 130); coverage, peak width, noise and the zero offset cost little. With all six effects</w:t>
+      </w:r>
+      <w:r>
+        <w:t xml:space="preserve"> </w:t>
+      </w:r>
+      <w:r>
+        <w:t xml:space="preserve">the model reaches 0.15 (median rank 176), and with the Debye–Waller factor added 0.05 (median rank 744),</w:t>
+      </w:r>
+      <w:r>
+        <w:t xml:space="preserve"> </w:t>
+      </w:r>
+      <w:r>
+        <w:t xml:space="preserve">against 0.02 and about 6,000 on the measured patterns. With every modelled effect, including intensity</w:t>
+      </w:r>
+      <w:r>
+        <w:t xml:space="preserve"> </w:t>
+      </w:r>
+      <w:r>
+        <w:t xml:space="preserve">jitter, fixed-grid Pearson reaches 0.83, its value on the measured patterns (0.83), and the model 0.04</w:t>
+      </w:r>
+      <w:r>
+        <w:t xml:space="preserve"> </w:t>
+      </w:r>
+      <w:r>
+        <w:t xml:space="preserve">against 0.02; the difference shows in the model’s median rank, about 750 on those simulations against about</w:t>
+      </w:r>
+      <w:r>
+        <w:t xml:space="preserve"> </w:t>
+      </w:r>
+      <w:r>
+        <w:t xml:space="preserve">6,000 on the measured patterns. The jitter σ was not estimated from the data, and the Debye–Waller and jitter</w:t>
+      </w:r>
+      <w:r>
+        <w:t xml:space="preserve"> </w:t>
+      </w:r>
+      <w:r>
+        <w:t xml:space="preserve">rungs were added after the first ladder.</w:t>
       </w:r>
     </w:p>
     <w:p>
@@ -4975,7 +5191,7 @@
           <w:b/>
           <w:bCs/>
         </w:rPr>
-        <w:t xml:space="preserve">A retrain with these effects fixes them in simulation only.</w:t>
+        <w:t xml:space="preserve">A retrain with these effects handles them in simulation only.</w:t>
       </w:r>
       <w:r>
         <w:t xml:space="preserve"> </w:t>
@@ -4993,43 +5209,79 @@
         <w:t xml:space="preserve"> </w:t>
       </w:r>
       <w:r>
-        <w:t xml:space="preserve">(Section 3.4). It learned them: on its own entries with all six effects and the Debye–Waller factor, top-1</w:t>
-      </w:r>
-      <w:r>
-        <w:t xml:space="preserve"> </w:t>
-      </w:r>
-      <w:r>
-        <w:t xml:space="preserve">rises from 0.05 to 0.23 and the median rank falls from 744 to 34 (Fig. 6); Kα2 alone is the exception (0.18</w:t>
-      </w:r>
-      <w:r>
-        <w:t xml:space="preserve"> </w:t>
-      </w:r>
-      <w:r>
-        <w:t xml:space="preserve">to 0.11). On the measured patterns the retrained model reaches a compound-weighted top-1 of</w:t>
-      </w:r>
-      <w:r>
-        <w:t xml:space="preserve"> </w:t>
-      </w:r>
-      <w:r>
-        <w:t xml:space="preserve">0.02 [0.00, 0.06], against 0.02 [0.00, 0.04] before, and 0.00 for single-crystal references, although its</w:t>
-      </w:r>
-      <w:r>
-        <w:t xml:space="preserve"> </w:t>
-      </w:r>
-      <w:r>
-        <w:t xml:space="preserve">median rank halves, to about 3,000. Before training we had predicted a measured per-pattern top-1 of</w:t>
-      </w:r>
-      <w:r>
-        <w:t xml:space="preserve"> </w:t>
-      </w:r>
-      <w:r>
-        <w:t xml:space="preserve">0.05–0.20, and that a value below 0.03 would mean the remaining gap is not the modelled effects; it is 0.02.</w:t>
-      </w:r>
-      <w:r>
-        <w:t xml:space="preserve"> </w:t>
-      </w:r>
-      <w:r>
-        <w:t xml:space="preserve">For this model, what separates the measured patterns from their simulations is something we did not model.</w:t>
+        <w:t xml:space="preserve">(Section 3.4). On its own entries it now tolerates the Debye–Waller factor (0.34 alone, median rank 4; 0.23</w:t>
+      </w:r>
+      <w:r>
+        <w:t xml:space="preserve"> </w:t>
+      </w:r>
+      <w:r>
+        <w:t xml:space="preserve">together with all six effects, median rank 34 against 744 before); Kα2 alone stays costly (0.11, against 0.18 before,</w:t>
+      </w:r>
+      <w:r>
+        <w:t xml:space="preserve"> </w:t>
+      </w:r>
+      <w:r>
+        <w:t xml:space="preserve">with overlapping intervals). On the measured patterns the retrained model reaches a compound-weighted top-1 of</w:t>
+      </w:r>
+      <w:r>
+        <w:t xml:space="preserve"> </w:t>
+      </w:r>
+      <w:r>
+        <w:t xml:space="preserve">0.02 [0.00, 0.06], against 0.02 [0.00, 0.04] before, and 0.00 for single-crystal references; its median rank</w:t>
+      </w:r>
+      <w:r>
+        <w:t xml:space="preserve"> </w:t>
+      </w:r>
+      <w:r>
+        <w:t xml:space="preserve">falls from about 6,000 to about 3,000. Before training we predicted a measured per-pattern top-1 of</w:t>
+      </w:r>
+      <w:r>
+        <w:t xml:space="preserve"> </w:t>
+      </w:r>
+      <w:r>
+        <w:t xml:space="preserve">0.05–0.20 and a median rank of 50–1,000, and that a top-1 below 0.03 would mean the remaining gap is not the</w:t>
+      </w:r>
+      <w:r>
+        <w:t xml:space="preserve"> </w:t>
+      </w:r>
+      <w:r>
+        <w:t xml:space="preserve">modelled effects. Both predictions failed: the per-pattern top-1 is 0.02 and the median rank about 3,000.</w:t>
+      </w:r>
+      <w:r>
+        <w:t xml:space="preserve"> </w:t>
+      </w:r>
+      <w:r>
+        <w:t xml:space="preserve">The predicted recovery on the simulated patterns held in part (0.20 with every modelled effect, against 0.27</w:t>
+      </w:r>
+      <w:r>
+        <w:t xml:space="preserve"> </w:t>
+      </w:r>
+      <w:r>
+        <w:t xml:space="preserve">clean). The measured patterns therefore differ from our simulations in a way that barely affects fixed-grid</w:t>
+      </w:r>
+      <w:r>
+        <w:t xml:space="preserve"> </w:t>
+      </w:r>
+      <w:r>
+        <w:t xml:space="preserve">Pearson correlation but moves this model’s embeddings far. We have not identified it. Candidates include</w:t>
+      </w:r>
+      <w:r>
+        <w:t xml:space="preserve"> </w:t>
+      </w:r>
+      <w:r>
+        <w:t xml:space="preserve">instrument aberrations that a constant offset does not absorb (axial divergence, specimen transparency),</w:t>
+      </w:r>
+      <w:r>
+        <w:t xml:space="preserve"> </w:t>
+      </w:r>
+      <w:r>
+        <w:t xml:space="preserve">anisotropic broadening and real preferred orientation. One retrain, with one seed and a checkpoint chosen</w:t>
+      </w:r>
+      <w:r>
+        <w:t xml:space="preserve"> </w:t>
+      </w:r>
+      <w:r>
+        <w:t xml:space="preserve">on clean validation patterns, does not show that no training on these effects would transfer.</w:t>
       </w:r>
     </w:p>
     <w:p>
@@ -5059,19 +5311,31 @@
         <w:t xml:space="preserve"> </w:t>
       </w:r>
       <w:r>
-        <w:t xml:space="preserve">1,600), and 0.21 (about 270) with the retrained encoder. The classical scores do the same task, measured</w:t>
-      </w:r>
-      <w:r>
-        <w:t xml:space="preserve"> </w:t>
-      </w:r>
-      <w:r>
-        <w:t xml:space="preserve">pattern against simulated pattern, at 0.71–0.87. The pattern encoder itself, not only the step to the</w:t>
-      </w:r>
-      <w:r>
-        <w:t xml:space="preserve"> </w:t>
-      </w:r>
-      <w:r>
-        <w:t xml:space="preserve">structure encoder, places measured patterns away from simulations of the same structures.</w:t>
+        <w:t xml:space="preserve">1,600), and 0.21 (about 270) with the retrained encoder. The retrained encoder matches its own entries</w:t>
+      </w:r>
+      <w:r>
+        <w:t xml:space="preserve"> </w:t>
+      </w:r>
+      <w:r>
+        <w:t xml:space="preserve">rendered with every modelled effect to their clean versions at 0.92. Fixed-grid Pearson, which like the</w:t>
+      </w:r>
+      <w:r>
+        <w:t xml:space="preserve"> </w:t>
+      </w:r>
+      <w:r>
+        <w:t xml:space="preserve">encoder compares the two patterns point by point without an alignment search, does the measured task at</w:t>
+      </w:r>
+      <w:r>
+        <w:t xml:space="preserve"> </w:t>
+      </w:r>
+      <w:r>
+        <w:t xml:space="preserve">0.83. The pattern encoder itself, not only the step to the structure encoder, places measured patterns away</w:t>
+      </w:r>
+      <w:r>
+        <w:t xml:space="preserve"> </w:t>
+      </w:r>
+      <w:r>
+        <w:t xml:space="preserve">from simulations of the same structures.</w:t>
       </w:r>
     </w:p>
     <w:p>
@@ -5174,7 +5438,13 @@
         <w:t xml:space="preserve"> </w:t>
       </w:r>
       <w:r>
-        <w:t xml:space="preserve">Background-subtracted queries, no hubness correction.</w:t>
+        <w:t xml:space="preserve">Background-subtracted queries, no hubness correction. The variable-cell re-rank is not shown, since it ranks</w:t>
+      </w:r>
+      <w:r>
+        <w:t xml:space="preserve"> </w:t>
+      </w:r>
+      <w:r>
+        <w:t xml:space="preserve">only the ln q top 50.</w:t>
       </w:r>
     </w:p>
     <w:p>
@@ -5305,7 +5575,7 @@
         <w:t xml:space="preserve"> </w:t>
       </w:r>
       <w:r>
-        <w:t xml:space="preserve">paired against the full package, attribute that gain to the Kα2 nuisance (−0.03 [−0.07, −0.01] without it)</w:t>
+        <w:t xml:space="preserve">paired against the full package, point to the Kα2 nuisance for that gain (−0.03 [−0.07, −0.01] without it)</w:t>
       </w:r>
       <w:r>
         <w:t xml:space="preserve"> </w:t>
@@ -5317,25 +5587,43 @@
         <w:t xml:space="preserve"> </w:t>
       </w:r>
       <w:r>
-        <w:t xml:space="preserve">counts (+0.05 [0.02, 0.09] without it). We had expected every single-crystal score to rise; they move by</w:t>
-      </w:r>
-      <w:r>
-        <w:t xml:space="preserve"> </w:t>
-      </w:r>
-      <w:r>
-        <w:t xml:space="preserve">−0.04 to +0.04, with every interval including zero. The learned model scores 0.00 with this library on both</w:t>
-      </w:r>
-      <w:r>
-        <w:t xml:space="preserve"> </w:t>
-      </w:r>
-      <w:r>
-        <w:t xml:space="preserve">sets. The classical results are therefore robust to these choices of library simulation, and the</w:t>
-      </w:r>
-      <w:r>
-        <w:t xml:space="preserve"> </w:t>
-      </w:r>
-      <w:r>
-        <w:t xml:space="preserve">single-crystal failures are not caused by them.</w:t>
+        <w:t xml:space="preserve">counts (+0.05 [0.02, 0.09] without it). Three of these 50 intervals exclude zero, about as many as chance</w:t>
+      </w:r>
+      <w:r>
+        <w:t xml:space="preserve"> </w:t>
+      </w:r>
+      <w:r>
+        <w:t xml:space="preserve">would give, so we do not attribute effects to single changes. We had expected every single-crystal score to</w:t>
+      </w:r>
+      <w:r>
+        <w:t xml:space="preserve"> </w:t>
+      </w:r>
+      <w:r>
+        <w:t xml:space="preserve">rise; they move by −0.04 to +0.04, with every interval including zero. Two of the changes act on the queries</w:t>
+      </w:r>
+      <w:r>
+        <w:t xml:space="preserve"> </w:t>
+      </w:r>
+      <w:r>
+        <w:t xml:space="preserve">rather than the library (the Lorentz–polarisation conversion and the measured range), which is why the</w:t>
+      </w:r>
+      <w:r>
+        <w:t xml:space="preserve"> </w:t>
+      </w:r>
+      <w:r>
+        <w:t xml:space="preserve">learned model, whose library embeddings are unchanged, scores 0.00 with the package on both sets. The</w:t>
+      </w:r>
+      <w:r>
+        <w:t xml:space="preserve"> </w:t>
+      </w:r>
+      <w:r>
+        <w:t xml:space="preserve">classical results are robust to these choices of library simulation, which do not explain the single-crystal</w:t>
+      </w:r>
+      <w:r>
+        <w:t xml:space="preserve"> </w:t>
+      </w:r>
+      <w:r>
+        <w:t xml:space="preserve">failures.</w:t>
       </w:r>
     </w:p>
     <w:bookmarkEnd w:id="50"/>
@@ -5353,13 +5641,13 @@
         <w:pStyle w:val="FirstParagraph"/>
       </w:pPr>
       <w:r>
-        <w:t xml:space="preserve">Against the 108,902 COD entries, the 190 patterns reproduce the main result (Table 2). When any same-form</w:t>
-      </w:r>
-      <w:r>
-        <w:t xml:space="preserve"> </w:t>
-      </w:r>
-      <w:r>
-        <w:t xml:space="preserve">entry counts, the classical scores reach a compound-weighted top-1 of 0.77–0.90 (125 compounds; ln q</w:t>
+        <w:t xml:space="preserve">Against the 108,902 COD entries, the 190 patterns reproduce the main result when any same-form entry counts</w:t>
+      </w:r>
+      <w:r>
+        <w:t xml:space="preserve"> </w:t>
+      </w:r>
+      <w:r>
+        <w:t xml:space="preserve">(Table 2): the classical scores reach a compound-weighted top-1 of 0.77–0.90 (125 compounds; ln q</w:t>
       </w:r>
       <w:r>
         <w:t xml:space="preserve"> </w:t>
@@ -5371,19 +5659,49 @@
         <w:t xml:space="preserve"> </w:t>
       </w:r>
       <w:r>
-        <w:t xml:space="preserve">compounds; there the classical scores reach 0.26–0.58 and the model 0.00, with intervals too wide to order</w:t>
-      </w:r>
-      <w:r>
-        <w:t xml:space="preserve"> </w:t>
-      </w:r>
-      <w:r>
-        <w:t xml:space="preserve">the classical scores. The COD library is about a third of the size of the CSD library, and smaller libraries</w:t>
-      </w:r>
-      <w:r>
-        <w:t xml:space="preserve"> </w:t>
-      </w:r>
-      <w:r>
-        <w:t xml:space="preserve">favour every score (Fig. 3b). All numbers in this section can be regenerated without a CSD licence.</w:t>
+        <w:t xml:space="preserve">compounds; there the classical scores reach 0.26–0.58 and the model 0.00. This set cannot test the CSD</w:t>
+      </w:r>
+      <w:r>
+        <w:t xml:space="preserve"> </w:t>
+      </w:r>
+      <w:r>
+        <w:t xml:space="preserve">single-crystal result: 20 of its 35 patterns are ZZZUWK, scored against a 1950 room-temperature structure</w:t>
+      </w:r>
+      <w:r>
+        <w:t xml:space="preserve"> </w:t>
+      </w:r>
+      <w:r>
+        <w:t xml:space="preserve">that the CSD benchmark sets aside as not comparable, 8 are the naphthalene compression series, and the other</w:t>
+      </w:r>
+      <w:r>
+        <w:t xml:space="preserve"> </w:t>
+      </w:r>
+      <w:r>
+        <w:t xml:space="preserve">compounds have one pattern each; its 5 % cell window also leaves out, by construction, the large cell</w:t>
+      </w:r>
+      <w:r>
+        <w:t xml:space="preserve"> </w:t>
+      </w:r>
+      <w:r>
+        <w:t xml:space="preserve">differences that dominate the CSD failures (Section 4.2). The COD library is about a third of the size of</w:t>
+      </w:r>
+      <w:r>
+        <w:t xml:space="preserve"> </w:t>
+      </w:r>
+      <w:r>
+        <w:t xml:space="preserve">the CSD library, and smaller libraries favour every score (Fig. 3b). The classical numbers in this section</w:t>
+      </w:r>
+      <w:r>
+        <w:t xml:space="preserve"> </w:t>
+      </w:r>
+      <w:r>
+        <w:t xml:space="preserve">can be regenerated from open data alone; the model’s need the CSD-trained checkpoint, which is not</w:t>
+      </w:r>
+      <w:r>
+        <w:t xml:space="preserve"> </w:t>
+      </w:r>
+      <w:r>
+        <w:t xml:space="preserve">distributed, and can only be checked against the released ranks.</w:t>
       </w:r>
     </w:p>
     <w:p>
@@ -6021,55 +6339,61 @@
         <w:t xml:space="preserve"> </w:t>
       </w:r>
       <w:r>
-        <w:t xml:space="preserve">the bar is set by simple classical scores on background-subtracted patterns: a compound-weighted top-1 of</w:t>
-      </w:r>
-      <w:r>
-        <w:t xml:space="preserve"> </w:t>
-      </w:r>
-      <w:r>
-        <w:t xml:space="preserve">about 0.5 when the reference is an independent single-crystal structure, reached by the strain-tolerant</w:t>
-      </w:r>
-      <w:r>
-        <w:t xml:space="preserve"> </w:t>
-      </w:r>
-      <w:r>
-        <w:t xml:space="preserve">WCC and ln q scans and by a variable-cell re-rank, and of 0.83–0.87 when the pattern’s own powder-study entry is in the library, where even</w:t>
-      </w:r>
-      <w:r>
-        <w:t xml:space="preserve"> </w:t>
-      </w:r>
-      <w:r>
-        <w:t xml:space="preserve">fixed-grid Pearson correlation reaches 0.83. We suggest that learned PXRD retrieval be reported (i) on</w:t>
-      </w:r>
-      <w:r>
-        <w:t xml:space="preserve"> </w:t>
-      </w:r>
-      <w:r>
-        <w:t xml:space="preserve">measured patterns, (ii) against a library of realistic size, (iii) against shift- and strain-tolerant</w:t>
-      </w:r>
-      <w:r>
-        <w:t xml:space="preserve"> </w:t>
-      </w:r>
-      <w:r>
-        <w:t xml:space="preserve">correlation scores with background subtraction, (iv) with compound-weighted metrics and a compound-level</w:t>
-      </w:r>
-      <w:r>
-        <w:t xml:space="preserve"> </w:t>
-      </w:r>
-      <w:r>
-        <w:t xml:space="preserve">bootstrap whenever compounds repeat, and (v) separately for queries whose reference is an independent</w:t>
-      </w:r>
-      <w:r>
-        <w:t xml:space="preserve"> </w:t>
-      </w:r>
-      <w:r>
-        <w:t xml:space="preserve">determination. The benchmark released with this paper supports all five, and its open replica lets them be</w:t>
-      </w:r>
-      <w:r>
-        <w:t xml:space="preserve"> </w:t>
-      </w:r>
-      <w:r>
-        <w:t xml:space="preserve">checked without a CSD licence.</w:t>
+        <w:t xml:space="preserve">the bar is set by simple classical scores on background-subtracted patterns. When the reference is an</w:t>
+      </w:r>
+      <w:r>
+        <w:t xml:space="preserve"> </w:t>
+      </w:r>
+      <w:r>
+        <w:t xml:space="preserve">independent single-crystal structure, the shift- and strain-tolerant scores and the variable-cell re-rank</w:t>
+      </w:r>
+      <w:r>
+        <w:t xml:space="preserve"> </w:t>
+      </w:r>
+      <w:r>
+        <w:t xml:space="preserve">reach a compound-weighted top-1 of 0.40–0.53 (0.47–0.64 without the pressure series); when the pattern’s</w:t>
+      </w:r>
+      <w:r>
+        <w:t xml:space="preserve"> </w:t>
+      </w:r>
+      <w:r>
+        <w:t xml:space="preserve">own powder-study entry is in the library, they reach up to 0.87, and even fixed-grid Pearson correlation</w:t>
+      </w:r>
+      <w:r>
+        <w:t xml:space="preserve"> </w:t>
+      </w:r>
+      <w:r>
+        <w:t xml:space="preserve">reaches 0.83. We suggest that learned PXRD retrieval be reported (i) on measured patterns, (ii) against a</w:t>
+      </w:r>
+      <w:r>
+        <w:t xml:space="preserve"> </w:t>
+      </w:r>
+      <w:r>
+        <w:t xml:space="preserve">library of realistic size, (iii) against shift- and strain-tolerant correlation scores with background</w:t>
+      </w:r>
+      <w:r>
+        <w:t xml:space="preserve"> </w:t>
+      </w:r>
+      <w:r>
+        <w:t xml:space="preserve">subtraction, (iv) with compound-weighted metrics and a compound-level bootstrap whenever compounds repeat,</w:t>
+      </w:r>
+      <w:r>
+        <w:t xml:space="preserve"> </w:t>
+      </w:r>
+      <w:r>
+        <w:t xml:space="preserve">and (v) separately for queries whose reference is an independent determination, with their measurement</w:t>
+      </w:r>
+      <w:r>
+        <w:t xml:space="preserve"> </w:t>
+      </w:r>
+      <w:r>
+        <w:t xml:space="preserve">conditions recorded. The benchmark released with this paper supports all five, and its open replica lets</w:t>
+      </w:r>
+      <w:r>
+        <w:t xml:space="preserve"> </w:t>
+      </w:r>
+      <w:r>
+        <w:t xml:space="preserve">the any-same-form results be checked without a CSD licence.</w:t>
       </w:r>
     </w:p>
     <w:p>
@@ -6147,13 +6471,19 @@
         <w:t xml:space="preserve"> </w:t>
       </w:r>
       <w:r>
-        <w:t xml:space="preserve">and measured patterns. For independent single-crystal references, retrieval fails once the cells differ by</w:t>
-      </w:r>
-      <w:r>
-        <w:t xml:space="preserve"> </w:t>
-      </w:r>
-      <w:r>
-        <w:t xml:space="preserve">more than about 1 %. The published variable-cell method</w:t>
+        <w:t xml:space="preserve">and measured patterns. For independent single-crystal references, retrieval fails when the reference was</w:t>
+      </w:r>
+      <w:r>
+        <w:t xml:space="preserve"> </w:t>
+      </w:r>
+      <w:r>
+        <w:t xml:space="preserve">determined at another pressure or temperature and the cells differ anisotropically by more than about 1 %.</w:t>
+      </w:r>
+      <w:r>
+        <w:t xml:space="preserve"> </w:t>
+      </w:r>
+      <w:r>
+        <w:t xml:space="preserve">The published variable-cell method</w:t>
       </w:r>
       <w:hyperlink w:anchor="ref-oterodelaroza2024vcgpwdf">
         <w:r>
@@ -6168,37 +6498,37 @@
         <w:t xml:space="preserve"> </w:t>
       </w:r>
       <w:r>
-        <w:t xml:space="preserve">recovers few of these</w:t>
-      </w:r>
-      <w:r>
-        <w:t xml:space="preserve"> </w:t>
-      </w:r>
-      <w:r>
-        <w:t xml:space="preserve">cases and is bounded by the shortlist it re-ranks, so the case stays open for classical methods too, and it is</w:t>
-      </w:r>
-      <w:r>
-        <w:t xml:space="preserve"> </w:t>
-      </w:r>
-      <w:r>
-        <w:t xml:space="preserve">where a learned method could show its value. For the learned model, the failure is the transfer from</w:t>
-      </w:r>
-      <w:r>
-        <w:t xml:space="preserve"> </w:t>
-      </w:r>
-      <w:r>
-        <w:t xml:space="preserve">simulated to measured patterns, not the size of the library, and it survives a retrain with every</w:t>
-      </w:r>
-      <w:r>
-        <w:t xml:space="preserve"> </w:t>
-      </w:r>
-      <w:r>
-        <w:t xml:space="preserve">measurement effect we could simulate. Full-profile generative models have shown the same sensitivity to how</w:t>
-      </w:r>
-      <w:r>
-        <w:t xml:space="preserve"> </w:t>
-      </w:r>
-      <w:r>
-        <w:t xml:space="preserve">realistic the training patterns are</w:t>
+        <w:t xml:space="preserve">gives no resolved gain here, is bounded</w:t>
+      </w:r>
+      <w:r>
+        <w:t xml:space="preserve"> </w:t>
+      </w:r>
+      <w:r>
+        <w:t xml:space="preserve">by the shortlist it re-ranks, and in its automated form fits peaks poorly on the high-pressure patterns that</w:t>
+      </w:r>
+      <w:r>
+        <w:t xml:space="preserve"> </w:t>
+      </w:r>
+      <w:r>
+        <w:t xml:space="preserve">make up most of the mismatched cells, so this case stays open for classical methods too, and it is where a</w:t>
+      </w:r>
+      <w:r>
+        <w:t xml:space="preserve"> </w:t>
+      </w:r>
+      <w:r>
+        <w:t xml:space="preserve">learned method could show its value. For the learned model, the failure is the transfer from simulated to measured patterns,</w:t>
+      </w:r>
+      <w:r>
+        <w:t xml:space="preserve"> </w:t>
+      </w:r>
+      <w:r>
+        <w:t xml:space="preserve">not the size of the library, and it survives a retrain with the five modelled effects of Section 3.4.</w:t>
+      </w:r>
+      <w:r>
+        <w:t xml:space="preserve"> </w:t>
+      </w:r>
+      <w:r>
+        <w:t xml:space="preserve">Full-profile generative models have shown the same sensitivity to how realistic the training patterns are</w:t>
       </w:r>
       <w:hyperlink w:anchor="ref-segal2026xrdiff">
         <w:r>
@@ -6210,19 +6540,19 @@
         </w:r>
       </w:hyperlink>
       <w:r>
-        <w:t xml:space="preserve">. A learned method aimed at that transfer, for example</w:t>
-      </w:r>
-      <w:r>
-        <w:t xml:space="preserve"> </w:t>
-      </w:r>
-      <w:r>
-        <w:t xml:space="preserve">one adapted with measured patterns rather than with more simulated effects, is the more promising use of</w:t>
-      </w:r>
-      <w:r>
-        <w:t xml:space="preserve"> </w:t>
-      </w:r>
-      <w:r>
-        <w:t xml:space="preserve">learning than a stand-alone retriever.</w:t>
+        <w:t xml:space="preserve">. A learned method aimed at that transfer, for example one adapted with measured patterns</w:t>
+      </w:r>
+      <w:r>
+        <w:t xml:space="preserve"> </w:t>
+      </w:r>
+      <w:r>
+        <w:t xml:space="preserve">rather than with more simulated effects, is the more promising use of learning than a stand-alone</w:t>
+      </w:r>
+      <w:r>
+        <w:t xml:space="preserve"> </w:t>
+      </w:r>
+      <w:r>
+        <w:t xml:space="preserve">retriever.</w:t>
       </w:r>
     </w:p>
     <w:p>
@@ -6246,73 +6576,103 @@
         <w:t xml:space="preserve"> </w:t>
       </w:r>
       <w:r>
-        <w:t xml:space="preserve">simulation; another architecture, loss or training strategy could do better, and our conclusions about</w:t>
-      </w:r>
-      <w:r>
-        <w:t xml:space="preserve"> </w:t>
-      </w:r>
-      <w:r>
-        <w:t xml:space="preserve">learning are about this model. The benchmark has 123 compounds, all organic, from one contributor to opXRD,</w:t>
-      </w:r>
-      <w:r>
-        <w:t xml:space="preserve"> </w:t>
-      </w:r>
-      <w:r>
-        <w:t xml:space="preserve">and most patterns are the data their own entry was refined against; the single-crystal set has 30</w:t>
-      </w:r>
-      <w:r>
-        <w:t xml:space="preserve"> </w:t>
-      </w:r>
-      <w:r>
-        <w:t xml:space="preserve">compounds, so its intervals are wide, and that of the open replica only 9. The main library is simulated</w:t>
-      </w:r>
-      <w:r>
-        <w:t xml:space="preserve"> </w:t>
-      </w:r>
-      <w:r>
-        <w:t xml:space="preserve">with one peak profile and without Debye–Waller factors or Kα2; a package of such changes moved little</w:t>
-      </w:r>
-      <w:r>
-        <w:t xml:space="preserve"> </w:t>
-      </w:r>
-      <w:r>
-        <w:t xml:space="preserve">(Section 4.6) but does not exhaust them, and disordered entries are simulated only approximately. The</w:t>
-      </w:r>
-      <w:r>
-        <w:t xml:space="preserve"> </w:t>
-      </w:r>
-      <w:r>
-        <w:t xml:space="preserve">measured patterns have a simple background removal. The zero scans use fixed offset grids (0.02°, and</w:t>
-      </w:r>
-      <w:r>
-        <w:t xml:space="preserve"> </w:t>
-      </w:r>
-      <w:r>
-        <w:t xml:space="preserve">0.04° for the ln q scan), and the variable-cell re-rank covers a shortlist of 50 with a 4-hour limit per</w:t>
-      </w:r>
-      <w:r>
-        <w:t xml:space="preserve"> </w:t>
-      </w:r>
-      <w:r>
-        <w:t xml:space="preserve">comparison. The correct answers rely on packing similarity, set aside</w:t>
-      </w:r>
-      <w:r>
-        <w:t xml:space="preserve"> </w:t>
-      </w:r>
-      <w:r>
-        <w:t xml:space="preserve">entries that cannot be compared, and contain one known error (Section 2.2). Retrieval identifies known</w:t>
-      </w:r>
-      <w:r>
-        <w:t xml:space="preserve"> </w:t>
-      </w:r>
-      <w:r>
-        <w:t xml:space="preserve">forms only; crystal structure prediction combined with pattern matching can identify forms that no</w:t>
-      </w:r>
-      <w:r>
-        <w:t xml:space="preserve"> </w:t>
-      </w:r>
-      <w:r>
-        <w:t xml:space="preserve">database contains</w:t>
+        <w:t xml:space="preserve">simulation, each with one seed and a checkpoint chosen on clean validation patterns; another architecture,</w:t>
+      </w:r>
+      <w:r>
+        <w:t xml:space="preserve"> </w:t>
+      </w:r>
+      <w:r>
+        <w:t xml:space="preserve">loss or training strategy could do better, and our conclusions about learning are about this model. The</w:t>
+      </w:r>
+      <w:r>
+        <w:t xml:space="preserve"> </w:t>
+      </w:r>
+      <w:r>
+        <w:t xml:space="preserve">benchmark has 123 compounds, all organic, from one contributor to opXRD, and most patterns are the data</w:t>
+      </w:r>
+      <w:r>
+        <w:t xml:space="preserve"> </w:t>
+      </w:r>
+      <w:r>
+        <w:t xml:space="preserve">their own entry was refined against. The single-crystal set has 30 compounds, so its intervals are wide;</w:t>
+      </w:r>
+      <w:r>
+        <w:t xml:space="preserve"> </w:t>
+      </w:r>
+      <w:r>
+        <w:t xml:space="preserve">22 of its 59 patterns come from variable-pressure studies, and the open replica’s single-crystal set has only</w:t>
+      </w:r>
+      <w:r>
+        <w:t xml:space="preserve"> </w:t>
+      </w:r>
+      <w:r>
+        <w:t xml:space="preserve">9 compounds. The main library is simulated with one peak profile and without Debye–Waller factors or Kα2; a</w:t>
+      </w:r>
+      <w:r>
+        <w:t xml:space="preserve"> </w:t>
+      </w:r>
+      <w:r>
+        <w:t xml:space="preserve">package of such changes moved little (Section 4.6) but does not exhaust them, uses one Debye–Waller factor</w:t>
+      </w:r>
+      <w:r>
+        <w:t xml:space="preserve"> </w:t>
+      </w:r>
+      <w:r>
+        <w:t xml:space="preserve">for every temperature, and disordered entries are simulated only approximately. The measured patterns have a</w:t>
+      </w:r>
+      <w:r>
+        <w:t xml:space="preserve"> </w:t>
+      </w:r>
+      <w:r>
+        <w:t xml:space="preserve">simple background removal and are interpolated onto the Cu grid, which can miss the tops of narrow</w:t>
+      </w:r>
+      <w:r>
+        <w:t xml:space="preserve"> </w:t>
+      </w:r>
+      <w:r>
+        <w:t xml:space="preserve">synchrotron peaks. The zero scans use fixed offset grids (0.02°, and 0.04° for the ln q scan). The effect</w:t>
+      </w:r>
+      <w:r>
+        <w:t xml:space="preserve"> </w:t>
+      </w:r>
+      <w:r>
+        <w:t xml:space="preserve">ladder adds Kα2 to every laboratory Cu pattern and does not estimate the intensity jitter. The variable-cell</w:t>
+      </w:r>
+      <w:r>
+        <w:t xml:space="preserve"> </w:t>
+      </w:r>
+      <w:r>
+        <w:t xml:space="preserve">re-rank covers a shortlist of 50 with a 4-hour limit per comparison, uses no zero-offset correction, reaches</w:t>
+      </w:r>
+      <w:r>
+        <w:t xml:space="preserve"> </w:t>
+      </w:r>
+      <w:r>
+        <w:t xml:space="preserve">only cell differences within ±10 % and ±5°, and fits peaks poorly on the high-pressure synchrotron patterns.</w:t>
+      </w:r>
+      <w:r>
+        <w:t xml:space="preserve"> </w:t>
+      </w:r>
+      <w:r>
+        <w:t xml:space="preserve">The correct answers rely on packing similarity, which can count entries as one form across a phase</w:t>
+      </w:r>
+      <w:r>
+        <w:t xml:space="preserve"> </w:t>
+      </w:r>
+      <w:r>
+        <w:t xml:space="preserve">transition that preserves the packing, set aside entries that cannot be</w:t>
+      </w:r>
+      <w:r>
+        <w:t xml:space="preserve"> </w:t>
+      </w:r>
+      <w:r>
+        <w:t xml:space="preserve">compared, and contain one known error (Section 2.2). Retrieval identifies known forms only; crystal</w:t>
+      </w:r>
+      <w:r>
+        <w:t xml:space="preserve"> </w:t>
+      </w:r>
+      <w:r>
+        <w:t xml:space="preserve">structure prediction combined with pattern matching can identify forms that no database contains</w:t>
       </w:r>
       <w:hyperlink w:anchor="ref-glick2025csp">
         <w:r>
@@ -6354,7 +6714,7 @@
         <w:t xml:space="preserve"> </w:t>
       </w:r>
       <w:r>
-        <w:t xml:space="preserve">matching; with independent single-crystal references, 0.00 against 0.30–0.50, and 0.50 for a</w:t>
+        <w:t xml:space="preserve">matching; with independent single-crystal references, 0.00 against 0.30–0.50, and 0.53 for a</w:t>
       </w:r>
       <w:r>
         <w:t xml:space="preserve"> </w:t>
@@ -6366,43 +6726,49 @@
         <w:t xml:space="preserve"> </w:t>
       </w:r>
       <w:r>
-        <w:t xml:space="preserve">simulated patterns of the same targets, and a retrain with the measurement effects we could simulate fixes</w:t>
-      </w:r>
-      <w:r>
-        <w:t xml:space="preserve"> </w:t>
-      </w:r>
-      <w:r>
-        <w:t xml:space="preserve">those effects in simulation but not on the measured patterns, so its failure lies in a part of the step</w:t>
-      </w:r>
-      <w:r>
-        <w:t xml:space="preserve"> </w:t>
-      </w:r>
-      <w:r>
-        <w:t xml:space="preserve">from simulated to measured data that we did not model. A more realistic library and an open replica built</w:t>
-      </w:r>
-      <w:r>
-        <w:t xml:space="preserve"> </w:t>
-      </w:r>
-      <w:r>
-        <w:t xml:space="preserve">from the COD give the same picture. The hard open case is a</w:t>
-      </w:r>
-      <w:r>
-        <w:t xml:space="preserve"> </w:t>
-      </w:r>
-      <w:r>
-        <w:t xml:space="preserve">measured pattern whose only reference is an independent single-crystal structure with a cell that differs</w:t>
-      </w:r>
-      <w:r>
-        <w:t xml:space="preserve"> </w:t>
-      </w:r>
-      <w:r>
-        <w:t xml:space="preserve">by more than about 1 %. We release the benchmark so that learned methods can be compared with these numbers</w:t>
-      </w:r>
-      <w:r>
-        <w:t xml:space="preserve"> </w:t>
-      </w:r>
-      <w:r>
-        <w:t xml:space="preserve">on measured data.</w:t>
+        <w:t xml:space="preserve">simulated patterns of the same targets, and a retrain with five modelled measurement effects handles those</w:t>
+      </w:r>
+      <w:r>
+        <w:t xml:space="preserve"> </w:t>
+      </w:r>
+      <w:r>
+        <w:t xml:space="preserve">effects in simulation but not on the measured patterns, so its failure lies in differences between</w:t>
+      </w:r>
+      <w:r>
+        <w:t xml:space="preserve"> </w:t>
+      </w:r>
+      <w:r>
+        <w:t xml:space="preserve">measured and simulated patterns that our simulation does not reproduce. A more realistic library leaves the</w:t>
+      </w:r>
+      <w:r>
+        <w:t xml:space="preserve"> </w:t>
+      </w:r>
+      <w:r>
+        <w:t xml:space="preserve">classical results unchanged, and an open replica built from the COD reproduces the any-same-form result.</w:t>
+      </w:r>
+      <w:r>
+        <w:t xml:space="preserve"> </w:t>
+      </w:r>
+      <w:r>
+        <w:t xml:space="preserve">The hard open case is a measured pattern whose only reference was determined at another temperature or</w:t>
+      </w:r>
+      <w:r>
+        <w:t xml:space="preserve"> </w:t>
+      </w:r>
+      <w:r>
+        <w:t xml:space="preserve">pressure, so that the cells differ anisotropically by more than about 1 %; in this benchmark most such</w:t>
+      </w:r>
+      <w:r>
+        <w:t xml:space="preserve"> </w:t>
+      </w:r>
+      <w:r>
+        <w:t xml:space="preserve">patterns come from compression series. We release the benchmark so that learned methods can be compared</w:t>
+      </w:r>
+      <w:r>
+        <w:t xml:space="preserve"> </w:t>
+      </w:r>
+      <w:r>
+        <w:t xml:space="preserve">with these numbers on measured data.</w:t>
       </w:r>
     </w:p>
     <w:bookmarkEnd w:id="54"/>
@@ -6438,37 +6804,67 @@
         <w:t xml:space="preserve"> </w:t>
       </w:r>
       <w:r>
-        <w:t xml:space="preserve">every score and correction, including the learned model’s and the variable-cell re-rank’s; the scripts</w:t>
-      </w:r>
-      <w:r>
-        <w:t xml:space="preserve"> </w:t>
-      </w:r>
-      <w:r>
-        <w:t xml:space="preserve">that build the library from a CSD installation, compute the scores (CPU and GPU) and regenerate every table</w:t>
-      </w:r>
-      <w:r>
-        <w:t xml:space="preserve"> </w:t>
-      </w:r>
-      <w:r>
-        <w:t xml:space="preserve">and figure; and results/paper_numbers.json, from which every number in this article is checked by</w:t>
-      </w:r>
-      <w:r>
-        <w:t xml:space="preserve"> </w:t>
-      </w:r>
-      <w:r>
-        <w:t xml:space="preserve">scripts/verify_claims.py. The open replica of Section 2.6 is included in full: the COD identifiers, the</w:t>
-      </w:r>
-      <w:r>
-        <w:t xml:space="preserve"> </w:t>
-      </w:r>
-      <w:r>
-        <w:t xml:space="preserve">simulated COD library, its answer sets and the ranks of every score, from which Section 4.7 and Table 2 can</w:t>
-      </w:r>
-      <w:r>
-        <w:t xml:space="preserve"> </w:t>
-      </w:r>
-      <w:r>
-        <w:t xml:space="preserve">be reproduced without a CSD licence. The measured patterns are from opXRD</w:t>
+        <w:t xml:space="preserve">every score and correction, including the learned model’s and the variable-cell re-rank’s; the</w:t>
+      </w:r>
+      <w:r>
+        <w:t xml:space="preserve"> </w:t>
+      </w:r>
+      <w:r>
+        <w:t xml:space="preserve">critic2 inputs derived from the opXRD patterns (cut patterns, background and peak fits, command files) and</w:t>
+      </w:r>
+      <w:r>
+        <w:t xml:space="preserve"> </w:t>
+      </w:r>
+      <w:r>
+        <w:t xml:space="preserve">the measurement conditions of the single-crystal patterns; the scripts that build the library from a CSD</w:t>
+      </w:r>
+      <w:r>
+        <w:t xml:space="preserve"> </w:t>
+      </w:r>
+      <w:r>
+        <w:t xml:space="preserve">installation, compute the scores (CPU and GPU) and regenerate every table and figure; and</w:t>
+      </w:r>
+      <w:r>
+        <w:t xml:space="preserve"> </w:t>
+      </w:r>
+      <w:r>
+        <w:t xml:space="preserve">results/paper_numbers.json, from which every number in this article is checked by scripts/verify_claims.py.</w:t>
+      </w:r>
+      <w:r>
+        <w:t xml:space="preserve"> </w:t>
+      </w:r>
+      <w:r>
+        <w:t xml:space="preserve">The open replica of Section 2.6 is included in full: the COD identifiers, the simulated COD library, its</w:t>
+      </w:r>
+      <w:r>
+        <w:t xml:space="preserve"> </w:t>
+      </w:r>
+      <w:r>
+        <w:t xml:space="preserve">answer sets and the ranks of every score, from which the classical results of Section 4.7 and the COD</w:t>
+      </w:r>
+      <w:r>
+        <w:t xml:space="preserve"> </w:t>
+      </w:r>
+      <w:r>
+        <w:t xml:space="preserve">columns of Table 2 can be reproduced without a CSD licence. The CSD library was built from the May 2026</w:t>
+      </w:r>
+      <w:r>
+        <w:t xml:space="preserve"> </w:t>
+      </w:r>
+      <w:r>
+        <w:t xml:space="preserve">release (1,451,367 entries; CSD Python API 3.7.1) and the measurement conditions were read from a later</w:t>
+      </w:r>
+      <w:r>
+        <w:t xml:space="preserve"> </w:t>
+      </w:r>
+      <w:r>
+        <w:t xml:space="preserve">update (1,469,017 entries; API 3.8.0); the COD was downloaded on 12–13 October 2026; the opXRD patterns are</w:t>
+      </w:r>
+      <w:r>
+        <w:t xml:space="preserve"> </w:t>
+      </w:r>
+      <w:r>
+        <w:t xml:space="preserve">from the Zenodo record 10.5281/zenodo.15298026. The measured patterns are from opXRD</w:t>
       </w:r>
       <w:hyperlink w:anchor="ref-opxrd2025zenodo">
         <w:r>

</xml_diff>

<commit_message>
Retarget to RSC Advances: RSC section order, CRediT, AI statement, 18 Kaduk reports cited, spec + cover letter draft + audit 23/23; redact box IP and ICDD staff name in todo
</commit_message>
<xml_diff>
--- a/paper/dd/manuscript.docx
+++ b/paper/dd/manuscript.docx
@@ -5799,7 +5799,37 @@
         <w:t xml:space="preserve"> </w:t>
       </w:r>
       <w:r>
-        <w:t xml:space="preserve">reports in Powder Diffraction (19 patterns, 16 of them synchrotron) were scored after the analysis above was</w:t>
+        <w:t xml:space="preserve">reports in Powder Diffraction (19 patterns, 16 of them synchrotron)</w:t>
+      </w:r>
+      <w:hyperlink w:anchor="ref-kaduk2015tramadol">
+        <w:r>
+          <w:rPr>
+            <w:rStyle w:val="Hyperlink"/>
+            <w:vertAlign w:val="superscript"/>
+          </w:rPr>
+          <w:t xml:space="preserve">42</w:t>
+        </w:r>
+      </w:hyperlink>
+      <w:r>
+        <w:rPr>
+          <w:vertAlign w:val="superscript"/>
+        </w:rPr>
+        <w:t xml:space="preserve">–</w:t>
+      </w:r>
+      <w:hyperlink w:anchor="ref-reid2021donepezil">
+        <w:r>
+          <w:rPr>
+            <w:rStyle w:val="Hyperlink"/>
+            <w:vertAlign w:val="superscript"/>
+          </w:rPr>
+          <w:t xml:space="preserve">59</w:t>
+        </w:r>
+      </w:hyperlink>
+      <w:r>
+        <w:t xml:space="preserve"> </w:t>
+      </w:r>
+      <w:r>
+        <w:t xml:space="preserve">were scored after the analysis above was</w:t>
       </w:r>
       <w:r>
         <w:t xml:space="preserve"> </w:t>
@@ -6820,7 +6850,7 @@
             <w:rStyle w:val="Hyperlink"/>
             <w:vertAlign w:val="superscript"/>
           </w:rPr>
-          <w:t xml:space="preserve">42</w:t>
+          <w:t xml:space="preserve">60</w:t>
         </w:r>
       </w:hyperlink>
       <w:r>
@@ -6912,12 +6942,54 @@
       </w:r>
     </w:p>
     <w:bookmarkEnd w:id="54"/>
-    <w:bookmarkStart w:id="55" w:name="data-availability"/>
+    <w:bookmarkStart w:id="55" w:name="author-contributions"/>
     <w:p>
       <w:pPr>
         <w:pStyle w:val="Heading2"/>
       </w:pPr>
       <w:r>
+        <w:t xml:space="preserve">Author contributions</w:t>
+      </w:r>
+    </w:p>
+    <w:p>
+      <w:pPr>
+        <w:pStyle w:val="FirstParagraph"/>
+      </w:pPr>
+      <w:r>
+        <w:t xml:space="preserve">Frank Cai: conceptualization, methodology, software, formal analysis, investigation, data curation,</w:t>
+      </w:r>
+      <w:r>
+        <w:t xml:space="preserve"> </w:t>
+      </w:r>
+      <w:r>
+        <w:t xml:space="preserve">visualization, writing – original draft, writing – review &amp; editing.</w:t>
+      </w:r>
+    </w:p>
+    <w:bookmarkEnd w:id="55"/>
+    <w:bookmarkStart w:id="56" w:name="conflicts-of-interest"/>
+    <w:p>
+      <w:pPr>
+        <w:pStyle w:val="Heading2"/>
+      </w:pPr>
+      <w:r>
+        <w:t xml:space="preserve">Conflicts of interest</w:t>
+      </w:r>
+    </w:p>
+    <w:p>
+      <w:pPr>
+        <w:pStyle w:val="FirstParagraph"/>
+      </w:pPr>
+      <w:r>
+        <w:t xml:space="preserve">There are no conflicts to declare.</w:t>
+      </w:r>
+    </w:p>
+    <w:bookmarkEnd w:id="56"/>
+    <w:bookmarkStart w:id="57" w:name="data-availability"/>
+    <w:p>
+      <w:pPr>
+        <w:pStyle w:val="Heading2"/>
+      </w:pPr>
+      <w:r>
         <w:t xml:space="preserve">Data availability</w:t>
       </w:r>
     </w:p>
@@ -6926,13 +6998,13 @@
         <w:pStyle w:val="FirstParagraph"/>
       </w:pPr>
       <w:r>
-        <w:t xml:space="preserve">The code, the benchmark definition and all results are available at [GitHub URL] and archived at Zenodo</w:t>
-      </w:r>
-      <w:r>
-        <w:t xml:space="preserve"> </w:t>
-      </w:r>
-      <w:r>
-        <w:t xml:space="preserve">([DOI]). The deposit contains: the opXRD pattern identifiers with their CSD refcodes, same-form sets and</w:t>
+        <w:t xml:space="preserve">The code, the benchmark definition and all results are available at https://github.com/fronkt/xrd-clip and archived at Zenodo</w:t>
+      </w:r>
+      <w:r>
+        <w:t xml:space="preserve"> </w:t>
+      </w:r>
+      <w:r>
+        <w:t xml:space="preserve">(https://doi.org/[ZENODO DOI]). The deposit contains: the opXRD pattern identifiers with their CSD refcodes, same-form sets and</w:t>
       </w:r>
       <w:r>
         <w:t xml:space="preserve"> </w:t>
@@ -7039,41 +7111,35 @@
       <w:r>
         <w:t xml:space="preserve">original and the retrained one, were trained on CSD data and are not distributed.</w:t>
       </w:r>
-    </w:p>
-    <w:bookmarkEnd w:id="55"/>
-    <w:bookmarkStart w:id="56" w:name="author-contributions"/>
-    <w:p>
-      <w:pPr>
-        <w:pStyle w:val="Heading2"/>
-      </w:pPr>
-      <w:r>
-        <w:t xml:space="preserve">Author contributions</w:t>
-      </w:r>
-    </w:p>
-    <w:p>
-      <w:pPr>
-        <w:pStyle w:val="FirstParagraph"/>
-      </w:pPr>
-      <w:r>
-        <w:t xml:space="preserve">F. C. conceived the study, wrote the code, ran the computations and analysis, and wrote the manuscript.</w:t>
-      </w:r>
-    </w:p>
-    <w:bookmarkEnd w:id="56"/>
-    <w:bookmarkStart w:id="57" w:name="conflicts-of-interest"/>
-    <w:p>
-      <w:pPr>
-        <w:pStyle w:val="Heading2"/>
-      </w:pPr>
-      <w:r>
-        <w:t xml:space="preserve">Conflicts of interest</w:t>
-      </w:r>
-    </w:p>
-    <w:p>
-      <w:pPr>
-        <w:pStyle w:val="FirstParagraph"/>
-      </w:pPr>
-      <w:r>
-        <w:t xml:space="preserve">There are no conflicts to declare.</w:t>
+      <w:r>
+        <w:t xml:space="preserve"> </w:t>
+      </w:r>
+      <w:r>
+        <w:t xml:space="preserve">The external set of Section 4.7 uses the measured profiles in the supplementary CIFs of the cited Powder</w:t>
+      </w:r>
+      <w:r>
+        <w:t xml:space="preserve"> </w:t>
+      </w:r>
+      <w:r>
+        <w:t xml:space="preserve">Diffraction reports, which can be downloaded from Cambridge Core, and, for donepezil hydrochloride form III,</w:t>
+      </w:r>
+      <w:r>
+        <w:t xml:space="preserve"> </w:t>
+      </w:r>
+      <w:r>
+        <w:t xml:space="preserve">the CIF deposited with the ICDD; these profiles are not redistributed, and the deposit contains their</w:t>
+      </w:r>
+      <w:r>
+        <w:t xml:space="preserve"> </w:t>
+      </w:r>
+      <w:r>
+        <w:t xml:space="preserve">refcodes, the extraction script and the per-pattern ranks. The reports listed in ESI Table S24 are</w:t>
+      </w:r>
+      <w:r>
+        <w:t xml:space="preserve"> </w:t>
+      </w:r>
+      <w:r>
+        <w:t xml:space="preserve">cited in the article’s reference list.</w:t>
       </w:r>
     </w:p>
     <w:bookmarkEnd w:id="57"/>
@@ -7097,23 +7163,65 @@
         <w:t xml:space="preserve"> </w:t>
       </w:r>
       <w:r>
-        <w:t xml:space="preserve">and the CCDC for the CSD and its Python API. GPU time was rented from commercial cloud providers. This</w:t>
-      </w:r>
-      <w:r>
-        <w:t xml:space="preserve"> </w:t>
-      </w:r>
-      <w:r>
-        <w:t xml:space="preserve">research received no specific grant from any funding agency in the public, commercial, or not-for-profit</w:t>
-      </w:r>
-      <w:r>
-        <w:t xml:space="preserve"> </w:t>
-      </w:r>
-      <w:r>
-        <w:t xml:space="preserve">sectors. [AI-use statement: FRANK, in his own words; RSC asks for it here.]</w:t>
+        <w:t xml:space="preserve">the CCDC for the CSD and its Python API, and the ICDD for providing the deposited donepezil hydrochloride</w:t>
+      </w:r>
+      <w:r>
+        <w:t xml:space="preserve"> </w:t>
+      </w:r>
+      <w:r>
+        <w:t xml:space="preserve">CIF. GPU time was rented from commercial cloud providers. This research received no specific grant from</w:t>
+      </w:r>
+      <w:r>
+        <w:t xml:space="preserve"> </w:t>
+      </w:r>
+      <w:r>
+        <w:t xml:space="preserve">any funding agency in the public, commercial, or not-for-profit sectors.</w:t>
+      </w:r>
+    </w:p>
+    <w:p>
+      <w:pPr>
+        <w:pStyle w:val="BodyText"/>
+      </w:pPr>
+      <w:r>
+        <w:rPr>
+          <w:i/>
+          <w:iCs/>
+        </w:rPr>
+        <w:t xml:space="preserve">Use of AI tools.</w:t>
+      </w:r>
+      <w:r>
+        <w:t xml:space="preserve"> </w:t>
+      </w:r>
+      <w:r>
+        <w:t xml:space="preserve">The author used a large language model (Claude, Anthropic), through the Claude Fable 5.1</w:t>
+      </w:r>
+      <w:r>
+        <w:t xml:space="preserve"> </w:t>
+      </w:r>
+      <w:r>
+        <w:t xml:space="preserve">and Opus 5.5, under the author’s direction, to cross-check the statistical analyses and internal audits</w:t>
+      </w:r>
+      <w:r>
+        <w:t xml:space="preserve"> </w:t>
+      </w:r>
+      <w:r>
+        <w:t xml:space="preserve">described in the ESI, and to edit and review text. All code, data and results are deposited (see Data</w:t>
+      </w:r>
+      <w:r>
+        <w:t xml:space="preserve"> </w:t>
+      </w:r>
+      <w:r>
+        <w:t xml:space="preserve">availability) so that every number can be regenerated independently. The author designed the study,</w:t>
+      </w:r>
+      <w:r>
+        <w:t xml:space="preserve"> </w:t>
+      </w:r>
+      <w:r>
+        <w:t xml:space="preserve">reviewed all code, results and text, and takes full responsibility for the content.</w:t>
       </w:r>
     </w:p>
     <w:bookmarkEnd w:id="58"/>
-    <w:bookmarkStart w:id="132" w:name="notes-and-references"/>
+    <w:bookmarkStart w:id="168" w:name="notes-and-references"/>
     <w:p>
       <w:pPr>
         <w:pStyle w:val="Heading2"/>
@@ -7122,7 +7230,7 @@
         <w:t xml:space="preserve">Notes and references</w:t>
       </w:r>
     </w:p>
-    <w:bookmarkStart w:id="131" w:name="refs"/>
+    <w:bookmarkStart w:id="167" w:name="refs"/>
     <w:bookmarkStart w:id="60" w:name="ref-gatesrector2019pdf"/>
     <w:p>
       <w:pPr>
@@ -9405,13 +9513,1219 @@
       </w:r>
     </w:p>
     <w:bookmarkEnd w:id="129"/>
-    <w:bookmarkStart w:id="130" w:name="ref-glick2025csp"/>
+    <w:bookmarkStart w:id="131" w:name="ref-kaduk2015tramadol"/>
     <w:p>
       <w:pPr>
         <w:pStyle w:val="Bibliography"/>
       </w:pPr>
       <w:r>
         <w:t xml:space="preserve">42</w:t>
+      </w:r>
+      <w:r>
+        <w:t xml:space="preserve"> </w:t>
+      </w:r>
+      <w:r>
+        <w:t xml:space="preserve">	</w:t>
+      </w:r>
+      <w:hyperlink r:id="rId130">
+        <w:r>
+          <w:rPr>
+            <w:rStyle w:val="Hyperlink"/>
+          </w:rPr>
+          <w:t xml:space="preserve">J. A. Kaduk, K. Zhong, A. M. Gindhart and T. N. Blanton,</w:t>
+        </w:r>
+        <w:r>
+          <w:rPr>
+            <w:rStyle w:val="Hyperlink"/>
+          </w:rPr>
+          <w:t xml:space="preserve"> </w:t>
+        </w:r>
+        <w:r>
+          <w:rPr>
+            <w:rStyle w:val="Hyperlink"/>
+            <w:i/>
+            <w:iCs/>
+          </w:rPr>
+          <w:t xml:space="preserve">Powder Diffr.</w:t>
+        </w:r>
+        <w:r>
+          <w:rPr>
+            <w:rStyle w:val="Hyperlink"/>
+          </w:rPr>
+          <w:t xml:space="preserve">, 2015,</w:t>
+        </w:r>
+        <w:r>
+          <w:rPr>
+            <w:rStyle w:val="Hyperlink"/>
+          </w:rPr>
+          <w:t xml:space="preserve"> </w:t>
+        </w:r>
+        <w:r>
+          <w:rPr>
+            <w:rStyle w:val="Hyperlink"/>
+            <w:b/>
+            <w:bCs/>
+          </w:rPr>
+          <w:t xml:space="preserve">30</w:t>
+        </w:r>
+        <w:r>
+          <w:rPr>
+            <w:rStyle w:val="Hyperlink"/>
+          </w:rPr>
+          <w:t xml:space="preserve">, 242–249</w:t>
+        </w:r>
+      </w:hyperlink>
+      <w:r>
+        <w:t xml:space="preserve">.</w:t>
+      </w:r>
+    </w:p>
+    <w:bookmarkEnd w:id="131"/>
+    <w:bookmarkStart w:id="133" w:name="ref-kaduk2015folic"/>
+    <w:p>
+      <w:pPr>
+        <w:pStyle w:val="Bibliography"/>
+      </w:pPr>
+      <w:r>
+        <w:t xml:space="preserve">43</w:t>
+      </w:r>
+      <w:r>
+        <w:t xml:space="preserve"> </w:t>
+      </w:r>
+      <w:r>
+        <w:t xml:space="preserve">	</w:t>
+      </w:r>
+      <w:hyperlink r:id="rId132">
+        <w:r>
+          <w:rPr>
+            <w:rStyle w:val="Hyperlink"/>
+          </w:rPr>
+          <w:t xml:space="preserve">J. A. Kaduk, C. E. Crowder and K. Zhong,</w:t>
+        </w:r>
+        <w:r>
+          <w:rPr>
+            <w:rStyle w:val="Hyperlink"/>
+          </w:rPr>
+          <w:t xml:space="preserve"> </w:t>
+        </w:r>
+        <w:r>
+          <w:rPr>
+            <w:rStyle w:val="Hyperlink"/>
+            <w:i/>
+            <w:iCs/>
+          </w:rPr>
+          <w:t xml:space="preserve">Powder Diffr.</w:t>
+        </w:r>
+        <w:r>
+          <w:rPr>
+            <w:rStyle w:val="Hyperlink"/>
+          </w:rPr>
+          <w:t xml:space="preserve">, 2015,</w:t>
+        </w:r>
+        <w:r>
+          <w:rPr>
+            <w:rStyle w:val="Hyperlink"/>
+          </w:rPr>
+          <w:t xml:space="preserve"> </w:t>
+        </w:r>
+        <w:r>
+          <w:rPr>
+            <w:rStyle w:val="Hyperlink"/>
+            <w:b/>
+            <w:bCs/>
+          </w:rPr>
+          <w:t xml:space="preserve">30</w:t>
+        </w:r>
+        <w:r>
+          <w:rPr>
+            <w:rStyle w:val="Hyperlink"/>
+          </w:rPr>
+          <w:t xml:space="preserve">, 52–56</w:t>
+        </w:r>
+      </w:hyperlink>
+      <w:r>
+        <w:t xml:space="preserve">.</w:t>
+      </w:r>
+    </w:p>
+    <w:bookmarkEnd w:id="133"/>
+    <w:bookmarkStart w:id="135" w:name="ref-kaduk2015fingolimod"/>
+    <w:p>
+      <w:pPr>
+        <w:pStyle w:val="Bibliography"/>
+      </w:pPr>
+      <w:r>
+        <w:t xml:space="preserve">44</w:t>
+      </w:r>
+      <w:r>
+        <w:t xml:space="preserve"> </w:t>
+      </w:r>
+      <w:r>
+        <w:t xml:space="preserve">	</w:t>
+      </w:r>
+      <w:hyperlink r:id="rId134">
+        <w:r>
+          <w:rPr>
+            <w:rStyle w:val="Hyperlink"/>
+          </w:rPr>
+          <w:t xml:space="preserve">J. A. Kaduk, K. Zhong, A. M. Gindhart and T. N. Blanton,</w:t>
+        </w:r>
+        <w:r>
+          <w:rPr>
+            <w:rStyle w:val="Hyperlink"/>
+          </w:rPr>
+          <w:t xml:space="preserve"> </w:t>
+        </w:r>
+        <w:r>
+          <w:rPr>
+            <w:rStyle w:val="Hyperlink"/>
+            <w:i/>
+            <w:iCs/>
+          </w:rPr>
+          <w:t xml:space="preserve">Powder Diffr.</w:t>
+        </w:r>
+        <w:r>
+          <w:rPr>
+            <w:rStyle w:val="Hyperlink"/>
+          </w:rPr>
+          <w:t xml:space="preserve">, 2015,</w:t>
+        </w:r>
+        <w:r>
+          <w:rPr>
+            <w:rStyle w:val="Hyperlink"/>
+          </w:rPr>
+          <w:t xml:space="preserve"> </w:t>
+        </w:r>
+        <w:r>
+          <w:rPr>
+            <w:rStyle w:val="Hyperlink"/>
+            <w:b/>
+            <w:bCs/>
+          </w:rPr>
+          <w:t xml:space="preserve">30</w:t>
+        </w:r>
+        <w:r>
+          <w:rPr>
+            <w:rStyle w:val="Hyperlink"/>
+          </w:rPr>
+          <w:t xml:space="preserve">, 205–210</w:t>
+        </w:r>
+      </w:hyperlink>
+      <w:r>
+        <w:t xml:space="preserve">.</w:t>
+      </w:r>
+    </w:p>
+    <w:bookmarkEnd w:id="135"/>
+    <w:bookmarkStart w:id="137" w:name="ref-kaduk2015levalbuterol"/>
+    <w:p>
+      <w:pPr>
+        <w:pStyle w:val="Bibliography"/>
+      </w:pPr>
+      <w:r>
+        <w:t xml:space="preserve">45</w:t>
+      </w:r>
+      <w:r>
+        <w:t xml:space="preserve"> </w:t>
+      </w:r>
+      <w:r>
+        <w:t xml:space="preserve">	</w:t>
+      </w:r>
+      <w:hyperlink r:id="rId136">
+        <w:r>
+          <w:rPr>
+            <w:rStyle w:val="Hyperlink"/>
+          </w:rPr>
+          <w:t xml:space="preserve">J. A. Kaduk, K. Zhong, T. N. Blanton and S. Gates,</w:t>
+        </w:r>
+        <w:r>
+          <w:rPr>
+            <w:rStyle w:val="Hyperlink"/>
+          </w:rPr>
+          <w:t xml:space="preserve"> </w:t>
+        </w:r>
+        <w:r>
+          <w:rPr>
+            <w:rStyle w:val="Hyperlink"/>
+            <w:i/>
+            <w:iCs/>
+          </w:rPr>
+          <w:t xml:space="preserve">Powder Diffr.</w:t>
+        </w:r>
+        <w:r>
+          <w:rPr>
+            <w:rStyle w:val="Hyperlink"/>
+          </w:rPr>
+          <w:t xml:space="preserve">, 2015,</w:t>
+        </w:r>
+        <w:r>
+          <w:rPr>
+            <w:rStyle w:val="Hyperlink"/>
+          </w:rPr>
+          <w:t xml:space="preserve"> </w:t>
+        </w:r>
+        <w:r>
+          <w:rPr>
+            <w:rStyle w:val="Hyperlink"/>
+            <w:b/>
+            <w:bCs/>
+          </w:rPr>
+          <w:t xml:space="preserve">30</w:t>
+        </w:r>
+        <w:r>
+          <w:rPr>
+            <w:rStyle w:val="Hyperlink"/>
+          </w:rPr>
+          <w:t xml:space="preserve">, 158–162</w:t>
+        </w:r>
+      </w:hyperlink>
+      <w:r>
+        <w:t xml:space="preserve">.</w:t>
+      </w:r>
+    </w:p>
+    <w:bookmarkEnd w:id="137"/>
+    <w:bookmarkStart w:id="139" w:name="ref-kaduk2015ziprasidone"/>
+    <w:p>
+      <w:pPr>
+        <w:pStyle w:val="Bibliography"/>
+      </w:pPr>
+      <w:r>
+        <w:t xml:space="preserve">46</w:t>
+      </w:r>
+      <w:r>
+        <w:t xml:space="preserve"> </w:t>
+      </w:r>
+      <w:r>
+        <w:t xml:space="preserve">	</w:t>
+      </w:r>
+      <w:hyperlink r:id="rId138">
+        <w:r>
+          <w:rPr>
+            <w:rStyle w:val="Hyperlink"/>
+          </w:rPr>
+          <w:t xml:space="preserve">J. A. Kaduk, K. Zhong, A. M. Gindhart and T. N. Blanton,</w:t>
+        </w:r>
+        <w:r>
+          <w:rPr>
+            <w:rStyle w:val="Hyperlink"/>
+          </w:rPr>
+          <w:t xml:space="preserve"> </w:t>
+        </w:r>
+        <w:r>
+          <w:rPr>
+            <w:rStyle w:val="Hyperlink"/>
+            <w:i/>
+            <w:iCs/>
+          </w:rPr>
+          <w:t xml:space="preserve">Powder Diffr.</w:t>
+        </w:r>
+        <w:r>
+          <w:rPr>
+            <w:rStyle w:val="Hyperlink"/>
+          </w:rPr>
+          <w:t xml:space="preserve">, 2015,</w:t>
+        </w:r>
+        <w:r>
+          <w:rPr>
+            <w:rStyle w:val="Hyperlink"/>
+          </w:rPr>
+          <w:t xml:space="preserve"> </w:t>
+        </w:r>
+        <w:r>
+          <w:rPr>
+            <w:rStyle w:val="Hyperlink"/>
+            <w:b/>
+            <w:bCs/>
+          </w:rPr>
+          <w:t xml:space="preserve">30</w:t>
+        </w:r>
+        <w:r>
+          <w:rPr>
+            <w:rStyle w:val="Hyperlink"/>
+          </w:rPr>
+          <w:t xml:space="preserve">, 192–198</w:t>
+        </w:r>
+      </w:hyperlink>
+      <w:r>
+        <w:t xml:space="preserve">.</w:t>
+      </w:r>
+    </w:p>
+    <w:bookmarkEnd w:id="139"/>
+    <w:bookmarkStart w:id="141" w:name="ref-kaduk2015rilpivirine"/>
+    <w:p>
+      <w:pPr>
+        <w:pStyle w:val="Bibliography"/>
+      </w:pPr>
+      <w:r>
+        <w:t xml:space="preserve">47</w:t>
+      </w:r>
+      <w:r>
+        <w:t xml:space="preserve"> </w:t>
+      </w:r>
+      <w:r>
+        <w:t xml:space="preserve">	</w:t>
+      </w:r>
+      <w:hyperlink r:id="rId140">
+        <w:r>
+          <w:rPr>
+            <w:rStyle w:val="Hyperlink"/>
+          </w:rPr>
+          <w:t xml:space="preserve">J. A. Kaduk, K. Zhong and T. N. Blanton,</w:t>
+        </w:r>
+        <w:r>
+          <w:rPr>
+            <w:rStyle w:val="Hyperlink"/>
+          </w:rPr>
+          <w:t xml:space="preserve"> </w:t>
+        </w:r>
+        <w:r>
+          <w:rPr>
+            <w:rStyle w:val="Hyperlink"/>
+            <w:i/>
+            <w:iCs/>
+          </w:rPr>
+          <w:t xml:space="preserve">Powder Diffr.</w:t>
+        </w:r>
+        <w:r>
+          <w:rPr>
+            <w:rStyle w:val="Hyperlink"/>
+          </w:rPr>
+          <w:t xml:space="preserve">, 2015,</w:t>
+        </w:r>
+        <w:r>
+          <w:rPr>
+            <w:rStyle w:val="Hyperlink"/>
+          </w:rPr>
+          <w:t xml:space="preserve"> </w:t>
+        </w:r>
+        <w:r>
+          <w:rPr>
+            <w:rStyle w:val="Hyperlink"/>
+            <w:b/>
+            <w:bCs/>
+          </w:rPr>
+          <w:t xml:space="preserve">30</w:t>
+        </w:r>
+        <w:r>
+          <w:rPr>
+            <w:rStyle w:val="Hyperlink"/>
+          </w:rPr>
+          <w:t xml:space="preserve">, 170–174</w:t>
+        </w:r>
+      </w:hyperlink>
+      <w:r>
+        <w:t xml:space="preserve">.</w:t>
+      </w:r>
+    </w:p>
+    <w:bookmarkEnd w:id="141"/>
+    <w:bookmarkStart w:id="143" w:name="ref-kaduk2015solifenacin"/>
+    <w:p>
+      <w:pPr>
+        <w:pStyle w:val="Bibliography"/>
+      </w:pPr>
+      <w:r>
+        <w:t xml:space="preserve">48</w:t>
+      </w:r>
+      <w:r>
+        <w:t xml:space="preserve"> </w:t>
+      </w:r>
+      <w:r>
+        <w:t xml:space="preserve">	</w:t>
+      </w:r>
+      <w:hyperlink r:id="rId142">
+        <w:r>
+          <w:rPr>
+            <w:rStyle w:val="Hyperlink"/>
+          </w:rPr>
+          <w:t xml:space="preserve">J. A. Kaduk, J. W. Reid, K. Zhong, A. M. Gindhart and T. N. Blanton,</w:t>
+        </w:r>
+        <w:r>
+          <w:rPr>
+            <w:rStyle w:val="Hyperlink"/>
+          </w:rPr>
+          <w:t xml:space="preserve"> </w:t>
+        </w:r>
+        <w:r>
+          <w:rPr>
+            <w:rStyle w:val="Hyperlink"/>
+            <w:i/>
+            <w:iCs/>
+          </w:rPr>
+          <w:t xml:space="preserve">Powder Diffr.</w:t>
+        </w:r>
+        <w:r>
+          <w:rPr>
+            <w:rStyle w:val="Hyperlink"/>
+          </w:rPr>
+          <w:t xml:space="preserve">, 2015,</w:t>
+        </w:r>
+        <w:r>
+          <w:rPr>
+            <w:rStyle w:val="Hyperlink"/>
+          </w:rPr>
+          <w:t xml:space="preserve"> </w:t>
+        </w:r>
+        <w:r>
+          <w:rPr>
+            <w:rStyle w:val="Hyperlink"/>
+            <w:b/>
+            <w:bCs/>
+          </w:rPr>
+          <w:t xml:space="preserve">30</w:t>
+        </w:r>
+        <w:r>
+          <w:rPr>
+            <w:rStyle w:val="Hyperlink"/>
+          </w:rPr>
+          <w:t xml:space="preserve">, 211–217</w:t>
+        </w:r>
+      </w:hyperlink>
+      <w:r>
+        <w:t xml:space="preserve">.</w:t>
+      </w:r>
+    </w:p>
+    <w:bookmarkEnd w:id="143"/>
+    <w:bookmarkStart w:id="145" w:name="ref-kaduk2015lacosamide"/>
+    <w:p>
+      <w:pPr>
+        <w:pStyle w:val="Bibliography"/>
+      </w:pPr>
+      <w:r>
+        <w:t xml:space="preserve">49</w:t>
+      </w:r>
+      <w:r>
+        <w:t xml:space="preserve"> </w:t>
+      </w:r>
+      <w:r>
+        <w:t xml:space="preserve">	</w:t>
+      </w:r>
+      <w:hyperlink r:id="rId144">
+        <w:r>
+          <w:rPr>
+            <w:rStyle w:val="Hyperlink"/>
+          </w:rPr>
+          <w:t xml:space="preserve">J. A. Kaduk, K. Zhong, A. M. Gindhart and T. N. Blanton,</w:t>
+        </w:r>
+        <w:r>
+          <w:rPr>
+            <w:rStyle w:val="Hyperlink"/>
+          </w:rPr>
+          <w:t xml:space="preserve"> </w:t>
+        </w:r>
+        <w:r>
+          <w:rPr>
+            <w:rStyle w:val="Hyperlink"/>
+            <w:i/>
+            <w:iCs/>
+          </w:rPr>
+          <w:t xml:space="preserve">Powder Diffr.</w:t>
+        </w:r>
+        <w:r>
+          <w:rPr>
+            <w:rStyle w:val="Hyperlink"/>
+          </w:rPr>
+          <w:t xml:space="preserve">, 2015,</w:t>
+        </w:r>
+        <w:r>
+          <w:rPr>
+            <w:rStyle w:val="Hyperlink"/>
+          </w:rPr>
+          <w:t xml:space="preserve"> </w:t>
+        </w:r>
+        <w:r>
+          <w:rPr>
+            <w:rStyle w:val="Hyperlink"/>
+            <w:b/>
+            <w:bCs/>
+          </w:rPr>
+          <w:t xml:space="preserve">30</w:t>
+        </w:r>
+        <w:r>
+          <w:rPr>
+            <w:rStyle w:val="Hyperlink"/>
+          </w:rPr>
+          <w:t xml:space="preserve">, 224–230</w:t>
+        </w:r>
+      </w:hyperlink>
+      <w:r>
+        <w:t xml:space="preserve">.</w:t>
+      </w:r>
+    </w:p>
+    <w:bookmarkEnd w:id="145"/>
+    <w:bookmarkStart w:id="147" w:name="ref-kaduk2015nilotinib"/>
+    <w:p>
+      <w:pPr>
+        <w:pStyle w:val="Bibliography"/>
+      </w:pPr>
+      <w:r>
+        <w:t xml:space="preserve">50</w:t>
+      </w:r>
+      <w:r>
+        <w:t xml:space="preserve"> </w:t>
+      </w:r>
+      <w:r>
+        <w:t xml:space="preserve">	</w:t>
+      </w:r>
+      <w:hyperlink r:id="rId146">
+        <w:r>
+          <w:rPr>
+            <w:rStyle w:val="Hyperlink"/>
+          </w:rPr>
+          <w:t xml:space="preserve">J. A. Kaduk, K. Zhong, A. M. Gindhart and T. N. Blanton,</w:t>
+        </w:r>
+        <w:r>
+          <w:rPr>
+            <w:rStyle w:val="Hyperlink"/>
+          </w:rPr>
+          <w:t xml:space="preserve"> </w:t>
+        </w:r>
+        <w:r>
+          <w:rPr>
+            <w:rStyle w:val="Hyperlink"/>
+            <w:i/>
+            <w:iCs/>
+          </w:rPr>
+          <w:t xml:space="preserve">Powder Diffr.</w:t>
+        </w:r>
+        <w:r>
+          <w:rPr>
+            <w:rStyle w:val="Hyperlink"/>
+          </w:rPr>
+          <w:t xml:space="preserve">, 2015,</w:t>
+        </w:r>
+        <w:r>
+          <w:rPr>
+            <w:rStyle w:val="Hyperlink"/>
+          </w:rPr>
+          <w:t xml:space="preserve"> </w:t>
+        </w:r>
+        <w:r>
+          <w:rPr>
+            <w:rStyle w:val="Hyperlink"/>
+            <w:b/>
+            <w:bCs/>
+          </w:rPr>
+          <w:t xml:space="preserve">30</w:t>
+        </w:r>
+        <w:r>
+          <w:rPr>
+            <w:rStyle w:val="Hyperlink"/>
+          </w:rPr>
+          <w:t xml:space="preserve">, 270–277</w:t>
+        </w:r>
+      </w:hyperlink>
+      <w:r>
+        <w:t xml:space="preserve">.</w:t>
+      </w:r>
+    </w:p>
+    <w:bookmarkEnd w:id="147"/>
+    <w:bookmarkStart w:id="149" w:name="ref-kaduk2015sitagliptin"/>
+    <w:p>
+      <w:pPr>
+        <w:pStyle w:val="Bibliography"/>
+      </w:pPr>
+      <w:r>
+        <w:t xml:space="preserve">51</w:t>
+      </w:r>
+      <w:r>
+        <w:t xml:space="preserve"> </w:t>
+      </w:r>
+      <w:r>
+        <w:t xml:space="preserve">	</w:t>
+      </w:r>
+      <w:hyperlink r:id="rId148">
+        <w:r>
+          <w:rPr>
+            <w:rStyle w:val="Hyperlink"/>
+          </w:rPr>
+          <w:t xml:space="preserve">J. A. Kaduk, K. Zhong, A. M. Gindhart and T. N. Blanton,</w:t>
+        </w:r>
+        <w:r>
+          <w:rPr>
+            <w:rStyle w:val="Hyperlink"/>
+          </w:rPr>
+          <w:t xml:space="preserve"> </w:t>
+        </w:r>
+        <w:r>
+          <w:rPr>
+            <w:rStyle w:val="Hyperlink"/>
+            <w:i/>
+            <w:iCs/>
+          </w:rPr>
+          <w:t xml:space="preserve">Powder Diffr.</w:t>
+        </w:r>
+        <w:r>
+          <w:rPr>
+            <w:rStyle w:val="Hyperlink"/>
+          </w:rPr>
+          <w:t xml:space="preserve">, 2015,</w:t>
+        </w:r>
+        <w:r>
+          <w:rPr>
+            <w:rStyle w:val="Hyperlink"/>
+          </w:rPr>
+          <w:t xml:space="preserve"> </w:t>
+        </w:r>
+        <w:r>
+          <w:rPr>
+            <w:rStyle w:val="Hyperlink"/>
+            <w:b/>
+            <w:bCs/>
+          </w:rPr>
+          <w:t xml:space="preserve">30</w:t>
+        </w:r>
+        <w:r>
+          <w:rPr>
+            <w:rStyle w:val="Hyperlink"/>
+          </w:rPr>
+          <w:t xml:space="preserve">, 349–356</w:t>
+        </w:r>
+      </w:hyperlink>
+      <w:r>
+        <w:t xml:space="preserve">.</w:t>
+      </w:r>
+    </w:p>
+    <w:bookmarkEnd w:id="149"/>
+    <w:bookmarkStart w:id="151" w:name="ref-kaduk2016paliperidone"/>
+    <w:p>
+      <w:pPr>
+        <w:pStyle w:val="Bibliography"/>
+      </w:pPr>
+      <w:r>
+        <w:t xml:space="preserve">52</w:t>
+      </w:r>
+      <w:r>
+        <w:t xml:space="preserve"> </w:t>
+      </w:r>
+      <w:r>
+        <w:t xml:space="preserve">	</w:t>
+      </w:r>
+      <w:hyperlink r:id="rId150">
+        <w:r>
+          <w:rPr>
+            <w:rStyle w:val="Hyperlink"/>
+          </w:rPr>
+          <w:t xml:space="preserve">J. A. Kaduk, K. Zhong, A. M. Gindhart and T. N. Blanton,</w:t>
+        </w:r>
+        <w:r>
+          <w:rPr>
+            <w:rStyle w:val="Hyperlink"/>
+          </w:rPr>
+          <w:t xml:space="preserve"> </w:t>
+        </w:r>
+        <w:r>
+          <w:rPr>
+            <w:rStyle w:val="Hyperlink"/>
+            <w:i/>
+            <w:iCs/>
+          </w:rPr>
+          <w:t xml:space="preserve">Powder Diffr.</w:t>
+        </w:r>
+        <w:r>
+          <w:rPr>
+            <w:rStyle w:val="Hyperlink"/>
+          </w:rPr>
+          <w:t xml:space="preserve">, 2016,</w:t>
+        </w:r>
+        <w:r>
+          <w:rPr>
+            <w:rStyle w:val="Hyperlink"/>
+          </w:rPr>
+          <w:t xml:space="preserve"> </w:t>
+        </w:r>
+        <w:r>
+          <w:rPr>
+            <w:rStyle w:val="Hyperlink"/>
+            <w:b/>
+            <w:bCs/>
+          </w:rPr>
+          <w:t xml:space="preserve">31</w:t>
+        </w:r>
+        <w:r>
+          <w:rPr>
+            <w:rStyle w:val="Hyperlink"/>
+          </w:rPr>
+          <w:t xml:space="preserve">, 135–141</w:t>
+        </w:r>
+      </w:hyperlink>
+      <w:r>
+        <w:t xml:space="preserve">.</w:t>
+      </w:r>
+    </w:p>
+    <w:bookmarkEnd w:id="151"/>
+    <w:bookmarkStart w:id="153" w:name="ref-kaduk2017palmitate"/>
+    <w:p>
+      <w:pPr>
+        <w:pStyle w:val="Bibliography"/>
+      </w:pPr>
+      <w:r>
+        <w:t xml:space="preserve">53</w:t>
+      </w:r>
+      <w:r>
+        <w:t xml:space="preserve"> </w:t>
+      </w:r>
+      <w:r>
+        <w:t xml:space="preserve">	</w:t>
+      </w:r>
+      <w:hyperlink r:id="rId152">
+        <w:r>
+          <w:rPr>
+            <w:rStyle w:val="Hyperlink"/>
+          </w:rPr>
+          <w:t xml:space="preserve">J. A. Kaduk, A. O. Dmitrienko, A. M. Gindhart and T. N. Blanton,</w:t>
+        </w:r>
+        <w:r>
+          <w:rPr>
+            <w:rStyle w:val="Hyperlink"/>
+          </w:rPr>
+          <w:t xml:space="preserve"> </w:t>
+        </w:r>
+        <w:r>
+          <w:rPr>
+            <w:rStyle w:val="Hyperlink"/>
+            <w:i/>
+            <w:iCs/>
+          </w:rPr>
+          <w:t xml:space="preserve">Powder Diffr.</w:t>
+        </w:r>
+        <w:r>
+          <w:rPr>
+            <w:rStyle w:val="Hyperlink"/>
+          </w:rPr>
+          <w:t xml:space="preserve">, 2017,</w:t>
+        </w:r>
+        <w:r>
+          <w:rPr>
+            <w:rStyle w:val="Hyperlink"/>
+          </w:rPr>
+          <w:t xml:space="preserve"> </w:t>
+        </w:r>
+        <w:r>
+          <w:rPr>
+            <w:rStyle w:val="Hyperlink"/>
+            <w:b/>
+            <w:bCs/>
+          </w:rPr>
+          <w:t xml:space="preserve">32</w:t>
+        </w:r>
+        <w:r>
+          <w:rPr>
+            <w:rStyle w:val="Hyperlink"/>
+          </w:rPr>
+          <w:t xml:space="preserve">, 222–227</w:t>
+        </w:r>
+      </w:hyperlink>
+      <w:r>
+        <w:t xml:space="preserve">.</w:t>
+      </w:r>
+    </w:p>
+    <w:bookmarkEnd w:id="153"/>
+    <w:bookmarkStart w:id="155" w:name="ref-kaduk2017hydrocortisone"/>
+    <w:p>
+      <w:pPr>
+        <w:pStyle w:val="Bibliography"/>
+      </w:pPr>
+      <w:r>
+        <w:t xml:space="preserve">54</w:t>
+      </w:r>
+      <w:r>
+        <w:t xml:space="preserve"> </w:t>
+      </w:r>
+      <w:r>
+        <w:t xml:space="preserve">	</w:t>
+      </w:r>
+      <w:hyperlink r:id="rId154">
+        <w:r>
+          <w:rPr>
+            <w:rStyle w:val="Hyperlink"/>
+          </w:rPr>
+          <w:t xml:space="preserve">J. A. Kaduk, A. M. Gindhart and T. N. Blanton,</w:t>
+        </w:r>
+        <w:r>
+          <w:rPr>
+            <w:rStyle w:val="Hyperlink"/>
+          </w:rPr>
+          <w:t xml:space="preserve"> </w:t>
+        </w:r>
+        <w:r>
+          <w:rPr>
+            <w:rStyle w:val="Hyperlink"/>
+            <w:i/>
+            <w:iCs/>
+          </w:rPr>
+          <w:t xml:space="preserve">Powder Diffr.</w:t>
+        </w:r>
+        <w:r>
+          <w:rPr>
+            <w:rStyle w:val="Hyperlink"/>
+          </w:rPr>
+          <w:t xml:space="preserve">, 2017,</w:t>
+        </w:r>
+        <w:r>
+          <w:rPr>
+            <w:rStyle w:val="Hyperlink"/>
+          </w:rPr>
+          <w:t xml:space="preserve"> </w:t>
+        </w:r>
+        <w:r>
+          <w:rPr>
+            <w:rStyle w:val="Hyperlink"/>
+            <w:b/>
+            <w:bCs/>
+          </w:rPr>
+          <w:t xml:space="preserve">32</w:t>
+        </w:r>
+        <w:r>
+          <w:rPr>
+            <w:rStyle w:val="Hyperlink"/>
+          </w:rPr>
+          <w:t xml:space="preserve">, 31–34</w:t>
+        </w:r>
+      </w:hyperlink>
+      <w:r>
+        <w:t xml:space="preserve">.</w:t>
+      </w:r>
+    </w:p>
+    <w:bookmarkEnd w:id="155"/>
+    <w:bookmarkStart w:id="157" w:name="ref-wheatley2018estradiol"/>
+    <w:p>
+      <w:pPr>
+        <w:pStyle w:val="Bibliography"/>
+      </w:pPr>
+      <w:r>
+        <w:t xml:space="preserve">55</w:t>
+      </w:r>
+      <w:r>
+        <w:t xml:space="preserve"> </w:t>
+      </w:r>
+      <w:r>
+        <w:t xml:space="preserve">	</w:t>
+      </w:r>
+      <w:hyperlink r:id="rId156">
+        <w:r>
+          <w:rPr>
+            <w:rStyle w:val="Hyperlink"/>
+          </w:rPr>
+          <w:t xml:space="preserve">A. M. Wheatley, J. A. Kaduk, A. M. Gindhart and T. N. Blanton,</w:t>
+        </w:r>
+        <w:r>
+          <w:rPr>
+            <w:rStyle w:val="Hyperlink"/>
+          </w:rPr>
+          <w:t xml:space="preserve"> </w:t>
+        </w:r>
+        <w:r>
+          <w:rPr>
+            <w:rStyle w:val="Hyperlink"/>
+            <w:i/>
+            <w:iCs/>
+          </w:rPr>
+          <w:t xml:space="preserve">Powder Diffr.</w:t>
+        </w:r>
+        <w:r>
+          <w:rPr>
+            <w:rStyle w:val="Hyperlink"/>
+          </w:rPr>
+          <w:t xml:space="preserve">, 2018,</w:t>
+        </w:r>
+        <w:r>
+          <w:rPr>
+            <w:rStyle w:val="Hyperlink"/>
+          </w:rPr>
+          <w:t xml:space="preserve"> </w:t>
+        </w:r>
+        <w:r>
+          <w:rPr>
+            <w:rStyle w:val="Hyperlink"/>
+            <w:b/>
+            <w:bCs/>
+          </w:rPr>
+          <w:t xml:space="preserve">33</w:t>
+        </w:r>
+        <w:r>
+          <w:rPr>
+            <w:rStyle w:val="Hyperlink"/>
+          </w:rPr>
+          <w:t xml:space="preserve">, 70–71</w:t>
+        </w:r>
+      </w:hyperlink>
+      <w:r>
+        <w:t xml:space="preserve">.</w:t>
+      </w:r>
+    </w:p>
+    <w:bookmarkEnd w:id="157"/>
+    <w:bookmarkStart w:id="159" w:name="ref-reid2015curcumin"/>
+    <w:p>
+      <w:pPr>
+        <w:pStyle w:val="Bibliography"/>
+      </w:pPr>
+      <w:r>
+        <w:t xml:space="preserve">56</w:t>
+      </w:r>
+      <w:r>
+        <w:t xml:space="preserve"> </w:t>
+      </w:r>
+      <w:r>
+        <w:t xml:space="preserve">	</w:t>
+      </w:r>
+      <w:hyperlink r:id="rId158">
+        <w:r>
+          <w:rPr>
+            <w:rStyle w:val="Hyperlink"/>
+          </w:rPr>
+          <w:t xml:space="preserve">J. W. Reid, J. A. Kaduk, S. V. Garimella and J. S. Tse,</w:t>
+        </w:r>
+        <w:r>
+          <w:rPr>
+            <w:rStyle w:val="Hyperlink"/>
+          </w:rPr>
+          <w:t xml:space="preserve"> </w:t>
+        </w:r>
+        <w:r>
+          <w:rPr>
+            <w:rStyle w:val="Hyperlink"/>
+            <w:i/>
+            <w:iCs/>
+          </w:rPr>
+          <w:t xml:space="preserve">Powder Diffr.</w:t>
+        </w:r>
+        <w:r>
+          <w:rPr>
+            <w:rStyle w:val="Hyperlink"/>
+          </w:rPr>
+          <w:t xml:space="preserve">, 2015,</w:t>
+        </w:r>
+        <w:r>
+          <w:rPr>
+            <w:rStyle w:val="Hyperlink"/>
+          </w:rPr>
+          <w:t xml:space="preserve"> </w:t>
+        </w:r>
+        <w:r>
+          <w:rPr>
+            <w:rStyle w:val="Hyperlink"/>
+            <w:b/>
+            <w:bCs/>
+          </w:rPr>
+          <w:t xml:space="preserve">30</w:t>
+        </w:r>
+        <w:r>
+          <w:rPr>
+            <w:rStyle w:val="Hyperlink"/>
+          </w:rPr>
+          <w:t xml:space="preserve">, 67–75</w:t>
+        </w:r>
+      </w:hyperlink>
+      <w:r>
+        <w:t xml:space="preserve">.</w:t>
+      </w:r>
+    </w:p>
+    <w:bookmarkEnd w:id="159"/>
+    <w:bookmarkStart w:id="161" w:name="ref-kaduk2015saxagliptin"/>
+    <w:p>
+      <w:pPr>
+        <w:pStyle w:val="Bibliography"/>
+      </w:pPr>
+      <w:r>
+        <w:t xml:space="preserve">57</w:t>
+      </w:r>
+      <w:r>
+        <w:t xml:space="preserve"> </w:t>
+      </w:r>
+      <w:r>
+        <w:t xml:space="preserve">	</w:t>
+      </w:r>
+      <w:hyperlink r:id="rId160">
+        <w:r>
+          <w:rPr>
+            <w:rStyle w:val="Hyperlink"/>
+          </w:rPr>
+          <w:t xml:space="preserve">J. A. Kaduk, K. Zhong, T. N. Blanton, A. M. Gindhart and T. G. Fawcett,</w:t>
+        </w:r>
+        <w:r>
+          <w:rPr>
+            <w:rStyle w:val="Hyperlink"/>
+          </w:rPr>
+          <w:t xml:space="preserve"> </w:t>
+        </w:r>
+        <w:r>
+          <w:rPr>
+            <w:rStyle w:val="Hyperlink"/>
+            <w:i/>
+            <w:iCs/>
+          </w:rPr>
+          <w:t xml:space="preserve">Powder Diffr.</w:t>
+        </w:r>
+        <w:r>
+          <w:rPr>
+            <w:rStyle w:val="Hyperlink"/>
+          </w:rPr>
+          <w:t xml:space="preserve">, 2015,</w:t>
+        </w:r>
+        <w:r>
+          <w:rPr>
+            <w:rStyle w:val="Hyperlink"/>
+          </w:rPr>
+          <w:t xml:space="preserve"> </w:t>
+        </w:r>
+        <w:r>
+          <w:rPr>
+            <w:rStyle w:val="Hyperlink"/>
+            <w:b/>
+            <w:bCs/>
+          </w:rPr>
+          <w:t xml:space="preserve">30</w:t>
+        </w:r>
+        <w:r>
+          <w:rPr>
+            <w:rStyle w:val="Hyperlink"/>
+          </w:rPr>
+          <w:t xml:space="preserve">, 296–297</w:t>
+        </w:r>
+      </w:hyperlink>
+      <w:r>
+        <w:t xml:space="preserve">.</w:t>
+      </w:r>
+    </w:p>
+    <w:bookmarkEnd w:id="161"/>
+    <w:bookmarkStart w:id="163" w:name="ref-reid2016trandolapril"/>
+    <w:p>
+      <w:pPr>
+        <w:pStyle w:val="Bibliography"/>
+      </w:pPr>
+      <w:r>
+        <w:t xml:space="preserve">58</w:t>
+      </w:r>
+      <w:r>
+        <w:t xml:space="preserve"> </w:t>
+      </w:r>
+      <w:r>
+        <w:t xml:space="preserve">	</w:t>
+      </w:r>
+      <w:hyperlink r:id="rId162">
+        <w:r>
+          <w:rPr>
+            <w:rStyle w:val="Hyperlink"/>
+          </w:rPr>
+          <w:t xml:space="preserve">J. W. Reid, J. A. Kaduk and M. Vickers,</w:t>
+        </w:r>
+        <w:r>
+          <w:rPr>
+            <w:rStyle w:val="Hyperlink"/>
+          </w:rPr>
+          <w:t xml:space="preserve"> </w:t>
+        </w:r>
+        <w:r>
+          <w:rPr>
+            <w:rStyle w:val="Hyperlink"/>
+            <w:i/>
+            <w:iCs/>
+          </w:rPr>
+          <w:t xml:space="preserve">Powder Diffr.</w:t>
+        </w:r>
+        <w:r>
+          <w:rPr>
+            <w:rStyle w:val="Hyperlink"/>
+          </w:rPr>
+          <w:t xml:space="preserve">, 2016,</w:t>
+        </w:r>
+        <w:r>
+          <w:rPr>
+            <w:rStyle w:val="Hyperlink"/>
+          </w:rPr>
+          <w:t xml:space="preserve"> </w:t>
+        </w:r>
+        <w:r>
+          <w:rPr>
+            <w:rStyle w:val="Hyperlink"/>
+            <w:b/>
+            <w:bCs/>
+          </w:rPr>
+          <w:t xml:space="preserve">31</w:t>
+        </w:r>
+        <w:r>
+          <w:rPr>
+            <w:rStyle w:val="Hyperlink"/>
+          </w:rPr>
+          <w:t xml:space="preserve">, 205–210</w:t>
+        </w:r>
+      </w:hyperlink>
+      <w:r>
+        <w:t xml:space="preserve">.</w:t>
+      </w:r>
+    </w:p>
+    <w:bookmarkEnd w:id="163"/>
+    <w:bookmarkStart w:id="165" w:name="ref-reid2021donepezil"/>
+    <w:p>
+      <w:pPr>
+        <w:pStyle w:val="Bibliography"/>
+      </w:pPr>
+      <w:r>
+        <w:t xml:space="preserve">59</w:t>
+      </w:r>
+      <w:r>
+        <w:t xml:space="preserve"> </w:t>
+      </w:r>
+      <w:r>
+        <w:t xml:space="preserve">	</w:t>
+      </w:r>
+      <w:hyperlink r:id="rId164">
+        <w:r>
+          <w:rPr>
+            <w:rStyle w:val="Hyperlink"/>
+          </w:rPr>
+          <w:t xml:space="preserve">J. W. Reid and J. A. Kaduk,</w:t>
+        </w:r>
+        <w:r>
+          <w:rPr>
+            <w:rStyle w:val="Hyperlink"/>
+          </w:rPr>
+          <w:t xml:space="preserve"> </w:t>
+        </w:r>
+        <w:r>
+          <w:rPr>
+            <w:rStyle w:val="Hyperlink"/>
+            <w:i/>
+            <w:iCs/>
+          </w:rPr>
+          <w:t xml:space="preserve">Powder Diffr.</w:t>
+        </w:r>
+        <w:r>
+          <w:rPr>
+            <w:rStyle w:val="Hyperlink"/>
+          </w:rPr>
+          <w:t xml:space="preserve">, 2021,</w:t>
+        </w:r>
+        <w:r>
+          <w:rPr>
+            <w:rStyle w:val="Hyperlink"/>
+          </w:rPr>
+          <w:t xml:space="preserve"> </w:t>
+        </w:r>
+        <w:r>
+          <w:rPr>
+            <w:rStyle w:val="Hyperlink"/>
+            <w:b/>
+            <w:bCs/>
+          </w:rPr>
+          <w:t xml:space="preserve">36</w:t>
+        </w:r>
+        <w:r>
+          <w:rPr>
+            <w:rStyle w:val="Hyperlink"/>
+          </w:rPr>
+          <w:t xml:space="preserve">, 233–240</w:t>
+        </w:r>
+      </w:hyperlink>
+      <w:r>
+        <w:t xml:space="preserve">.</w:t>
+      </w:r>
+    </w:p>
+    <w:bookmarkEnd w:id="165"/>
+    <w:bookmarkStart w:id="166" w:name="ref-glick2025csp"/>
+    <w:p>
+      <w:pPr>
+        <w:pStyle w:val="Bibliography"/>
+      </w:pPr>
+      <w:r>
+        <w:t xml:space="preserve">60</w:t>
       </w:r>
       <w:r>
         <w:t xml:space="preserve"> </w:t>
@@ -9436,9 +10750,9 @@
         <w:t xml:space="preserve">, 2025, arXiv:2507.16218.</w:t>
       </w:r>
     </w:p>
-    <w:bookmarkEnd w:id="130"/>
-    <w:bookmarkEnd w:id="131"/>
-    <w:bookmarkEnd w:id="132"/>
+    <w:bookmarkEnd w:id="166"/>
+    <w:bookmarkEnd w:id="167"/>
+    <w:bookmarkEnd w:id="168"/>
     <w:sectPr>
       <w:footnotePr>
         <w:numRestart w:val="eachSect"/>

</xml_diff>

<commit_message>
RSC Advances package: reserved Zenodo DOI 10.5281/zenodo.23446290 in the DAS; DAS states the sweep and effect ladder are deposited as summaries
</commit_message>
<xml_diff>
--- a/paper/dd/manuscript.docx
+++ b/paper/dd/manuscript.docx
@@ -7004,7 +7004,7 @@
         <w:t xml:space="preserve"> </w:t>
       </w:r>
       <w:r>
-        <w:t xml:space="preserve">(https://doi.org/[ZENODO DOI]). The deposit contains: the opXRD pattern identifiers with their CSD refcodes, same-form sets and</w:t>
+        <w:t xml:space="preserve">(https://doi.org/10.5281/zenodo.23446290). The deposit contains: the opXRD pattern identifiers with their CSD refcodes, same-form sets and</w:t>
       </w:r>
       <w:r>
         <w:t xml:space="preserve"> </w:t>
@@ -7016,7 +7016,19 @@
         <w:t xml:space="preserve"> </w:t>
       </w:r>
       <w:r>
-        <w:t xml:space="preserve">every score and correction, including the learned model’s and the variable-cell re-rank’s; the</w:t>
+        <w:t xml:space="preserve">every score and correction on the measured patterns, including the learned model’s and the variable-cell</w:t>
+      </w:r>
+      <w:r>
+        <w:t xml:space="preserve"> </w:t>
+      </w:r>
+      <w:r>
+        <w:t xml:space="preserve">re-rank’s (the simulated sweep of Section 4.1 and the effect ladder of Section 4.5 are deposited as summary</w:t>
+      </w:r>
+      <w:r>
+        <w:t xml:space="preserve"> </w:t>
+      </w:r>
+      <w:r>
+        <w:t xml:space="preserve">results); the</w:t>
       </w:r>
       <w:r>
         <w:t xml:space="preserve"> </w:t>

</xml_diff>